<commit_message>
Added data analysis for features column
</commit_message>
<xml_diff>
--- a/Disertation/Dissertation.docx
+++ b/Disertation/Dissertation.docx
@@ -78,7 +78,7 @@
       <w:r>
         <w:fldChar w:fldCharType="separate"/>
       </w:r>
-      <w:hyperlink w:anchor="_Toc201669644" w:history="1">
+      <w:hyperlink w:anchor="_Toc202808966" w:history="1">
         <w:r>
           <w:rPr>
             <w:rStyle w:val="Hyperlink"/>
@@ -105,7 +105,7 @@
             <w:noProof/>
             <w:webHidden/>
           </w:rPr>
-          <w:instrText xml:space="preserve"> PAGEREF _Toc201669644 \h </w:instrText>
+          <w:instrText xml:space="preserve"> PAGEREF _Toc202808966 \h </w:instrText>
         </w:r>
         <w:r>
           <w:rPr>
@@ -148,7 +148,7 @@
           <w:lang w:eastAsia="en-GB"/>
         </w:rPr>
       </w:pPr>
-      <w:hyperlink w:anchor="_Toc201669645" w:history="1">
+      <w:hyperlink w:anchor="_Toc202808967" w:history="1">
         <w:r>
           <w:rPr>
             <w:rStyle w:val="Hyperlink"/>
@@ -175,7 +175,7 @@
             <w:noProof/>
             <w:webHidden/>
           </w:rPr>
-          <w:instrText xml:space="preserve"> PAGEREF _Toc201669645 \h </w:instrText>
+          <w:instrText xml:space="preserve"> PAGEREF _Toc202808967 \h </w:instrText>
         </w:r>
         <w:r>
           <w:rPr>
@@ -218,7 +218,7 @@
           <w:lang w:eastAsia="en-GB"/>
         </w:rPr>
       </w:pPr>
-      <w:hyperlink w:anchor="_Toc201669646" w:history="1">
+      <w:hyperlink w:anchor="_Toc202808968" w:history="1">
         <w:r>
           <w:rPr>
             <w:rStyle w:val="Hyperlink"/>
@@ -245,7 +245,7 @@
             <w:noProof/>
             <w:webHidden/>
           </w:rPr>
-          <w:instrText xml:space="preserve"> PAGEREF _Toc201669646 \h </w:instrText>
+          <w:instrText xml:space="preserve"> PAGEREF _Toc202808968 \h </w:instrText>
         </w:r>
         <w:r>
           <w:rPr>
@@ -288,7 +288,7 @@
           <w:lang w:eastAsia="en-GB"/>
         </w:rPr>
       </w:pPr>
-      <w:hyperlink w:anchor="_Toc201669647" w:history="1">
+      <w:hyperlink w:anchor="_Toc202808969" w:history="1">
         <w:r>
           <w:rPr>
             <w:rStyle w:val="Hyperlink"/>
@@ -315,7 +315,7 @@
             <w:noProof/>
             <w:webHidden/>
           </w:rPr>
-          <w:instrText xml:space="preserve"> PAGEREF _Toc201669647 \h </w:instrText>
+          <w:instrText xml:space="preserve"> PAGEREF _Toc202808969 \h </w:instrText>
         </w:r>
         <w:r>
           <w:rPr>
@@ -358,7 +358,7 @@
           <w:lang w:eastAsia="en-GB"/>
         </w:rPr>
       </w:pPr>
-      <w:hyperlink w:anchor="_Toc201669648" w:history="1">
+      <w:hyperlink w:anchor="_Toc202808970" w:history="1">
         <w:r>
           <w:rPr>
             <w:rStyle w:val="Hyperlink"/>
@@ -385,7 +385,7 @@
             <w:noProof/>
             <w:webHidden/>
           </w:rPr>
-          <w:instrText xml:space="preserve"> PAGEREF _Toc201669648 \h </w:instrText>
+          <w:instrText xml:space="preserve"> PAGEREF _Toc202808970 \h </w:instrText>
         </w:r>
         <w:r>
           <w:rPr>
@@ -428,7 +428,7 @@
           <w:lang w:eastAsia="en-GB"/>
         </w:rPr>
       </w:pPr>
-      <w:hyperlink w:anchor="_Toc201669649" w:history="1">
+      <w:hyperlink w:anchor="_Toc202808971" w:history="1">
         <w:r>
           <w:rPr>
             <w:rStyle w:val="Hyperlink"/>
@@ -455,7 +455,7 @@
             <w:noProof/>
             <w:webHidden/>
           </w:rPr>
-          <w:instrText xml:space="preserve"> PAGEREF _Toc201669649 \h </w:instrText>
+          <w:instrText xml:space="preserve"> PAGEREF _Toc202808971 \h </w:instrText>
         </w:r>
         <w:r>
           <w:rPr>
@@ -498,7 +498,7 @@
           <w:lang w:eastAsia="en-GB"/>
         </w:rPr>
       </w:pPr>
-      <w:hyperlink w:anchor="_Toc201669650" w:history="1">
+      <w:hyperlink w:anchor="_Toc202808972" w:history="1">
         <w:r>
           <w:rPr>
             <w:rStyle w:val="Hyperlink"/>
@@ -525,7 +525,7 @@
             <w:noProof/>
             <w:webHidden/>
           </w:rPr>
-          <w:instrText xml:space="preserve"> PAGEREF _Toc201669650 \h </w:instrText>
+          <w:instrText xml:space="preserve"> PAGEREF _Toc202808972 \h </w:instrText>
         </w:r>
         <w:r>
           <w:rPr>
@@ -568,7 +568,7 @@
           <w:lang w:eastAsia="en-GB"/>
         </w:rPr>
       </w:pPr>
-      <w:hyperlink w:anchor="_Toc201669651" w:history="1">
+      <w:hyperlink w:anchor="_Toc202808973" w:history="1">
         <w:r>
           <w:rPr>
             <w:rStyle w:val="Hyperlink"/>
@@ -595,7 +595,7 @@
             <w:noProof/>
             <w:webHidden/>
           </w:rPr>
-          <w:instrText xml:space="preserve"> PAGEREF _Toc201669651 \h </w:instrText>
+          <w:instrText xml:space="preserve"> PAGEREF _Toc202808973 \h </w:instrText>
         </w:r>
         <w:r>
           <w:rPr>
@@ -638,7 +638,7 @@
           <w:lang w:eastAsia="en-GB"/>
         </w:rPr>
       </w:pPr>
-      <w:hyperlink w:anchor="_Toc201669652" w:history="1">
+      <w:hyperlink w:anchor="_Toc202808974" w:history="1">
         <w:r>
           <w:rPr>
             <w:rStyle w:val="Hyperlink"/>
@@ -665,7 +665,7 @@
             <w:noProof/>
             <w:webHidden/>
           </w:rPr>
-          <w:instrText xml:space="preserve"> PAGEREF _Toc201669652 \h </w:instrText>
+          <w:instrText xml:space="preserve"> PAGEREF _Toc202808974 \h </w:instrText>
         </w:r>
         <w:r>
           <w:rPr>
@@ -708,7 +708,7 @@
           <w:lang w:eastAsia="en-GB"/>
         </w:rPr>
       </w:pPr>
-      <w:hyperlink w:anchor="_Toc201669653" w:history="1">
+      <w:hyperlink w:anchor="_Toc202808975" w:history="1">
         <w:r>
           <w:rPr>
             <w:rStyle w:val="Hyperlink"/>
@@ -735,7 +735,7 @@
             <w:noProof/>
             <w:webHidden/>
           </w:rPr>
-          <w:instrText xml:space="preserve"> PAGEREF _Toc201669653 \h </w:instrText>
+          <w:instrText xml:space="preserve"> PAGEREF _Toc202808975 \h </w:instrText>
         </w:r>
         <w:r>
           <w:rPr>
@@ -778,7 +778,7 @@
           <w:lang w:eastAsia="en-GB"/>
         </w:rPr>
       </w:pPr>
-      <w:hyperlink w:anchor="_Toc201669654" w:history="1">
+      <w:hyperlink w:anchor="_Toc202808976" w:history="1">
         <w:r>
           <w:rPr>
             <w:rStyle w:val="Hyperlink"/>
@@ -805,7 +805,7 @@
             <w:noProof/>
             <w:webHidden/>
           </w:rPr>
-          <w:instrText xml:space="preserve"> PAGEREF _Toc201669654 \h </w:instrText>
+          <w:instrText xml:space="preserve"> PAGEREF _Toc202808976 \h </w:instrText>
         </w:r>
         <w:r>
           <w:rPr>
@@ -848,13 +848,13 @@
           <w:lang w:eastAsia="en-GB"/>
         </w:rPr>
       </w:pPr>
-      <w:hyperlink w:anchor="_Toc201669655" w:history="1">
+      <w:hyperlink w:anchor="_Toc202808977" w:history="1">
         <w:r>
           <w:rPr>
             <w:rStyle w:val="Hyperlink"/>
             <w:noProof/>
           </w:rPr>
-          <w:t>Scraping</w:t>
+          <w:t>Target Website</w:t>
         </w:r>
         <w:r>
           <w:rPr>
@@ -875,7 +875,7 @@
             <w:noProof/>
             <w:webHidden/>
           </w:rPr>
-          <w:instrText xml:space="preserve"> PAGEREF _Toc201669655 \h </w:instrText>
+          <w:instrText xml:space="preserve"> PAGEREF _Toc202808977 \h </w:instrText>
         </w:r>
         <w:r>
           <w:rPr>
@@ -918,13 +918,13 @@
           <w:lang w:eastAsia="en-GB"/>
         </w:rPr>
       </w:pPr>
-      <w:hyperlink w:anchor="_Toc201669656" w:history="1">
+      <w:hyperlink w:anchor="_Toc202808978" w:history="1">
         <w:r>
           <w:rPr>
             <w:rStyle w:val="Hyperlink"/>
             <w:noProof/>
           </w:rPr>
-          <w:t>Target Website</w:t>
+          <w:t>Scraping</w:t>
         </w:r>
         <w:r>
           <w:rPr>
@@ -945,7 +945,7 @@
             <w:noProof/>
             <w:webHidden/>
           </w:rPr>
-          <w:instrText xml:space="preserve"> PAGEREF _Toc201669656 \h </w:instrText>
+          <w:instrText xml:space="preserve"> PAGEREF _Toc202808978 \h </w:instrText>
         </w:r>
         <w:r>
           <w:rPr>
@@ -988,7 +988,7 @@
           <w:lang w:eastAsia="en-GB"/>
         </w:rPr>
       </w:pPr>
-      <w:hyperlink w:anchor="_Toc201669657" w:history="1">
+      <w:hyperlink w:anchor="_Toc202808979" w:history="1">
         <w:r>
           <w:rPr>
             <w:rStyle w:val="Hyperlink"/>
@@ -1015,7 +1015,7 @@
             <w:noProof/>
             <w:webHidden/>
           </w:rPr>
-          <w:instrText xml:space="preserve"> PAGEREF _Toc201669657 \h </w:instrText>
+          <w:instrText xml:space="preserve"> PAGEREF _Toc202808979 \h </w:instrText>
         </w:r>
         <w:r>
           <w:rPr>
@@ -1035,7 +1035,7 @@
             <w:noProof/>
             <w:webHidden/>
           </w:rPr>
-          <w:t>14</w:t>
+          <w:t>15</w:t>
         </w:r>
         <w:r>
           <w:rPr>
@@ -1058,7 +1058,7 @@
           <w:lang w:eastAsia="en-GB"/>
         </w:rPr>
       </w:pPr>
-      <w:hyperlink w:anchor="_Toc201669658" w:history="1">
+      <w:hyperlink w:anchor="_Toc202808980" w:history="1">
         <w:r>
           <w:rPr>
             <w:rStyle w:val="Hyperlink"/>
@@ -1085,7 +1085,7 @@
             <w:noProof/>
             <w:webHidden/>
           </w:rPr>
-          <w:instrText xml:space="preserve"> PAGEREF _Toc201669658 \h </w:instrText>
+          <w:instrText xml:space="preserve"> PAGEREF _Toc202808980 \h </w:instrText>
         </w:r>
         <w:r>
           <w:rPr>
@@ -1105,7 +1105,7 @@
             <w:noProof/>
             <w:webHidden/>
           </w:rPr>
-          <w:t>15</w:t>
+          <w:t>16</w:t>
         </w:r>
         <w:r>
           <w:rPr>
@@ -1128,12 +1128,82 @@
           <w:lang w:eastAsia="en-GB"/>
         </w:rPr>
       </w:pPr>
-      <w:hyperlink w:anchor="_Toc201669659" w:history="1">
+      <w:hyperlink w:anchor="_Toc202808981" w:history="1">
         <w:r>
           <w:rPr>
             <w:rStyle w:val="Hyperlink"/>
             <w:noProof/>
           </w:rPr>
+          <w:t>Scraping Practice</w:t>
+        </w:r>
+        <w:r>
+          <w:rPr>
+            <w:noProof/>
+            <w:webHidden/>
+          </w:rPr>
+          <w:tab/>
+        </w:r>
+        <w:r>
+          <w:rPr>
+            <w:noProof/>
+            <w:webHidden/>
+          </w:rPr>
+          <w:fldChar w:fldCharType="begin"/>
+        </w:r>
+        <w:r>
+          <w:rPr>
+            <w:noProof/>
+            <w:webHidden/>
+          </w:rPr>
+          <w:instrText xml:space="preserve"> PAGEREF _Toc202808981 \h </w:instrText>
+        </w:r>
+        <w:r>
+          <w:rPr>
+            <w:noProof/>
+            <w:webHidden/>
+          </w:rPr>
+        </w:r>
+        <w:r>
+          <w:rPr>
+            <w:noProof/>
+            <w:webHidden/>
+          </w:rPr>
+          <w:fldChar w:fldCharType="separate"/>
+        </w:r>
+        <w:r>
+          <w:rPr>
+            <w:noProof/>
+            <w:webHidden/>
+          </w:rPr>
+          <w:t>19</w:t>
+        </w:r>
+        <w:r>
+          <w:rPr>
+            <w:noProof/>
+            <w:webHidden/>
+          </w:rPr>
+          <w:fldChar w:fldCharType="end"/>
+        </w:r>
+      </w:hyperlink>
+    </w:p>
+    <w:p>
+      <w:pPr>
+        <w:pStyle w:val="TOC1"/>
+        <w:tabs>
+          <w:tab w:val="right" w:leader="dot" w:pos="9016"/>
+        </w:tabs>
+        <w:rPr>
+          <w:rFonts w:asciiTheme="minorHAnsi" w:eastAsiaTheme="minorEastAsia" w:hAnsiTheme="minorHAnsi"/>
+          <w:noProof/>
+          <w:lang w:eastAsia="en-GB"/>
+        </w:rPr>
+      </w:pPr>
+      <w:hyperlink w:anchor="_Toc202808982" w:history="1">
+        <w:r>
+          <w:rPr>
+            <w:rStyle w:val="Hyperlink"/>
+            <w:noProof/>
+          </w:rPr>
           <w:t>Development</w:t>
         </w:r>
         <w:r>
@@ -1155,7 +1225,7 @@
             <w:noProof/>
             <w:webHidden/>
           </w:rPr>
-          <w:instrText xml:space="preserve"> PAGEREF _Toc201669659 \h </w:instrText>
+          <w:instrText xml:space="preserve"> PAGEREF _Toc202808982 \h </w:instrText>
         </w:r>
         <w:r>
           <w:rPr>
@@ -1175,7 +1245,7 @@
             <w:noProof/>
             <w:webHidden/>
           </w:rPr>
-          <w:t>18</w:t>
+          <w:t>22</w:t>
         </w:r>
         <w:r>
           <w:rPr>
@@ -1198,7 +1268,7 @@
           <w:lang w:eastAsia="en-GB"/>
         </w:rPr>
       </w:pPr>
-      <w:hyperlink w:anchor="_Toc201669660" w:history="1">
+      <w:hyperlink w:anchor="_Toc202808983" w:history="1">
         <w:r>
           <w:rPr>
             <w:rStyle w:val="Hyperlink"/>
@@ -1225,7 +1295,7 @@
             <w:noProof/>
             <w:webHidden/>
           </w:rPr>
-          <w:instrText xml:space="preserve"> PAGEREF _Toc201669660 \h </w:instrText>
+          <w:instrText xml:space="preserve"> PAGEREF _Toc202808983 \h </w:instrText>
         </w:r>
         <w:r>
           <w:rPr>
@@ -1245,7 +1315,7 @@
             <w:noProof/>
             <w:webHidden/>
           </w:rPr>
-          <w:t>18</w:t>
+          <w:t>22</w:t>
         </w:r>
         <w:r>
           <w:rPr>
@@ -1268,7 +1338,7 @@
           <w:lang w:eastAsia="en-GB"/>
         </w:rPr>
       </w:pPr>
-      <w:hyperlink w:anchor="_Toc201669661" w:history="1">
+      <w:hyperlink w:anchor="_Toc202808984" w:history="1">
         <w:r>
           <w:rPr>
             <w:rStyle w:val="Hyperlink"/>
@@ -1295,7 +1365,7 @@
             <w:noProof/>
             <w:webHidden/>
           </w:rPr>
-          <w:instrText xml:space="preserve"> PAGEREF _Toc201669661 \h </w:instrText>
+          <w:instrText xml:space="preserve"> PAGEREF _Toc202808984 \h </w:instrText>
         </w:r>
         <w:r>
           <w:rPr>
@@ -1315,7 +1385,7 @@
             <w:noProof/>
             <w:webHidden/>
           </w:rPr>
-          <w:t>19</w:t>
+          <w:t>23</w:t>
         </w:r>
         <w:r>
           <w:rPr>
@@ -1338,7 +1408,7 @@
           <w:lang w:eastAsia="en-GB"/>
         </w:rPr>
       </w:pPr>
-      <w:hyperlink w:anchor="_Toc201669662" w:history="1">
+      <w:hyperlink w:anchor="_Toc202808985" w:history="1">
         <w:r>
           <w:rPr>
             <w:rStyle w:val="Hyperlink"/>
@@ -1365,7 +1435,7 @@
             <w:noProof/>
             <w:webHidden/>
           </w:rPr>
-          <w:instrText xml:space="preserve"> PAGEREF _Toc201669662 \h </w:instrText>
+          <w:instrText xml:space="preserve"> PAGEREF _Toc202808985 \h </w:instrText>
         </w:r>
         <w:r>
           <w:rPr>
@@ -1385,7 +1455,7 @@
             <w:noProof/>
             <w:webHidden/>
           </w:rPr>
-          <w:t>20</w:t>
+          <w:t>24</w:t>
         </w:r>
         <w:r>
           <w:rPr>
@@ -1408,7 +1478,7 @@
           <w:lang w:eastAsia="en-GB"/>
         </w:rPr>
       </w:pPr>
-      <w:hyperlink w:anchor="_Toc201669663" w:history="1">
+      <w:hyperlink w:anchor="_Toc202808986" w:history="1">
         <w:r>
           <w:rPr>
             <w:rStyle w:val="Hyperlink"/>
@@ -1435,7 +1505,7 @@
             <w:noProof/>
             <w:webHidden/>
           </w:rPr>
-          <w:instrText xml:space="preserve"> PAGEREF _Toc201669663 \h </w:instrText>
+          <w:instrText xml:space="preserve"> PAGEREF _Toc202808986 \h </w:instrText>
         </w:r>
         <w:r>
           <w:rPr>
@@ -1455,7 +1525,7 @@
             <w:noProof/>
             <w:webHidden/>
           </w:rPr>
-          <w:t>21</w:t>
+          <w:t>25</w:t>
         </w:r>
         <w:r>
           <w:rPr>
@@ -1478,7 +1548,7 @@
           <w:lang w:eastAsia="en-GB"/>
         </w:rPr>
       </w:pPr>
-      <w:hyperlink w:anchor="_Toc201669664" w:history="1">
+      <w:hyperlink w:anchor="_Toc202808987" w:history="1">
         <w:r>
           <w:rPr>
             <w:rStyle w:val="Hyperlink"/>
@@ -1505,7 +1575,7 @@
             <w:noProof/>
             <w:webHidden/>
           </w:rPr>
-          <w:instrText xml:space="preserve"> PAGEREF _Toc201669664 \h </w:instrText>
+          <w:instrText xml:space="preserve"> PAGEREF _Toc202808987 \h </w:instrText>
         </w:r>
         <w:r>
           <w:rPr>
@@ -1525,7 +1595,7 @@
             <w:noProof/>
             <w:webHidden/>
           </w:rPr>
-          <w:t>21</w:t>
+          <w:t>25</w:t>
         </w:r>
         <w:r>
           <w:rPr>
@@ -1548,7 +1618,7 @@
           <w:lang w:eastAsia="en-GB"/>
         </w:rPr>
       </w:pPr>
-      <w:hyperlink w:anchor="_Toc201669665" w:history="1">
+      <w:hyperlink w:anchor="_Toc202808988" w:history="1">
         <w:r>
           <w:rPr>
             <w:rStyle w:val="Hyperlink"/>
@@ -1575,7 +1645,7 @@
             <w:noProof/>
             <w:webHidden/>
           </w:rPr>
-          <w:instrText xml:space="preserve"> PAGEREF _Toc201669665 \h </w:instrText>
+          <w:instrText xml:space="preserve"> PAGEREF _Toc202808988 \h </w:instrText>
         </w:r>
         <w:r>
           <w:rPr>
@@ -1595,7 +1665,7 @@
             <w:noProof/>
             <w:webHidden/>
           </w:rPr>
-          <w:t>22</w:t>
+          <w:t>26</w:t>
         </w:r>
         <w:r>
           <w:rPr>
@@ -1618,7 +1688,7 @@
           <w:lang w:eastAsia="en-GB"/>
         </w:rPr>
       </w:pPr>
-      <w:hyperlink w:anchor="_Toc201669666" w:history="1">
+      <w:hyperlink w:anchor="_Toc202808989" w:history="1">
         <w:r>
           <w:rPr>
             <w:rStyle w:val="Hyperlink"/>
@@ -1645,7 +1715,7 @@
             <w:noProof/>
             <w:webHidden/>
           </w:rPr>
-          <w:instrText xml:space="preserve"> PAGEREF _Toc201669666 \h </w:instrText>
+          <w:instrText xml:space="preserve"> PAGEREF _Toc202808989 \h </w:instrText>
         </w:r>
         <w:r>
           <w:rPr>
@@ -1665,7 +1735,7 @@
             <w:noProof/>
             <w:webHidden/>
           </w:rPr>
-          <w:t>23</w:t>
+          <w:t>27</w:t>
         </w:r>
         <w:r>
           <w:rPr>
@@ -1688,7 +1758,7 @@
           <w:lang w:eastAsia="en-GB"/>
         </w:rPr>
       </w:pPr>
-      <w:hyperlink w:anchor="_Toc201669667" w:history="1">
+      <w:hyperlink w:anchor="_Toc202808990" w:history="1">
         <w:r>
           <w:rPr>
             <w:rStyle w:val="Hyperlink"/>
@@ -1715,7 +1785,7 @@
             <w:noProof/>
             <w:webHidden/>
           </w:rPr>
-          <w:instrText xml:space="preserve"> PAGEREF _Toc201669667 \h </w:instrText>
+          <w:instrText xml:space="preserve"> PAGEREF _Toc202808990 \h </w:instrText>
         </w:r>
         <w:r>
           <w:rPr>
@@ -1735,7 +1805,7 @@
             <w:noProof/>
             <w:webHidden/>
           </w:rPr>
-          <w:t>24</w:t>
+          <w:t>28</w:t>
         </w:r>
         <w:r>
           <w:rPr>
@@ -1758,7 +1828,7 @@
           <w:lang w:eastAsia="en-GB"/>
         </w:rPr>
       </w:pPr>
-      <w:hyperlink w:anchor="_Toc201669668" w:history="1">
+      <w:hyperlink w:anchor="_Toc202808991" w:history="1">
         <w:r>
           <w:rPr>
             <w:rStyle w:val="Hyperlink"/>
@@ -1785,7 +1855,7 @@
             <w:noProof/>
             <w:webHidden/>
           </w:rPr>
-          <w:instrText xml:space="preserve"> PAGEREF _Toc201669668 \h </w:instrText>
+          <w:instrText xml:space="preserve"> PAGEREF _Toc202808991 \h </w:instrText>
         </w:r>
         <w:r>
           <w:rPr>
@@ -1805,7 +1875,7 @@
             <w:noProof/>
             <w:webHidden/>
           </w:rPr>
-          <w:t>25</w:t>
+          <w:t>29</w:t>
         </w:r>
         <w:r>
           <w:rPr>
@@ -1830,7 +1900,7 @@
       <w:pPr>
         <w:pStyle w:val="Heading1"/>
       </w:pPr>
-      <w:bookmarkStart w:id="0" w:name="_Toc201669644"/>
+      <w:bookmarkStart w:id="0" w:name="_Toc202808966"/>
       <w:r>
         <w:lastRenderedPageBreak/>
         <w:t>Introduction</w:t>
@@ -1868,7 +1938,7 @@
       <w:pPr>
         <w:pStyle w:val="Heading1"/>
       </w:pPr>
-      <w:bookmarkStart w:id="1" w:name="_Toc201669645"/>
+      <w:bookmarkStart w:id="1" w:name="_Toc202808967"/>
       <w:r>
         <w:lastRenderedPageBreak/>
         <w:t>Design and Planning</w:t>
@@ -1879,7 +1949,7 @@
       <w:pPr>
         <w:pStyle w:val="Heading2"/>
       </w:pPr>
-      <w:bookmarkStart w:id="2" w:name="_Toc201669646"/>
+      <w:bookmarkStart w:id="2" w:name="_Toc202808968"/>
       <w:r>
         <w:t>Why a Tagging Website?</w:t>
       </w:r>
@@ -2121,7 +2191,7 @@
       <w:pPr>
         <w:pStyle w:val="Heading2"/>
       </w:pPr>
-      <w:bookmarkStart w:id="3" w:name="_Toc201669647"/>
+      <w:bookmarkStart w:id="3" w:name="_Toc202808969"/>
       <w:r>
         <w:lastRenderedPageBreak/>
         <w:t>What is</w:t>
@@ -2206,7 +2276,7 @@
       <w:pPr>
         <w:pStyle w:val="Heading2"/>
       </w:pPr>
-      <w:bookmarkStart w:id="4" w:name="_Toc201669648"/>
+      <w:bookmarkStart w:id="4" w:name="_Toc202808970"/>
       <w:r>
         <w:lastRenderedPageBreak/>
         <w:t>Legal and Security Issues</w:t>
@@ -2217,7 +2287,7 @@
       <w:pPr>
         <w:pStyle w:val="Heading3"/>
       </w:pPr>
-      <w:bookmarkStart w:id="5" w:name="_Toc201669649"/>
+      <w:bookmarkStart w:id="5" w:name="_Toc202808971"/>
       <w:r>
         <w:t>GDPR</w:t>
       </w:r>
@@ -2466,7 +2536,7 @@
       <w:pPr>
         <w:pStyle w:val="Heading3"/>
       </w:pPr>
-      <w:bookmarkStart w:id="6" w:name="_Toc201669650"/>
+      <w:bookmarkStart w:id="6" w:name="_Toc202808972"/>
       <w:r>
         <w:lastRenderedPageBreak/>
         <w:t>Computer Misuse Act 1990</w:t>
@@ -2537,7 +2607,7 @@
       <w:pPr>
         <w:pStyle w:val="Heading3"/>
       </w:pPr>
-      <w:bookmarkStart w:id="7" w:name="_Toc201669651"/>
+      <w:bookmarkStart w:id="7" w:name="_Toc202808973"/>
       <w:r>
         <w:lastRenderedPageBreak/>
         <w:t>STRIDE</w:t>
@@ -3008,7 +3078,7 @@
           <w:szCs w:val="20"/>
         </w:rPr>
       </w:pPr>
-      <w:bookmarkStart w:id="8" w:name="_Toc201669652"/>
+      <w:bookmarkStart w:id="8" w:name="_Toc202808974"/>
       <w:r>
         <w:lastRenderedPageBreak/>
         <w:t>Ad-Hoc</w:t>
@@ -3290,7 +3360,7 @@
           <w:noProof/>
         </w:rPr>
         <w:drawing>
-          <wp:inline distT="0" distB="0" distL="0" distR="0" wp14:anchorId="48932937" wp14:editId="6B510551">
+          <wp:inline distT="0" distB="0" distL="0" distR="0" wp14:anchorId="48932937" wp14:editId="59623767">
             <wp:extent cx="2476500" cy="2332517"/>
             <wp:effectExtent l="38100" t="38100" r="38100" b="29845"/>
             <wp:docPr id="1674870808" name="Picture 5" descr="A screenshot of a video game&#10;&#10;AI-generated content may be incorrect."/>
@@ -3480,7 +3550,7 @@
       <w:pPr>
         <w:pStyle w:val="Heading2"/>
       </w:pPr>
-      <w:bookmarkStart w:id="9" w:name="_Toc201669653"/>
+      <w:bookmarkStart w:id="9" w:name="_Toc202808975"/>
       <w:r>
         <w:lastRenderedPageBreak/>
         <w:t>Methodology</w:t>
@@ -3614,7 +3684,7 @@
       <w:pPr>
         <w:pStyle w:val="Heading2"/>
       </w:pPr>
-      <w:bookmarkStart w:id="10" w:name="_Toc201669654"/>
+      <w:bookmarkStart w:id="10" w:name="_Toc202808976"/>
       <w:r>
         <w:lastRenderedPageBreak/>
         <w:t>Data Plan</w:t>
@@ -3625,182 +3695,11 @@
       <w:pPr>
         <w:pStyle w:val="Heading3"/>
       </w:pPr>
-      <w:bookmarkStart w:id="11" w:name="_Toc201669655"/>
-      <w:r>
-        <w:t>Scraping</w:t>
+      <w:bookmarkStart w:id="11" w:name="_Toc202808977"/>
+      <w:r>
+        <w:t>Target Website</w:t>
       </w:r>
       <w:bookmarkEnd w:id="11"/>
-    </w:p>
-    <w:p>
-      <w:r>
-        <w:t>For the website to work, it needs a database full of information about various video games and that information needs to describe those video games in different ways to differentiate all of them. To get this data, as previously described, a scraping program will used that will be programmed in Python.</w:t>
-      </w:r>
-    </w:p>
-    <w:p>
-      <w:r>
-        <w:t>To do this, several libraries could be used:</w:t>
-      </w:r>
-    </w:p>
-    <w:p>
-      <w:pPr>
-        <w:pStyle w:val="ListParagraph"/>
-        <w:numPr>
-          <w:ilvl w:val="0"/>
-          <w:numId w:val="12"/>
-        </w:numPr>
-      </w:pPr>
-      <w:r>
-        <w:t>Requests: This library allows Python to send HTTP requests to targeted web pages. More specifically for this project, the HTML can be requested which contains the information that would be displayed on a webpage (Pypi, n.d., -a).</w:t>
-      </w:r>
-    </w:p>
-    <w:p>
-      <w:pPr>
-        <w:pStyle w:val="ListParagraph"/>
-        <w:numPr>
-          <w:ilvl w:val="0"/>
-          <w:numId w:val="12"/>
-        </w:numPr>
-      </w:pPr>
-      <w:r>
-        <w:t xml:space="preserve">Beautifulsoup: This library is a HTML (and XML) parser that allows for easy manipulation and searching of a HTML tree (Pypi, n.d., -b). </w:t>
-      </w:r>
-    </w:p>
-    <w:p>
-      <w:pPr>
-        <w:pStyle w:val="ListParagraph"/>
-        <w:numPr>
-          <w:ilvl w:val="0"/>
-          <w:numId w:val="12"/>
-        </w:numPr>
-      </w:pPr>
-      <w:r>
-        <w:t>Selenium: This library allows Python to take control of a browser</w:t>
-      </w:r>
-      <w:r>
-        <w:t xml:space="preserve"> (Pypi, n.d. -c)</w:t>
-      </w:r>
-      <w:r>
-        <w:t xml:space="preserve"> </w:t>
-      </w:r>
-      <w:r>
-        <w:t xml:space="preserve">in a programmatic way </w:t>
-      </w:r>
-      <w:r>
-        <w:t>which allows for web scraping like the requests library but i</w:t>
-      </w:r>
-      <w:r>
-        <w:t>n a browser instead of just a HTML</w:t>
-      </w:r>
-      <w:r>
-        <w:t xml:space="preserve"> </w:t>
-      </w:r>
-      <w:r>
-        <w:t xml:space="preserve">file </w:t>
-      </w:r>
-      <w:r>
-        <w:t>(GeeksForGeeks, 2025).</w:t>
-      </w:r>
-    </w:p>
-    <w:p>
-      <w:pPr>
-        <w:pStyle w:val="ListParagraph"/>
-        <w:numPr>
-          <w:ilvl w:val="0"/>
-          <w:numId w:val="12"/>
-        </w:numPr>
-      </w:pPr>
-      <w:r>
-        <w:t>Schedule: This library allows for the scheduling of Python functions allowing for Python functions to be run periodically without a human needing to run it again (Pypi, n.d. -d).</w:t>
-      </w:r>
-    </w:p>
-    <w:p>
-      <w:r>
-        <w:t>(GeeksForGeeks, 2025)</w:t>
-      </w:r>
-    </w:p>
-    <w:p>
-      <w:r>
-        <w:t xml:space="preserve">The next part of this project is to learn how scraping works which will involve deciding which of these libraries (or others) should be used. </w:t>
-      </w:r>
-    </w:p>
-    <w:p>
-      <w:r>
-        <w:t xml:space="preserve">For the scraping program itself, the target website must have a page that lists </w:t>
-      </w:r>
-      <w:r>
-        <w:rPr>
-          <w:i/>
-          <w:iCs/>
-        </w:rPr>
-        <w:t>all</w:t>
-      </w:r>
-      <w:r>
-        <w:t xml:space="preserve"> of its games. Using this page, the following should be done for each game in the list:</w:t>
-      </w:r>
-    </w:p>
-    <w:p>
-      <w:pPr>
-        <w:pStyle w:val="ListParagraph"/>
-        <w:numPr>
-          <w:ilvl w:val="0"/>
-          <w:numId w:val="15"/>
-        </w:numPr>
-      </w:pPr>
-      <w:r>
-        <w:t>Access the link to the game’s page.</w:t>
-      </w:r>
-    </w:p>
-    <w:p>
-      <w:pPr>
-        <w:pStyle w:val="ListParagraph"/>
-        <w:numPr>
-          <w:ilvl w:val="0"/>
-          <w:numId w:val="15"/>
-        </w:numPr>
-      </w:pPr>
-      <w:r>
-        <w:t>Systematically go through the game page’s HTML to get information the video game.</w:t>
-      </w:r>
-    </w:p>
-    <w:p>
-      <w:pPr>
-        <w:pStyle w:val="ListParagraph"/>
-        <w:numPr>
-          <w:ilvl w:val="0"/>
-          <w:numId w:val="15"/>
-        </w:numPr>
-      </w:pPr>
-      <w:r>
-        <w:t>Save the video game’s information gathered by appending it to a CSV file.</w:t>
-      </w:r>
-    </w:p>
-    <w:p>
-      <w:pPr>
-        <w:pStyle w:val="ListParagraph"/>
-        <w:numPr>
-          <w:ilvl w:val="0"/>
-          <w:numId w:val="15"/>
-        </w:numPr>
-      </w:pPr>
-      <w:r>
-        <w:t>Return to the video game list and start again on the next game in the list.</w:t>
-      </w:r>
-    </w:p>
-    <w:p>
-      <w:r>
-        <w:br w:type="page"/>
-      </w:r>
-    </w:p>
-    <w:p>
-      <w:pPr>
-        <w:pStyle w:val="Heading3"/>
-      </w:pPr>
-      <w:bookmarkStart w:id="12" w:name="_Toc201669656"/>
-      <w:r>
-        <w:lastRenderedPageBreak/>
-        <w:t>Target Website</w:t>
-      </w:r>
-      <w:bookmarkEnd w:id="12"/>
     </w:p>
     <w:p>
       <w:r>
@@ -3808,10 +3707,10 @@
           <w:noProof/>
         </w:rPr>
         <w:drawing>
-          <wp:inline distT="0" distB="0" distL="0" distR="0" wp14:anchorId="5189CE16" wp14:editId="758B7C88">
+          <wp:inline distT="0" distB="0" distL="0" distR="0" wp14:anchorId="03238BD1" wp14:editId="6D6D68EF">
             <wp:extent cx="5724525" cy="3838575"/>
             <wp:effectExtent l="38100" t="38100" r="47625" b="47625"/>
-            <wp:docPr id="1731223851" name="Picture 1"/>
+            <wp:docPr id="1731223851" name="Picture 1" descr="A screenshot of a computer&#10;&#10;AI-generated content may be incorrect."/>
             <wp:cNvGraphicFramePr>
               <a:graphicFrameLocks xmlns:a="http://schemas.openxmlformats.org/drawingml/2006/main" noChangeAspect="1"/>
             </wp:cNvGraphicFramePr>
@@ -3819,7 +3718,7 @@
               <a:graphicData uri="http://schemas.openxmlformats.org/drawingml/2006/picture">
                 <pic:pic xmlns:pic="http://schemas.openxmlformats.org/drawingml/2006/picture">
                   <pic:nvPicPr>
-                    <pic:cNvPr id="0" name="Picture 1"/>
+                    <pic:cNvPr id="1731223851" name="Picture 1" descr="A screenshot of a computer&#10;&#10;AI-generated content may be incorrect."/>
                     <pic:cNvPicPr>
                       <a:picLocks noChangeAspect="1" noChangeArrowheads="1"/>
                     </pic:cNvPicPr>
@@ -3866,10 +3765,7 @@
     </w:p>
     <w:p>
       <w:r>
-        <w:t xml:space="preserve">Steam has hundreds of thousands of video games available to collect data from (the above screenshot shows 225330 games for an empty search). As stated previously, all data on each video game page is submitted by the developers themselves and this page </w:t>
-      </w:r>
-      <w:r>
-        <w:t xml:space="preserve">in the screenshot meets the previously mentioned requirement of there being a page with a list of all games which will make the scraping program easier. </w:t>
+        <w:t xml:space="preserve">Steam has hundreds of thousands of video games available to collect data from (the above screenshot shows 225330 games for an empty search). As stated previously, all data on each video game page is submitted by the developers themselves and this page in the screenshot meets the previously mentioned requirement of there being a page with a list of all games which will make the scraping program easier. </w:t>
       </w:r>
     </w:p>
     <w:p>
@@ -3886,7 +3782,353 @@
       <w:pPr>
         <w:pStyle w:val="Heading3"/>
       </w:pPr>
-      <w:bookmarkStart w:id="13" w:name="_Toc201669657"/>
+      <w:bookmarkStart w:id="12" w:name="_Toc202808978"/>
+      <w:r>
+        <w:lastRenderedPageBreak/>
+        <w:t>Scraping</w:t>
+      </w:r>
+      <w:bookmarkEnd w:id="12"/>
+    </w:p>
+    <w:p>
+      <w:r>
+        <w:t>For the website to work, it needs a database full of information about various video games and that information needs to describe those video games in different ways to differentiate all of them. To get this data, as previously described, a scraping program will used that will be programmed in Python.</w:t>
+      </w:r>
+    </w:p>
+    <w:p>
+      <w:r>
+        <w:t>To do this, several libraries could be used:</w:t>
+      </w:r>
+    </w:p>
+    <w:p>
+      <w:pPr>
+        <w:pStyle w:val="ListParagraph"/>
+        <w:numPr>
+          <w:ilvl w:val="0"/>
+          <w:numId w:val="12"/>
+        </w:numPr>
+      </w:pPr>
+      <w:r>
+        <w:t>Requests: This library allows Python to send HTTP requests to targeted web pages. More specifically for this project, the HTML can be requested which contains the information that would be displayed on a webpage (Pypi, n.d., -a).</w:t>
+      </w:r>
+    </w:p>
+    <w:p>
+      <w:pPr>
+        <w:pStyle w:val="ListParagraph"/>
+        <w:numPr>
+          <w:ilvl w:val="0"/>
+          <w:numId w:val="12"/>
+        </w:numPr>
+      </w:pPr>
+      <w:r>
+        <w:t xml:space="preserve">Beautifulsoup: This library is a HTML (and XML) parser that allows for easy manipulation and searching of a HTML tree (Pypi, n.d., -b). </w:t>
+      </w:r>
+    </w:p>
+    <w:p>
+      <w:pPr>
+        <w:pStyle w:val="ListParagraph"/>
+        <w:numPr>
+          <w:ilvl w:val="0"/>
+          <w:numId w:val="12"/>
+        </w:numPr>
+      </w:pPr>
+      <w:r>
+        <w:t>Selenium: This library allows Python to take control of a browser</w:t>
+      </w:r>
+      <w:r>
+        <w:t xml:space="preserve"> (Pypi, n.d. -c)</w:t>
+      </w:r>
+      <w:r>
+        <w:t xml:space="preserve"> </w:t>
+      </w:r>
+      <w:r>
+        <w:t xml:space="preserve">in a programmatic way </w:t>
+      </w:r>
+      <w:r>
+        <w:t>which allows for web scraping like the requests library but i</w:t>
+      </w:r>
+      <w:r>
+        <w:t>n a browser instead of just a HTML</w:t>
+      </w:r>
+      <w:r>
+        <w:t xml:space="preserve"> </w:t>
+      </w:r>
+      <w:r>
+        <w:t xml:space="preserve">file </w:t>
+      </w:r>
+      <w:r>
+        <w:t>(GeeksForGeeks, 2025).</w:t>
+      </w:r>
+    </w:p>
+    <w:p>
+      <w:pPr>
+        <w:pStyle w:val="ListParagraph"/>
+        <w:numPr>
+          <w:ilvl w:val="0"/>
+          <w:numId w:val="12"/>
+        </w:numPr>
+      </w:pPr>
+      <w:r>
+        <w:t>Schedule: This library allows for the scheduling of Python functions allowing for Python functions to be run periodically without a human needing to run it again (Pypi, n.d. -d).</w:t>
+      </w:r>
+    </w:p>
+    <w:p>
+      <w:r>
+        <w:t>(GeeksForGeeks, 2025)</w:t>
+      </w:r>
+    </w:p>
+    <w:p>
+      <w:r>
+        <w:t xml:space="preserve">The next part of this project is to learn how scraping works which will involve deciding which of these libraries (or others) should be used. </w:t>
+      </w:r>
+    </w:p>
+    <w:p>
+      <w:r>
+        <w:t xml:space="preserve">For the scraping program itself, the target website must have a page that lists </w:t>
+      </w:r>
+      <w:r>
+        <w:rPr>
+          <w:i/>
+          <w:iCs/>
+        </w:rPr>
+        <w:t>all</w:t>
+      </w:r>
+      <w:r>
+        <w:t xml:space="preserve"> of its games. Using this page, the following should be done for each game in the list:</w:t>
+      </w:r>
+    </w:p>
+    <w:p>
+      <w:pPr>
+        <w:pStyle w:val="ListParagraph"/>
+        <w:numPr>
+          <w:ilvl w:val="0"/>
+          <w:numId w:val="15"/>
+        </w:numPr>
+      </w:pPr>
+      <w:r>
+        <w:t>Access the link to the game’s page.</w:t>
+      </w:r>
+    </w:p>
+    <w:p>
+      <w:pPr>
+        <w:pStyle w:val="ListParagraph"/>
+        <w:numPr>
+          <w:ilvl w:val="0"/>
+          <w:numId w:val="15"/>
+        </w:numPr>
+      </w:pPr>
+      <w:r>
+        <w:t>Systematically go through the game page’s HTML to get information the video game.</w:t>
+      </w:r>
+    </w:p>
+    <w:p>
+      <w:pPr>
+        <w:pStyle w:val="ListParagraph"/>
+        <w:numPr>
+          <w:ilvl w:val="0"/>
+          <w:numId w:val="15"/>
+        </w:numPr>
+      </w:pPr>
+      <w:r>
+        <w:t>Save the video game’s information gathered by appending it to a CSV file.</w:t>
+      </w:r>
+    </w:p>
+    <w:p>
+      <w:pPr>
+        <w:pStyle w:val="ListParagraph"/>
+        <w:numPr>
+          <w:ilvl w:val="0"/>
+          <w:numId w:val="15"/>
+        </w:numPr>
+      </w:pPr>
+      <w:r>
+        <w:t>Return to the video game list and start again on the next game in the list.</w:t>
+      </w:r>
+    </w:p>
+    <w:p>
+      <w:r>
+        <w:t>When looking at the typical Steam game page. There are at least ten specific points of data that would be useful to scrape. They are:</w:t>
+      </w:r>
+    </w:p>
+    <w:p>
+      <w:pPr>
+        <w:pStyle w:val="ListParagraph"/>
+        <w:numPr>
+          <w:ilvl w:val="0"/>
+          <w:numId w:val="17"/>
+        </w:numPr>
+      </w:pPr>
+      <w:r>
+        <w:t>The game’s title which can be found on the main page that shows all games and on the game’s page itself. This will be used on the website.</w:t>
+      </w:r>
+    </w:p>
+    <w:p>
+      <w:pPr>
+        <w:pStyle w:val="ListParagraph"/>
+        <w:numPr>
+          <w:ilvl w:val="0"/>
+          <w:numId w:val="17"/>
+        </w:numPr>
+      </w:pPr>
+      <w:r>
+        <w:t>The game’s description which can be found on the game’s page in both a short version at the top of the page and a longer version lower in the page. This is n</w:t>
+      </w:r>
+      <w:r>
+        <w:t>o</w:t>
+      </w:r>
+      <w:r>
+        <w:t>t inherently useful, but this will still be scraped nonetheless to be used in the website as the game’s description.</w:t>
+      </w:r>
+    </w:p>
+    <w:p>
+      <w:pPr>
+        <w:pStyle w:val="ListParagraph"/>
+        <w:numPr>
+          <w:ilvl w:val="0"/>
+          <w:numId w:val="17"/>
+        </w:numPr>
+      </w:pPr>
+      <w:r>
+        <w:t xml:space="preserve">The release date. </w:t>
+      </w:r>
+      <w:r>
+        <w:t>This is u</w:t>
+      </w:r>
+      <w:r>
+        <w:t xml:space="preserve">seful for data </w:t>
+      </w:r>
+      <w:r>
+        <w:t>analysis,</w:t>
+      </w:r>
+      <w:r>
+        <w:t xml:space="preserve"> and </w:t>
+      </w:r>
+      <w:r>
+        <w:t xml:space="preserve">this </w:t>
+      </w:r>
+      <w:r>
+        <w:t>will also be used on the website.</w:t>
+      </w:r>
+    </w:p>
+    <w:p>
+      <w:pPr>
+        <w:pStyle w:val="ListParagraph"/>
+        <w:numPr>
+          <w:ilvl w:val="0"/>
+          <w:numId w:val="17"/>
+        </w:numPr>
+      </w:pPr>
+      <w:r>
+        <w:lastRenderedPageBreak/>
+        <w:t xml:space="preserve">The game’s developer(s). </w:t>
+      </w:r>
+      <w:r>
+        <w:t>This is useful for knowing which developer(s) made which games so they can be grouped together which will be useful with data analysis. This will be used on the website as well.</w:t>
+      </w:r>
+    </w:p>
+    <w:p>
+      <w:pPr>
+        <w:pStyle w:val="ListParagraph"/>
+        <w:numPr>
+          <w:ilvl w:val="0"/>
+          <w:numId w:val="17"/>
+        </w:numPr>
+      </w:pPr>
+      <w:r>
+        <w:t>The game’s publisher(s)</w:t>
+      </w:r>
+      <w:r>
+        <w:t>. This is useful in the same way as the developer(s): to help group games together which will be useful with data analysis. This will be used on the website along with the developer(s)</w:t>
+      </w:r>
+    </w:p>
+    <w:p>
+      <w:pPr>
+        <w:pStyle w:val="ListParagraph"/>
+        <w:numPr>
+          <w:ilvl w:val="0"/>
+          <w:numId w:val="17"/>
+        </w:numPr>
+      </w:pPr>
+      <w:r>
+        <w:t>The user defined tags which were mentioned previously. This will mostly be useful in the website but will still be used in data analysis.</w:t>
+      </w:r>
+    </w:p>
+    <w:p>
+      <w:pPr>
+        <w:pStyle w:val="ListParagraph"/>
+        <w:numPr>
+          <w:ilvl w:val="0"/>
+          <w:numId w:val="17"/>
+        </w:numPr>
+      </w:pPr>
+      <w:r>
+        <w:t xml:space="preserve">The game’s price. Very useful for data analysis when used in conjunction with the previous mentioned data, but this will </w:t>
+      </w:r>
+      <w:r>
+        <w:rPr>
+          <w:i/>
+          <w:iCs/>
+        </w:rPr>
+        <w:t>not</w:t>
+      </w:r>
+      <w:r>
+        <w:t xml:space="preserve"> be used on the website.</w:t>
+      </w:r>
+    </w:p>
+    <w:p>
+      <w:pPr>
+        <w:pStyle w:val="ListParagraph"/>
+        <w:numPr>
+          <w:ilvl w:val="0"/>
+          <w:numId w:val="17"/>
+        </w:numPr>
+      </w:pPr>
+      <w:r>
+        <w:t>The game’s “features”. The section that contains these “features” does not have a heading or any text to title it, but the HTML calls it “</w:t>
+      </w:r>
+      <w:r>
+        <w:t>game_area_features_list_ctn</w:t>
+      </w:r>
+      <w:r>
+        <w:t>”. This will be used in data analysis, but when used on the website, it will most likely be mixed with the user defined tags as they are both quite similar.</w:t>
+      </w:r>
+    </w:p>
+    <w:p>
+      <w:pPr>
+        <w:pStyle w:val="ListParagraph"/>
+        <w:numPr>
+          <w:ilvl w:val="0"/>
+          <w:numId w:val="17"/>
+        </w:numPr>
+      </w:pPr>
+      <w:r>
+        <w:t xml:space="preserve">The game’s supported languages. This is laid out on each game’s page as a table which describes which parts of the game support which language (E.G: A game’s interface might support English, but it might not have English audio). </w:t>
+      </w:r>
+      <w:r>
+        <w:t>This will not be used in data analysis, but will be used on the website to show which game’s support which languages.</w:t>
+      </w:r>
+    </w:p>
+    <w:p>
+      <w:pPr>
+        <w:pStyle w:val="ListParagraph"/>
+        <w:numPr>
+          <w:ilvl w:val="0"/>
+          <w:numId w:val="17"/>
+        </w:numPr>
+      </w:pPr>
+      <w:r>
+        <w:t>The game’s genres. This is very similar to user tags, but is more general. This will be used in data analysis and on the website.</w:t>
+      </w:r>
+    </w:p>
+    <w:p>
+      <w:r>
+        <w:br w:type="page"/>
+      </w:r>
+    </w:p>
+    <w:p>
+      <w:pPr>
+        <w:pStyle w:val="Heading3"/>
+      </w:pPr>
+      <w:bookmarkStart w:id="13" w:name="_Toc202808979"/>
       <w:r>
         <w:lastRenderedPageBreak/>
         <w:t>Saving Format (.CSV)</w:t>
@@ -3929,7 +4171,7 @@
       <w:pPr>
         <w:pStyle w:val="Heading3"/>
       </w:pPr>
-      <w:bookmarkStart w:id="14" w:name="_Toc201669658"/>
+      <w:bookmarkStart w:id="14" w:name="_Toc202808980"/>
       <w:r>
         <w:lastRenderedPageBreak/>
         <w:t>Database (MySQL)</w:t>
@@ -4116,10 +4358,12 @@
       <w:pPr>
         <w:pStyle w:val="Heading1"/>
       </w:pPr>
+      <w:bookmarkStart w:id="15" w:name="_Toc202808981"/>
       <w:r>
         <w:lastRenderedPageBreak/>
         <w:t>Scraping Practice</w:t>
       </w:r>
+      <w:bookmarkEnd w:id="15"/>
     </w:p>
     <w:p>
       <w:r>
@@ -4287,7 +4531,7 @@
           <w:noProof/>
         </w:rPr>
         <w:drawing>
-          <wp:inline distT="0" distB="0" distL="0" distR="0" wp14:anchorId="40ABE2E5" wp14:editId="7834A8AD">
+          <wp:inline distT="0" distB="0" distL="0" distR="0" wp14:anchorId="40ABE2E5" wp14:editId="44AA6E9C">
             <wp:extent cx="4162425" cy="1246650"/>
             <wp:effectExtent l="38100" t="38100" r="28575" b="29845"/>
             <wp:docPr id="1701288164" name="Picture 2" descr="A computer screen with text on it&#10;&#10;AI-generated content may be incorrect."/>
@@ -4461,22 +4705,25 @@
       <w:pPr>
         <w:pStyle w:val="Heading1"/>
       </w:pPr>
-      <w:bookmarkStart w:id="15" w:name="_Toc201669659"/>
+      <w:bookmarkStart w:id="16" w:name="_Toc202808982"/>
       <w:r>
         <w:lastRenderedPageBreak/>
         <w:t>Development</w:t>
       </w:r>
-      <w:bookmarkEnd w:id="15"/>
+      <w:bookmarkEnd w:id="16"/>
+      <w:r>
+        <w:t xml:space="preserve"> &amp; Data Analysis</w:t>
+      </w:r>
     </w:p>
     <w:p>
       <w:pPr>
         <w:pStyle w:val="Heading2"/>
       </w:pPr>
-      <w:bookmarkStart w:id="16" w:name="_Toc201669660"/>
+      <w:bookmarkStart w:id="17" w:name="_Toc202808983"/>
       <w:r>
         <w:t>Scraping Program</w:t>
       </w:r>
-      <w:bookmarkEnd w:id="16"/>
+      <w:bookmarkEnd w:id="17"/>
     </w:p>
     <w:p/>
     <w:p>
@@ -4488,12 +4735,26 @@
       <w:pPr>
         <w:pStyle w:val="Heading2"/>
       </w:pPr>
-      <w:bookmarkStart w:id="17" w:name="_Toc201669661"/>
+      <w:r>
+        <w:lastRenderedPageBreak/>
+        <w:t>Data Analysis</w:t>
+      </w:r>
+    </w:p>
+    <w:p>
+      <w:r>
+        <w:br w:type="page"/>
+      </w:r>
+    </w:p>
+    <w:p>
+      <w:pPr>
+        <w:pStyle w:val="Heading2"/>
+      </w:pPr>
+      <w:bookmarkStart w:id="18" w:name="_Toc202808984"/>
       <w:r>
         <w:lastRenderedPageBreak/>
         <w:t>MySQL Database</w:t>
       </w:r>
-      <w:bookmarkEnd w:id="17"/>
+      <w:bookmarkEnd w:id="18"/>
     </w:p>
     <w:p/>
     <w:p>
@@ -4505,12 +4766,12 @@
       <w:pPr>
         <w:pStyle w:val="Heading2"/>
       </w:pPr>
-      <w:bookmarkStart w:id="18" w:name="_Toc201669662"/>
+      <w:bookmarkStart w:id="19" w:name="_Toc202808985"/>
       <w:r>
         <w:lastRenderedPageBreak/>
         <w:t>Website</w:t>
       </w:r>
-      <w:bookmarkEnd w:id="18"/>
+      <w:bookmarkEnd w:id="19"/>
     </w:p>
     <w:p/>
     <w:p>
@@ -4522,22 +4783,22 @@
       <w:pPr>
         <w:pStyle w:val="Heading1"/>
       </w:pPr>
-      <w:bookmarkStart w:id="19" w:name="_Toc201669663"/>
+      <w:bookmarkStart w:id="20" w:name="_Toc202808986"/>
       <w:r>
         <w:lastRenderedPageBreak/>
         <w:t>Results/Findings</w:t>
       </w:r>
-      <w:bookmarkEnd w:id="19"/>
+      <w:bookmarkEnd w:id="20"/>
     </w:p>
     <w:p>
       <w:pPr>
         <w:pStyle w:val="Heading2"/>
       </w:pPr>
-      <w:bookmarkStart w:id="20" w:name="_Toc201669664"/>
+      <w:bookmarkStart w:id="21" w:name="_Toc202808987"/>
       <w:r>
         <w:t>Scraping Program</w:t>
       </w:r>
-      <w:bookmarkEnd w:id="20"/>
+      <w:bookmarkEnd w:id="21"/>
     </w:p>
     <w:p/>
     <w:p>
@@ -4549,12 +4810,12 @@
       <w:pPr>
         <w:pStyle w:val="Heading2"/>
       </w:pPr>
-      <w:bookmarkStart w:id="21" w:name="_Toc201669665"/>
+      <w:bookmarkStart w:id="22" w:name="_Toc202808988"/>
       <w:r>
         <w:lastRenderedPageBreak/>
         <w:t>MySQL Database</w:t>
       </w:r>
-      <w:bookmarkEnd w:id="21"/>
+      <w:bookmarkEnd w:id="22"/>
     </w:p>
     <w:p/>
     <w:p>
@@ -4566,12 +4827,12 @@
       <w:pPr>
         <w:pStyle w:val="Heading2"/>
       </w:pPr>
-      <w:bookmarkStart w:id="22" w:name="_Toc201669666"/>
+      <w:bookmarkStart w:id="23" w:name="_Toc202808989"/>
       <w:r>
         <w:lastRenderedPageBreak/>
         <w:t>Website</w:t>
       </w:r>
-      <w:bookmarkEnd w:id="22"/>
+      <w:bookmarkEnd w:id="23"/>
     </w:p>
     <w:p/>
     <w:p>
@@ -4583,12 +4844,12 @@
       <w:pPr>
         <w:pStyle w:val="Heading1"/>
       </w:pPr>
-      <w:bookmarkStart w:id="23" w:name="_Toc201669667"/>
+      <w:bookmarkStart w:id="24" w:name="_Toc202808990"/>
       <w:r>
         <w:lastRenderedPageBreak/>
         <w:t>Conclusion</w:t>
       </w:r>
-      <w:bookmarkEnd w:id="23"/>
+      <w:bookmarkEnd w:id="24"/>
     </w:p>
     <w:p/>
     <w:p>
@@ -4600,12 +4861,12 @@
       <w:pPr>
         <w:pStyle w:val="Heading1"/>
       </w:pPr>
-      <w:bookmarkStart w:id="24" w:name="_Toc201669668"/>
+      <w:bookmarkStart w:id="25" w:name="_Toc202808991"/>
       <w:r>
         <w:lastRenderedPageBreak/>
         <w:t>References</w:t>
       </w:r>
-      <w:bookmarkEnd w:id="24"/>
+      <w:bookmarkEnd w:id="25"/>
     </w:p>
     <w:p>
       <w:pPr>
@@ -5954,6 +6215,119 @@
     </w:lvl>
   </w:abstractNum>
   <w:abstractNum w:abstractNumId="6" w15:restartNumberingAfterBreak="0">
+    <w:nsid w:val="0F0E46D8"/>
+    <w:multiLevelType w:val="hybridMultilevel"/>
+    <w:tmpl w:val="37CE2F80"/>
+    <w:lvl w:ilvl="0" w:tplc="0809000F">
+      <w:start w:val="1"/>
+      <w:numFmt w:val="decimal"/>
+      <w:lvlText w:val="%1."/>
+      <w:lvlJc w:val="left"/>
+      <w:pPr>
+        <w:ind w:left="720" w:hanging="360"/>
+      </w:pPr>
+      <w:rPr>
+        <w:rFonts w:hint="default"/>
+      </w:rPr>
+    </w:lvl>
+    <w:lvl w:ilvl="1" w:tplc="08090003" w:tentative="1">
+      <w:start w:val="1"/>
+      <w:numFmt w:val="bullet"/>
+      <w:lvlText w:val="o"/>
+      <w:lvlJc w:val="left"/>
+      <w:pPr>
+        <w:ind w:left="1440" w:hanging="360"/>
+      </w:pPr>
+      <w:rPr>
+        <w:rFonts w:ascii="Courier New" w:hAnsi="Courier New" w:cs="Courier New" w:hint="default"/>
+      </w:rPr>
+    </w:lvl>
+    <w:lvl w:ilvl="2" w:tplc="08090005" w:tentative="1">
+      <w:start w:val="1"/>
+      <w:numFmt w:val="bullet"/>
+      <w:lvlText w:val=""/>
+      <w:lvlJc w:val="left"/>
+      <w:pPr>
+        <w:ind w:left="2160" w:hanging="360"/>
+      </w:pPr>
+      <w:rPr>
+        <w:rFonts w:ascii="Wingdings" w:hAnsi="Wingdings" w:hint="default"/>
+      </w:rPr>
+    </w:lvl>
+    <w:lvl w:ilvl="3" w:tplc="08090001" w:tentative="1">
+      <w:start w:val="1"/>
+      <w:numFmt w:val="bullet"/>
+      <w:lvlText w:val=""/>
+      <w:lvlJc w:val="left"/>
+      <w:pPr>
+        <w:ind w:left="2880" w:hanging="360"/>
+      </w:pPr>
+      <w:rPr>
+        <w:rFonts w:ascii="Symbol" w:hAnsi="Symbol" w:hint="default"/>
+      </w:rPr>
+    </w:lvl>
+    <w:lvl w:ilvl="4" w:tplc="08090003" w:tentative="1">
+      <w:start w:val="1"/>
+      <w:numFmt w:val="bullet"/>
+      <w:lvlText w:val="o"/>
+      <w:lvlJc w:val="left"/>
+      <w:pPr>
+        <w:ind w:left="3600" w:hanging="360"/>
+      </w:pPr>
+      <w:rPr>
+        <w:rFonts w:ascii="Courier New" w:hAnsi="Courier New" w:cs="Courier New" w:hint="default"/>
+      </w:rPr>
+    </w:lvl>
+    <w:lvl w:ilvl="5" w:tplc="08090005" w:tentative="1">
+      <w:start w:val="1"/>
+      <w:numFmt w:val="bullet"/>
+      <w:lvlText w:val=""/>
+      <w:lvlJc w:val="left"/>
+      <w:pPr>
+        <w:ind w:left="4320" w:hanging="360"/>
+      </w:pPr>
+      <w:rPr>
+        <w:rFonts w:ascii="Wingdings" w:hAnsi="Wingdings" w:hint="default"/>
+      </w:rPr>
+    </w:lvl>
+    <w:lvl w:ilvl="6" w:tplc="08090001" w:tentative="1">
+      <w:start w:val="1"/>
+      <w:numFmt w:val="bullet"/>
+      <w:lvlText w:val=""/>
+      <w:lvlJc w:val="left"/>
+      <w:pPr>
+        <w:ind w:left="5040" w:hanging="360"/>
+      </w:pPr>
+      <w:rPr>
+        <w:rFonts w:ascii="Symbol" w:hAnsi="Symbol" w:hint="default"/>
+      </w:rPr>
+    </w:lvl>
+    <w:lvl w:ilvl="7" w:tplc="08090003" w:tentative="1">
+      <w:start w:val="1"/>
+      <w:numFmt w:val="bullet"/>
+      <w:lvlText w:val="o"/>
+      <w:lvlJc w:val="left"/>
+      <w:pPr>
+        <w:ind w:left="5760" w:hanging="360"/>
+      </w:pPr>
+      <w:rPr>
+        <w:rFonts w:ascii="Courier New" w:hAnsi="Courier New" w:cs="Courier New" w:hint="default"/>
+      </w:rPr>
+    </w:lvl>
+    <w:lvl w:ilvl="8" w:tplc="08090005" w:tentative="1">
+      <w:start w:val="1"/>
+      <w:numFmt w:val="bullet"/>
+      <w:lvlText w:val=""/>
+      <w:lvlJc w:val="left"/>
+      <w:pPr>
+        <w:ind w:left="6480" w:hanging="360"/>
+      </w:pPr>
+      <w:rPr>
+        <w:rFonts w:ascii="Wingdings" w:hAnsi="Wingdings" w:hint="default"/>
+      </w:rPr>
+    </w:lvl>
+  </w:abstractNum>
+  <w:abstractNum w:abstractNumId="7" w15:restartNumberingAfterBreak="0">
     <w:nsid w:val="150D4D33"/>
     <w:multiLevelType w:val="hybridMultilevel"/>
     <w:tmpl w:val="BB8A1934"/>
@@ -6066,7 +6440,7 @@
       </w:rPr>
     </w:lvl>
   </w:abstractNum>
-  <w:abstractNum w:abstractNumId="7" w15:restartNumberingAfterBreak="0">
+  <w:abstractNum w:abstractNumId="8" w15:restartNumberingAfterBreak="0">
     <w:nsid w:val="25277240"/>
     <w:multiLevelType w:val="hybridMultilevel"/>
     <w:tmpl w:val="93AE265C"/>
@@ -6179,7 +6553,7 @@
       </w:rPr>
     </w:lvl>
   </w:abstractNum>
-  <w:abstractNum w:abstractNumId="8" w15:restartNumberingAfterBreak="0">
+  <w:abstractNum w:abstractNumId="9" w15:restartNumberingAfterBreak="0">
     <w:nsid w:val="37ED35F7"/>
     <w:multiLevelType w:val="hybridMultilevel"/>
     <w:tmpl w:val="FF1211A0"/>
@@ -6292,7 +6666,7 @@
       </w:rPr>
     </w:lvl>
   </w:abstractNum>
-  <w:abstractNum w:abstractNumId="9" w15:restartNumberingAfterBreak="0">
+  <w:abstractNum w:abstractNumId="10" w15:restartNumberingAfterBreak="0">
     <w:nsid w:val="3A8709D5"/>
     <w:multiLevelType w:val="hybridMultilevel"/>
     <w:tmpl w:val="C450CA68"/>
@@ -6405,7 +6779,7 @@
       </w:rPr>
     </w:lvl>
   </w:abstractNum>
-  <w:abstractNum w:abstractNumId="10" w15:restartNumberingAfterBreak="0">
+  <w:abstractNum w:abstractNumId="11" w15:restartNumberingAfterBreak="0">
     <w:nsid w:val="3EB90649"/>
     <w:multiLevelType w:val="hybridMultilevel"/>
     <w:tmpl w:val="AD02A7FE"/>
@@ -6518,7 +6892,7 @@
       </w:rPr>
     </w:lvl>
   </w:abstractNum>
-  <w:abstractNum w:abstractNumId="11" w15:restartNumberingAfterBreak="0">
+  <w:abstractNum w:abstractNumId="12" w15:restartNumberingAfterBreak="0">
     <w:nsid w:val="49F44CAD"/>
     <w:multiLevelType w:val="hybridMultilevel"/>
     <w:tmpl w:val="BFEE8710"/>
@@ -6631,7 +7005,7 @@
       </w:rPr>
     </w:lvl>
   </w:abstractNum>
-  <w:abstractNum w:abstractNumId="12" w15:restartNumberingAfterBreak="0">
+  <w:abstractNum w:abstractNumId="13" w15:restartNumberingAfterBreak="0">
     <w:nsid w:val="4E735134"/>
     <w:multiLevelType w:val="hybridMultilevel"/>
     <w:tmpl w:val="1A36E830"/>
@@ -6717,7 +7091,7 @@
       </w:pPr>
     </w:lvl>
   </w:abstractNum>
-  <w:abstractNum w:abstractNumId="13" w15:restartNumberingAfterBreak="0">
+  <w:abstractNum w:abstractNumId="14" w15:restartNumberingAfterBreak="0">
     <w:nsid w:val="58546358"/>
     <w:multiLevelType w:val="hybridMultilevel"/>
     <w:tmpl w:val="464E767E"/>
@@ -6830,7 +7204,7 @@
       </w:rPr>
     </w:lvl>
   </w:abstractNum>
-  <w:abstractNum w:abstractNumId="14" w15:restartNumberingAfterBreak="0">
+  <w:abstractNum w:abstractNumId="15" w15:restartNumberingAfterBreak="0">
     <w:nsid w:val="65386764"/>
     <w:multiLevelType w:val="hybridMultilevel"/>
     <w:tmpl w:val="6690FEBC"/>
@@ -6943,7 +7317,7 @@
       </w:rPr>
     </w:lvl>
   </w:abstractNum>
-  <w:abstractNum w:abstractNumId="15" w15:restartNumberingAfterBreak="0">
+  <w:abstractNum w:abstractNumId="16" w15:restartNumberingAfterBreak="0">
     <w:nsid w:val="68B7731D"/>
     <w:multiLevelType w:val="hybridMultilevel"/>
     <w:tmpl w:val="001CA36C"/>
@@ -7057,34 +7431,34 @@
     </w:lvl>
   </w:abstractNum>
   <w:num w:numId="1" w16cid:durableId="366880852">
-    <w:abstractNumId w:val="13"/>
+    <w:abstractNumId w:val="14"/>
   </w:num>
   <w:num w:numId="2" w16cid:durableId="147745647">
-    <w:abstractNumId w:val="11"/>
+    <w:abstractNumId w:val="12"/>
   </w:num>
   <w:num w:numId="3" w16cid:durableId="768962136">
     <w:abstractNumId w:val="1"/>
   </w:num>
   <w:num w:numId="4" w16cid:durableId="366881659">
-    <w:abstractNumId w:val="10"/>
+    <w:abstractNumId w:val="11"/>
   </w:num>
   <w:num w:numId="5" w16cid:durableId="1528248834">
-    <w:abstractNumId w:val="6"/>
+    <w:abstractNumId w:val="7"/>
   </w:num>
   <w:num w:numId="6" w16cid:durableId="946156221">
+    <w:abstractNumId w:val="9"/>
+  </w:num>
+  <w:num w:numId="7" w16cid:durableId="1336763607">
+    <w:abstractNumId w:val="15"/>
+  </w:num>
+  <w:num w:numId="8" w16cid:durableId="1805923417">
+    <w:abstractNumId w:val="16"/>
+  </w:num>
+  <w:num w:numId="9" w16cid:durableId="1774009792">
     <w:abstractNumId w:val="8"/>
   </w:num>
-  <w:num w:numId="7" w16cid:durableId="1336763607">
-    <w:abstractNumId w:val="14"/>
-  </w:num>
-  <w:num w:numId="8" w16cid:durableId="1805923417">
-    <w:abstractNumId w:val="15"/>
-  </w:num>
-  <w:num w:numId="9" w16cid:durableId="1774009792">
-    <w:abstractNumId w:val="7"/>
-  </w:num>
   <w:num w:numId="10" w16cid:durableId="706298415">
-    <w:abstractNumId w:val="9"/>
+    <w:abstractNumId w:val="10"/>
   </w:num>
   <w:num w:numId="11" w16cid:durableId="1538394912">
     <w:abstractNumId w:val="5"/>
@@ -7099,10 +7473,13 @@
     <w:abstractNumId w:val="0"/>
   </w:num>
   <w:num w:numId="15" w16cid:durableId="1185902250">
-    <w:abstractNumId w:val="12"/>
+    <w:abstractNumId w:val="13"/>
   </w:num>
   <w:num w:numId="16" w16cid:durableId="1075475990">
     <w:abstractNumId w:val="3"/>
+  </w:num>
+  <w:num w:numId="17" w16cid:durableId="1067219836">
+    <w:abstractNumId w:val="6"/>
   </w:num>
 </w:numbering>
 </file>
@@ -7712,6 +8089,7 @@
   <w:style w:type="character" w:default="1" w:styleId="DefaultParagraphFont">
     <w:name w:val="Default Paragraph Font"/>
     <w:uiPriority w:val="1"/>
+    <w:semiHidden/>
     <w:unhideWhenUsed/>
   </w:style>
   <w:style w:type="table" w:default="1" w:styleId="TableNormal">

</xml_diff>

<commit_message>
Very, very, very minor changes
</commit_message>
<xml_diff>
--- a/Disertation/Dissertation.docx
+++ b/Disertation/Dissertation.docx
@@ -78,7 +78,7 @@
       <w:r>
         <w:fldChar w:fldCharType="separate"/>
       </w:r>
-      <w:hyperlink w:anchor="_Toc202808966" w:history="1">
+      <w:hyperlink w:anchor="_Toc202813165" w:history="1">
         <w:r>
           <w:rPr>
             <w:rStyle w:val="Hyperlink"/>
@@ -105,7 +105,7 @@
             <w:noProof/>
             <w:webHidden/>
           </w:rPr>
-          <w:instrText xml:space="preserve"> PAGEREF _Toc202808966 \h </w:instrText>
+          <w:instrText xml:space="preserve"> PAGEREF _Toc202813165 \h </w:instrText>
         </w:r>
         <w:r>
           <w:rPr>
@@ -148,7 +148,7 @@
           <w:lang w:eastAsia="en-GB"/>
         </w:rPr>
       </w:pPr>
-      <w:hyperlink w:anchor="_Toc202808967" w:history="1">
+      <w:hyperlink w:anchor="_Toc202813166" w:history="1">
         <w:r>
           <w:rPr>
             <w:rStyle w:val="Hyperlink"/>
@@ -175,7 +175,7 @@
             <w:noProof/>
             <w:webHidden/>
           </w:rPr>
-          <w:instrText xml:space="preserve"> PAGEREF _Toc202808967 \h </w:instrText>
+          <w:instrText xml:space="preserve"> PAGEREF _Toc202813166 \h </w:instrText>
         </w:r>
         <w:r>
           <w:rPr>
@@ -218,7 +218,7 @@
           <w:lang w:eastAsia="en-GB"/>
         </w:rPr>
       </w:pPr>
-      <w:hyperlink w:anchor="_Toc202808968" w:history="1">
+      <w:hyperlink w:anchor="_Toc202813167" w:history="1">
         <w:r>
           <w:rPr>
             <w:rStyle w:val="Hyperlink"/>
@@ -245,7 +245,7 @@
             <w:noProof/>
             <w:webHidden/>
           </w:rPr>
-          <w:instrText xml:space="preserve"> PAGEREF _Toc202808968 \h </w:instrText>
+          <w:instrText xml:space="preserve"> PAGEREF _Toc202813167 \h </w:instrText>
         </w:r>
         <w:r>
           <w:rPr>
@@ -288,7 +288,7 @@
           <w:lang w:eastAsia="en-GB"/>
         </w:rPr>
       </w:pPr>
-      <w:hyperlink w:anchor="_Toc202808969" w:history="1">
+      <w:hyperlink w:anchor="_Toc202813168" w:history="1">
         <w:r>
           <w:rPr>
             <w:rStyle w:val="Hyperlink"/>
@@ -315,7 +315,7 @@
             <w:noProof/>
             <w:webHidden/>
           </w:rPr>
-          <w:instrText xml:space="preserve"> PAGEREF _Toc202808969 \h </w:instrText>
+          <w:instrText xml:space="preserve"> PAGEREF _Toc202813168 \h </w:instrText>
         </w:r>
         <w:r>
           <w:rPr>
@@ -358,7 +358,7 @@
           <w:lang w:eastAsia="en-GB"/>
         </w:rPr>
       </w:pPr>
-      <w:hyperlink w:anchor="_Toc202808970" w:history="1">
+      <w:hyperlink w:anchor="_Toc202813169" w:history="1">
         <w:r>
           <w:rPr>
             <w:rStyle w:val="Hyperlink"/>
@@ -385,7 +385,7 @@
             <w:noProof/>
             <w:webHidden/>
           </w:rPr>
-          <w:instrText xml:space="preserve"> PAGEREF _Toc202808970 \h </w:instrText>
+          <w:instrText xml:space="preserve"> PAGEREF _Toc202813169 \h </w:instrText>
         </w:r>
         <w:r>
           <w:rPr>
@@ -428,7 +428,7 @@
           <w:lang w:eastAsia="en-GB"/>
         </w:rPr>
       </w:pPr>
-      <w:hyperlink w:anchor="_Toc202808971" w:history="1">
+      <w:hyperlink w:anchor="_Toc202813170" w:history="1">
         <w:r>
           <w:rPr>
             <w:rStyle w:val="Hyperlink"/>
@@ -455,7 +455,7 @@
             <w:noProof/>
             <w:webHidden/>
           </w:rPr>
-          <w:instrText xml:space="preserve"> PAGEREF _Toc202808971 \h </w:instrText>
+          <w:instrText xml:space="preserve"> PAGEREF _Toc202813170 \h </w:instrText>
         </w:r>
         <w:r>
           <w:rPr>
@@ -498,7 +498,7 @@
           <w:lang w:eastAsia="en-GB"/>
         </w:rPr>
       </w:pPr>
-      <w:hyperlink w:anchor="_Toc202808972" w:history="1">
+      <w:hyperlink w:anchor="_Toc202813171" w:history="1">
         <w:r>
           <w:rPr>
             <w:rStyle w:val="Hyperlink"/>
@@ -525,7 +525,7 @@
             <w:noProof/>
             <w:webHidden/>
           </w:rPr>
-          <w:instrText xml:space="preserve"> PAGEREF _Toc202808972 \h </w:instrText>
+          <w:instrText xml:space="preserve"> PAGEREF _Toc202813171 \h </w:instrText>
         </w:r>
         <w:r>
           <w:rPr>
@@ -568,7 +568,7 @@
           <w:lang w:eastAsia="en-GB"/>
         </w:rPr>
       </w:pPr>
-      <w:hyperlink w:anchor="_Toc202808973" w:history="1">
+      <w:hyperlink w:anchor="_Toc202813172" w:history="1">
         <w:r>
           <w:rPr>
             <w:rStyle w:val="Hyperlink"/>
@@ -595,7 +595,7 @@
             <w:noProof/>
             <w:webHidden/>
           </w:rPr>
-          <w:instrText xml:space="preserve"> PAGEREF _Toc202808973 \h </w:instrText>
+          <w:instrText xml:space="preserve"> PAGEREF _Toc202813172 \h </w:instrText>
         </w:r>
         <w:r>
           <w:rPr>
@@ -638,7 +638,7 @@
           <w:lang w:eastAsia="en-GB"/>
         </w:rPr>
       </w:pPr>
-      <w:hyperlink w:anchor="_Toc202808974" w:history="1">
+      <w:hyperlink w:anchor="_Toc202813173" w:history="1">
         <w:r>
           <w:rPr>
             <w:rStyle w:val="Hyperlink"/>
@@ -665,7 +665,7 @@
             <w:noProof/>
             <w:webHidden/>
           </w:rPr>
-          <w:instrText xml:space="preserve"> PAGEREF _Toc202808974 \h </w:instrText>
+          <w:instrText xml:space="preserve"> PAGEREF _Toc202813173 \h </w:instrText>
         </w:r>
         <w:r>
           <w:rPr>
@@ -708,7 +708,7 @@
           <w:lang w:eastAsia="en-GB"/>
         </w:rPr>
       </w:pPr>
-      <w:hyperlink w:anchor="_Toc202808975" w:history="1">
+      <w:hyperlink w:anchor="_Toc202813174" w:history="1">
         <w:r>
           <w:rPr>
             <w:rStyle w:val="Hyperlink"/>
@@ -735,7 +735,7 @@
             <w:noProof/>
             <w:webHidden/>
           </w:rPr>
-          <w:instrText xml:space="preserve"> PAGEREF _Toc202808975 \h </w:instrText>
+          <w:instrText xml:space="preserve"> PAGEREF _Toc202813174 \h </w:instrText>
         </w:r>
         <w:r>
           <w:rPr>
@@ -778,7 +778,7 @@
           <w:lang w:eastAsia="en-GB"/>
         </w:rPr>
       </w:pPr>
-      <w:hyperlink w:anchor="_Toc202808976" w:history="1">
+      <w:hyperlink w:anchor="_Toc202813175" w:history="1">
         <w:r>
           <w:rPr>
             <w:rStyle w:val="Hyperlink"/>
@@ -805,7 +805,7 @@
             <w:noProof/>
             <w:webHidden/>
           </w:rPr>
-          <w:instrText xml:space="preserve"> PAGEREF _Toc202808976 \h </w:instrText>
+          <w:instrText xml:space="preserve"> PAGEREF _Toc202813175 \h </w:instrText>
         </w:r>
         <w:r>
           <w:rPr>
@@ -848,13 +848,27 @@
           <w:lang w:eastAsia="en-GB"/>
         </w:rPr>
       </w:pPr>
-      <w:hyperlink w:anchor="_Toc202808977" w:history="1">
+      <w:hyperlink w:anchor="_Toc202813176" w:history="1">
         <w:r>
           <w:rPr>
             <w:rStyle w:val="Hyperlink"/>
             <w:noProof/>
           </w:rPr>
-          <w:t>Target Website</w:t>
+          <w:t xml:space="preserve">Target </w:t>
+        </w:r>
+        <w:r>
+          <w:rPr>
+            <w:rStyle w:val="Hyperlink"/>
+            <w:noProof/>
+          </w:rPr>
+          <w:t>W</w:t>
+        </w:r>
+        <w:r>
+          <w:rPr>
+            <w:rStyle w:val="Hyperlink"/>
+            <w:noProof/>
+          </w:rPr>
+          <w:t>ebsite</w:t>
         </w:r>
         <w:r>
           <w:rPr>
@@ -875,7 +889,7 @@
             <w:noProof/>
             <w:webHidden/>
           </w:rPr>
-          <w:instrText xml:space="preserve"> PAGEREF _Toc202808977 \h </w:instrText>
+          <w:instrText xml:space="preserve"> PAGEREF _Toc202813176 \h </w:instrText>
         </w:r>
         <w:r>
           <w:rPr>
@@ -918,7 +932,7 @@
           <w:lang w:eastAsia="en-GB"/>
         </w:rPr>
       </w:pPr>
-      <w:hyperlink w:anchor="_Toc202808978" w:history="1">
+      <w:hyperlink w:anchor="_Toc202813177" w:history="1">
         <w:r>
           <w:rPr>
             <w:rStyle w:val="Hyperlink"/>
@@ -945,7 +959,7 @@
             <w:noProof/>
             <w:webHidden/>
           </w:rPr>
-          <w:instrText xml:space="preserve"> PAGEREF _Toc202808978 \h </w:instrText>
+          <w:instrText xml:space="preserve"> PAGEREF _Toc202813177 \h </w:instrText>
         </w:r>
         <w:r>
           <w:rPr>
@@ -988,7 +1002,7 @@
           <w:lang w:eastAsia="en-GB"/>
         </w:rPr>
       </w:pPr>
-      <w:hyperlink w:anchor="_Toc202808979" w:history="1">
+      <w:hyperlink w:anchor="_Toc202813178" w:history="1">
         <w:r>
           <w:rPr>
             <w:rStyle w:val="Hyperlink"/>
@@ -1015,7 +1029,7 @@
             <w:noProof/>
             <w:webHidden/>
           </w:rPr>
-          <w:instrText xml:space="preserve"> PAGEREF _Toc202808979 \h </w:instrText>
+          <w:instrText xml:space="preserve"> PAGEREF _Toc202813178 \h </w:instrText>
         </w:r>
         <w:r>
           <w:rPr>
@@ -1058,7 +1072,7 @@
           <w:lang w:eastAsia="en-GB"/>
         </w:rPr>
       </w:pPr>
-      <w:hyperlink w:anchor="_Toc202808980" w:history="1">
+      <w:hyperlink w:anchor="_Toc202813179" w:history="1">
         <w:r>
           <w:rPr>
             <w:rStyle w:val="Hyperlink"/>
@@ -1085,7 +1099,7 @@
             <w:noProof/>
             <w:webHidden/>
           </w:rPr>
-          <w:instrText xml:space="preserve"> PAGEREF _Toc202808980 \h </w:instrText>
+          <w:instrText xml:space="preserve"> PAGEREF _Toc202813179 \h </w:instrText>
         </w:r>
         <w:r>
           <w:rPr>
@@ -1128,7 +1142,7 @@
           <w:lang w:eastAsia="en-GB"/>
         </w:rPr>
       </w:pPr>
-      <w:hyperlink w:anchor="_Toc202808981" w:history="1">
+      <w:hyperlink w:anchor="_Toc202813180" w:history="1">
         <w:r>
           <w:rPr>
             <w:rStyle w:val="Hyperlink"/>
@@ -1155,7 +1169,7 @@
             <w:noProof/>
             <w:webHidden/>
           </w:rPr>
-          <w:instrText xml:space="preserve"> PAGEREF _Toc202808981 \h </w:instrText>
+          <w:instrText xml:space="preserve"> PAGEREF _Toc202813180 \h </w:instrText>
         </w:r>
         <w:r>
           <w:rPr>
@@ -1198,13 +1212,13 @@
           <w:lang w:eastAsia="en-GB"/>
         </w:rPr>
       </w:pPr>
-      <w:hyperlink w:anchor="_Toc202808982" w:history="1">
+      <w:hyperlink w:anchor="_Toc202813181" w:history="1">
         <w:r>
           <w:rPr>
             <w:rStyle w:val="Hyperlink"/>
             <w:noProof/>
           </w:rPr>
-          <w:t>Development</w:t>
+          <w:t>Development &amp; Data Analysis</w:t>
         </w:r>
         <w:r>
           <w:rPr>
@@ -1225,7 +1239,7 @@
             <w:noProof/>
             <w:webHidden/>
           </w:rPr>
-          <w:instrText xml:space="preserve"> PAGEREF _Toc202808982 \h </w:instrText>
+          <w:instrText xml:space="preserve"> PAGEREF _Toc202813181 \h </w:instrText>
         </w:r>
         <w:r>
           <w:rPr>
@@ -1268,7 +1282,7 @@
           <w:lang w:eastAsia="en-GB"/>
         </w:rPr>
       </w:pPr>
-      <w:hyperlink w:anchor="_Toc202808983" w:history="1">
+      <w:hyperlink w:anchor="_Toc202813182" w:history="1">
         <w:r>
           <w:rPr>
             <w:rStyle w:val="Hyperlink"/>
@@ -1295,7 +1309,7 @@
             <w:noProof/>
             <w:webHidden/>
           </w:rPr>
-          <w:instrText xml:space="preserve"> PAGEREF _Toc202808983 \h </w:instrText>
+          <w:instrText xml:space="preserve"> PAGEREF _Toc202813182 \h </w:instrText>
         </w:r>
         <w:r>
           <w:rPr>
@@ -1338,13 +1352,13 @@
           <w:lang w:eastAsia="en-GB"/>
         </w:rPr>
       </w:pPr>
-      <w:hyperlink w:anchor="_Toc202808984" w:history="1">
+      <w:hyperlink w:anchor="_Toc202813183" w:history="1">
         <w:r>
           <w:rPr>
             <w:rStyle w:val="Hyperlink"/>
             <w:noProof/>
           </w:rPr>
-          <w:t>MySQL Database</w:t>
+          <w:t>Data Analysis</w:t>
         </w:r>
         <w:r>
           <w:rPr>
@@ -1365,7 +1379,7 @@
             <w:noProof/>
             <w:webHidden/>
           </w:rPr>
-          <w:instrText xml:space="preserve"> PAGEREF _Toc202808984 \h </w:instrText>
+          <w:instrText xml:space="preserve"> PAGEREF _Toc202813183 \h </w:instrText>
         </w:r>
         <w:r>
           <w:rPr>
@@ -1408,12 +1422,82 @@
           <w:lang w:eastAsia="en-GB"/>
         </w:rPr>
       </w:pPr>
-      <w:hyperlink w:anchor="_Toc202808985" w:history="1">
+      <w:hyperlink w:anchor="_Toc202813184" w:history="1">
         <w:r>
           <w:rPr>
             <w:rStyle w:val="Hyperlink"/>
             <w:noProof/>
           </w:rPr>
+          <w:t>MySQL Database</w:t>
+        </w:r>
+        <w:r>
+          <w:rPr>
+            <w:noProof/>
+            <w:webHidden/>
+          </w:rPr>
+          <w:tab/>
+        </w:r>
+        <w:r>
+          <w:rPr>
+            <w:noProof/>
+            <w:webHidden/>
+          </w:rPr>
+          <w:fldChar w:fldCharType="begin"/>
+        </w:r>
+        <w:r>
+          <w:rPr>
+            <w:noProof/>
+            <w:webHidden/>
+          </w:rPr>
+          <w:instrText xml:space="preserve"> PAGEREF _Toc202813184 \h </w:instrText>
+        </w:r>
+        <w:r>
+          <w:rPr>
+            <w:noProof/>
+            <w:webHidden/>
+          </w:rPr>
+        </w:r>
+        <w:r>
+          <w:rPr>
+            <w:noProof/>
+            <w:webHidden/>
+          </w:rPr>
+          <w:fldChar w:fldCharType="separate"/>
+        </w:r>
+        <w:r>
+          <w:rPr>
+            <w:noProof/>
+            <w:webHidden/>
+          </w:rPr>
+          <w:t>24</w:t>
+        </w:r>
+        <w:r>
+          <w:rPr>
+            <w:noProof/>
+            <w:webHidden/>
+          </w:rPr>
+          <w:fldChar w:fldCharType="end"/>
+        </w:r>
+      </w:hyperlink>
+    </w:p>
+    <w:p>
+      <w:pPr>
+        <w:pStyle w:val="TOC2"/>
+        <w:tabs>
+          <w:tab w:val="right" w:leader="dot" w:pos="9016"/>
+        </w:tabs>
+        <w:rPr>
+          <w:rFonts w:asciiTheme="minorHAnsi" w:eastAsiaTheme="minorEastAsia" w:hAnsiTheme="minorHAnsi"/>
+          <w:noProof/>
+          <w:lang w:eastAsia="en-GB"/>
+        </w:rPr>
+      </w:pPr>
+      <w:hyperlink w:anchor="_Toc202813185" w:history="1">
+        <w:r>
+          <w:rPr>
+            <w:rStyle w:val="Hyperlink"/>
+            <w:noProof/>
+          </w:rPr>
           <w:t>Website</w:t>
         </w:r>
         <w:r>
@@ -1435,7 +1519,7 @@
             <w:noProof/>
             <w:webHidden/>
           </w:rPr>
-          <w:instrText xml:space="preserve"> PAGEREF _Toc202808985 \h </w:instrText>
+          <w:instrText xml:space="preserve"> PAGEREF _Toc202813185 \h </w:instrText>
         </w:r>
         <w:r>
           <w:rPr>
@@ -1455,7 +1539,7 @@
             <w:noProof/>
             <w:webHidden/>
           </w:rPr>
-          <w:t>24</w:t>
+          <w:t>25</w:t>
         </w:r>
         <w:r>
           <w:rPr>
@@ -1478,7 +1562,7 @@
           <w:lang w:eastAsia="en-GB"/>
         </w:rPr>
       </w:pPr>
-      <w:hyperlink w:anchor="_Toc202808986" w:history="1">
+      <w:hyperlink w:anchor="_Toc202813186" w:history="1">
         <w:r>
           <w:rPr>
             <w:rStyle w:val="Hyperlink"/>
@@ -1505,7 +1589,7 @@
             <w:noProof/>
             <w:webHidden/>
           </w:rPr>
-          <w:instrText xml:space="preserve"> PAGEREF _Toc202808986 \h </w:instrText>
+          <w:instrText xml:space="preserve"> PAGEREF _Toc202813186 \h </w:instrText>
         </w:r>
         <w:r>
           <w:rPr>
@@ -1525,7 +1609,7 @@
             <w:noProof/>
             <w:webHidden/>
           </w:rPr>
-          <w:t>25</w:t>
+          <w:t>26</w:t>
         </w:r>
         <w:r>
           <w:rPr>
@@ -1548,7 +1632,7 @@
           <w:lang w:eastAsia="en-GB"/>
         </w:rPr>
       </w:pPr>
-      <w:hyperlink w:anchor="_Toc202808987" w:history="1">
+      <w:hyperlink w:anchor="_Toc202813187" w:history="1">
         <w:r>
           <w:rPr>
             <w:rStyle w:val="Hyperlink"/>
@@ -1575,7 +1659,7 @@
             <w:noProof/>
             <w:webHidden/>
           </w:rPr>
-          <w:instrText xml:space="preserve"> PAGEREF _Toc202808987 \h </w:instrText>
+          <w:instrText xml:space="preserve"> PAGEREF _Toc202813187 \h </w:instrText>
         </w:r>
         <w:r>
           <w:rPr>
@@ -1595,7 +1679,7 @@
             <w:noProof/>
             <w:webHidden/>
           </w:rPr>
-          <w:t>25</w:t>
+          <w:t>26</w:t>
         </w:r>
         <w:r>
           <w:rPr>
@@ -1618,7 +1702,7 @@
           <w:lang w:eastAsia="en-GB"/>
         </w:rPr>
       </w:pPr>
-      <w:hyperlink w:anchor="_Toc202808988" w:history="1">
+      <w:hyperlink w:anchor="_Toc202813188" w:history="1">
         <w:r>
           <w:rPr>
             <w:rStyle w:val="Hyperlink"/>
@@ -1645,7 +1729,7 @@
             <w:noProof/>
             <w:webHidden/>
           </w:rPr>
-          <w:instrText xml:space="preserve"> PAGEREF _Toc202808988 \h </w:instrText>
+          <w:instrText xml:space="preserve"> PAGEREF _Toc202813188 \h </w:instrText>
         </w:r>
         <w:r>
           <w:rPr>
@@ -1665,7 +1749,7 @@
             <w:noProof/>
             <w:webHidden/>
           </w:rPr>
-          <w:t>26</w:t>
+          <w:t>27</w:t>
         </w:r>
         <w:r>
           <w:rPr>
@@ -1688,7 +1772,7 @@
           <w:lang w:eastAsia="en-GB"/>
         </w:rPr>
       </w:pPr>
-      <w:hyperlink w:anchor="_Toc202808989" w:history="1">
+      <w:hyperlink w:anchor="_Toc202813189" w:history="1">
         <w:r>
           <w:rPr>
             <w:rStyle w:val="Hyperlink"/>
@@ -1715,7 +1799,7 @@
             <w:noProof/>
             <w:webHidden/>
           </w:rPr>
-          <w:instrText xml:space="preserve"> PAGEREF _Toc202808989 \h </w:instrText>
+          <w:instrText xml:space="preserve"> PAGEREF _Toc202813189 \h </w:instrText>
         </w:r>
         <w:r>
           <w:rPr>
@@ -1735,7 +1819,7 @@
             <w:noProof/>
             <w:webHidden/>
           </w:rPr>
-          <w:t>27</w:t>
+          <w:t>28</w:t>
         </w:r>
         <w:r>
           <w:rPr>
@@ -1758,7 +1842,7 @@
           <w:lang w:eastAsia="en-GB"/>
         </w:rPr>
       </w:pPr>
-      <w:hyperlink w:anchor="_Toc202808990" w:history="1">
+      <w:hyperlink w:anchor="_Toc202813190" w:history="1">
         <w:r>
           <w:rPr>
             <w:rStyle w:val="Hyperlink"/>
@@ -1785,7 +1869,7 @@
             <w:noProof/>
             <w:webHidden/>
           </w:rPr>
-          <w:instrText xml:space="preserve"> PAGEREF _Toc202808990 \h </w:instrText>
+          <w:instrText xml:space="preserve"> PAGEREF _Toc202813190 \h </w:instrText>
         </w:r>
         <w:r>
           <w:rPr>
@@ -1805,7 +1889,7 @@
             <w:noProof/>
             <w:webHidden/>
           </w:rPr>
-          <w:t>28</w:t>
+          <w:t>29</w:t>
         </w:r>
         <w:r>
           <w:rPr>
@@ -1828,7 +1912,7 @@
           <w:lang w:eastAsia="en-GB"/>
         </w:rPr>
       </w:pPr>
-      <w:hyperlink w:anchor="_Toc202808991" w:history="1">
+      <w:hyperlink w:anchor="_Toc202813191" w:history="1">
         <w:r>
           <w:rPr>
             <w:rStyle w:val="Hyperlink"/>
@@ -1855,7 +1939,7 @@
             <w:noProof/>
             <w:webHidden/>
           </w:rPr>
-          <w:instrText xml:space="preserve"> PAGEREF _Toc202808991 \h </w:instrText>
+          <w:instrText xml:space="preserve"> PAGEREF _Toc202813191 \h </w:instrText>
         </w:r>
         <w:r>
           <w:rPr>
@@ -1875,7 +1959,7 @@
             <w:noProof/>
             <w:webHidden/>
           </w:rPr>
-          <w:t>29</w:t>
+          <w:t>30</w:t>
         </w:r>
         <w:r>
           <w:rPr>
@@ -1900,7 +1984,7 @@
       <w:pPr>
         <w:pStyle w:val="Heading1"/>
       </w:pPr>
-      <w:bookmarkStart w:id="0" w:name="_Toc202808966"/>
+      <w:bookmarkStart w:id="0" w:name="_Toc202813165"/>
       <w:r>
         <w:lastRenderedPageBreak/>
         <w:t>Introduction</w:t>
@@ -1909,19 +1993,56 @@
     </w:p>
     <w:p>
       <w:r>
-        <w:t xml:space="preserve">When searching for new video games, it can be hard for uses to find games that they might be interested in and it can be hard for businesses to </w:t>
-      </w:r>
-      <w:r>
-        <w:t>reach new users. To help with this, using publicly data from the internet, a database could be built that, with a user interface such as a web application, could help users find games they are interested in that are similar to ones they already like.</w:t>
-      </w:r>
-      <w:r>
-        <w:t xml:space="preserve"> With this in mind, this</w:t>
+        <w:t xml:space="preserve">When searching for new video games, it can be hard for uses to find games that they might be interested </w:t>
+      </w:r>
+      <w:proofErr w:type="gramStart"/>
+      <w:r>
+        <w:t>in</w:t>
+      </w:r>
+      <w:proofErr w:type="gramEnd"/>
+      <w:r>
+        <w:t xml:space="preserve"> and it can be hard for businesses to </w:t>
+      </w:r>
+      <w:r>
+        <w:t xml:space="preserve">reach new users. To help with this, using publicly data from the internet, a database could be built that, with a user interface such as a web application, could help users find games they are interested in that are </w:t>
+      </w:r>
+      <w:proofErr w:type="gramStart"/>
+      <w:r>
+        <w:t>similar to</w:t>
+      </w:r>
+      <w:proofErr w:type="gramEnd"/>
+      <w:r>
+        <w:t xml:space="preserve"> ones they already like.</w:t>
       </w:r>
       <w:r>
         <w:t xml:space="preserve"> </w:t>
       </w:r>
-      <w:r>
-        <w:t xml:space="preserve">project aims to create a web application that is able to help users find video games they may be interested in through the use of a tagging system. </w:t>
+      <w:proofErr w:type="gramStart"/>
+      <w:r>
+        <w:t>With this in mind, this</w:t>
+      </w:r>
+      <w:proofErr w:type="gramEnd"/>
+      <w:r>
+        <w:t xml:space="preserve"> </w:t>
+      </w:r>
+      <w:r>
+        <w:t xml:space="preserve">project aims to create a web application that </w:t>
+      </w:r>
+      <w:proofErr w:type="gramStart"/>
+      <w:r>
+        <w:t>is able to</w:t>
+      </w:r>
+      <w:proofErr w:type="gramEnd"/>
+      <w:r>
+        <w:t xml:space="preserve"> help users find video games they may be interested in </w:t>
+      </w:r>
+      <w:proofErr w:type="gramStart"/>
+      <w:r>
+        <w:t>through the use of</w:t>
+      </w:r>
+      <w:proofErr w:type="gramEnd"/>
+      <w:r>
+        <w:t xml:space="preserve"> a tagging system. </w:t>
       </w:r>
     </w:p>
     <w:p>
@@ -1938,7 +2059,7 @@
       <w:pPr>
         <w:pStyle w:val="Heading1"/>
       </w:pPr>
-      <w:bookmarkStart w:id="1" w:name="_Toc202808967"/>
+      <w:bookmarkStart w:id="1" w:name="_Toc202813166"/>
       <w:r>
         <w:lastRenderedPageBreak/>
         <w:t>Design and Planning</w:t>
@@ -1949,7 +2070,7 @@
       <w:pPr>
         <w:pStyle w:val="Heading2"/>
       </w:pPr>
-      <w:bookmarkStart w:id="2" w:name="_Toc202808968"/>
+      <w:bookmarkStart w:id="2" w:name="_Toc202813167"/>
       <w:r>
         <w:t>Why a Tagging Website?</w:t>
       </w:r>
@@ -2191,7 +2312,7 @@
       <w:pPr>
         <w:pStyle w:val="Heading2"/>
       </w:pPr>
-      <w:bookmarkStart w:id="3" w:name="_Toc202808969"/>
+      <w:bookmarkStart w:id="3" w:name="_Toc202813168"/>
       <w:r>
         <w:lastRenderedPageBreak/>
         <w:t>What is</w:t>
@@ -2259,7 +2380,39 @@
         <w:t xml:space="preserve"> collect any personal information from any users, data privacy will still be considered by investigating the GDPR and its UK equivalent.</w:t>
       </w:r>
       <w:r>
-        <w:t xml:space="preserve"> However, this problem is not only limited to users’ personal data, but companies’ data as well along with scrapers potentially violating a company’s terms of service (Zhao, 2017). However, Zhao (2017) argues that it is difficult to prove the data’s copyright due to “only a specific section of the data [being] legally protected”, while arguing that terms of service fall into a “gray area”. Nonetheless, all of the data scraped in this project should have its source saved and, in the website, linked to in order to show that the data is from the target website and not from another source.</w:t>
+        <w:t xml:space="preserve"> However, this problem is not only limited to users’ personal data, but companies’ data as well along with scrapers potentially violating a company’s terms of service (Zhao, 2017). However, Zhao (2017) argues that it is difficult to prove the data’s copyright due to “only a specific section of the data [being] legally protected”, while arguing that terms of service fall into a “</w:t>
+      </w:r>
+      <w:proofErr w:type="spellStart"/>
+      <w:r>
+        <w:t>gray</w:t>
+      </w:r>
+      <w:proofErr w:type="spellEnd"/>
+      <w:r>
+        <w:t xml:space="preserve"> area”. Nonetheless, </w:t>
+      </w:r>
+      <w:proofErr w:type="gramStart"/>
+      <w:r>
+        <w:t>all of</w:t>
+      </w:r>
+      <w:proofErr w:type="gramEnd"/>
+      <w:r>
+        <w:t xml:space="preserve"> the data scraped in this project should have its source saved and, </w:t>
+      </w:r>
+      <w:proofErr w:type="gramStart"/>
+      <w:r>
+        <w:t>in</w:t>
+      </w:r>
+      <w:proofErr w:type="gramEnd"/>
+      <w:r>
+        <w:t xml:space="preserve"> the website, linked to </w:t>
+      </w:r>
+      <w:proofErr w:type="gramStart"/>
+      <w:r>
+        <w:t>in order to</w:t>
+      </w:r>
+      <w:proofErr w:type="gramEnd"/>
+      <w:r>
+        <w:t xml:space="preserve"> show that the data is from the target website and not from another source.</w:t>
       </w:r>
     </w:p>
     <w:p>
@@ -2276,7 +2429,7 @@
       <w:pPr>
         <w:pStyle w:val="Heading2"/>
       </w:pPr>
-      <w:bookmarkStart w:id="4" w:name="_Toc202808970"/>
+      <w:bookmarkStart w:id="4" w:name="_Toc202813169"/>
       <w:r>
         <w:lastRenderedPageBreak/>
         <w:t>Legal and Security Issues</w:t>
@@ -2287,7 +2440,7 @@
       <w:pPr>
         <w:pStyle w:val="Heading3"/>
       </w:pPr>
-      <w:bookmarkStart w:id="5" w:name="_Toc202808971"/>
+      <w:bookmarkStart w:id="5" w:name="_Toc202813170"/>
       <w:r>
         <w:t>GDPR</w:t>
       </w:r>
@@ -2536,7 +2689,7 @@
       <w:pPr>
         <w:pStyle w:val="Heading3"/>
       </w:pPr>
-      <w:bookmarkStart w:id="6" w:name="_Toc202808972"/>
+      <w:bookmarkStart w:id="6" w:name="_Toc202813171"/>
       <w:r>
         <w:lastRenderedPageBreak/>
         <w:t>Computer Misuse Act 1990</w:t>
@@ -2584,7 +2737,15 @@
     </w:p>
     <w:p>
       <w:r>
-        <w:t>Once a person creates something, they have copyright over their creation for a number of years depending on what kind of creation it is (for example, literary, dramatic, musical or artistic works have a copyright of 70 years, while sound recordings have 50 years instead). This copyright gives the person the right to control how their work is used and allows them to object to distortions of their work due to being identified as the author</w:t>
+        <w:t xml:space="preserve">Once a person creates something, they have copyright over their creation for </w:t>
+      </w:r>
+      <w:proofErr w:type="gramStart"/>
+      <w:r>
+        <w:t>a number of</w:t>
+      </w:r>
+      <w:proofErr w:type="gramEnd"/>
+      <w:r>
+        <w:t xml:space="preserve"> years depending on what kind of creation it is (for example, literary, dramatic, musical or artistic works have a copyright of 70 years, while sound recordings have 50 years instead). This copyright gives the person the right to control how their work is used and allows them to object to distortions of their work due to being identified as the author</w:t>
       </w:r>
       <w:r>
         <w:t xml:space="preserve"> (UKCS, n.d.)</w:t>
@@ -2607,7 +2768,7 @@
       <w:pPr>
         <w:pStyle w:val="Heading3"/>
       </w:pPr>
-      <w:bookmarkStart w:id="7" w:name="_Toc202808973"/>
+      <w:bookmarkStart w:id="7" w:name="_Toc202813172"/>
       <w:r>
         <w:lastRenderedPageBreak/>
         <w:t>STRIDE</w:t>
@@ -3078,7 +3239,7 @@
           <w:szCs w:val="20"/>
         </w:rPr>
       </w:pPr>
-      <w:bookmarkStart w:id="8" w:name="_Toc202808974"/>
+      <w:bookmarkStart w:id="8" w:name="_Toc202813173"/>
       <w:r>
         <w:lastRenderedPageBreak/>
         <w:t>Ad-Hoc</w:t>
@@ -3096,7 +3257,15 @@
         <w:t xml:space="preserve"> or ethical issues. However, the main target for this program is the online video game distributor known as Steam. However, </w:t>
       </w:r>
       <w:r>
-        <w:t>when publishing a video game on Steam through the user of “Steamworks”, the author must build their video game’s store page. The only part Steam does in the creation of this store page is that they review it after submission in order to confirm that it is working and not harmful (Steamworks, n.d.). Because this information is submitted by the author themselves, this project assumes that each page contains mostly accurate information about the video games themselves.</w:t>
+        <w:t xml:space="preserve">when publishing a video game on Steam through the user of “Steamworks”, the author must build their video game’s store page. The only part Steam does in the creation of this store page is that they review it after submission </w:t>
+      </w:r>
+      <w:proofErr w:type="gramStart"/>
+      <w:r>
+        <w:t>in order to</w:t>
+      </w:r>
+      <w:proofErr w:type="gramEnd"/>
+      <w:r>
+        <w:t xml:space="preserve"> confirm that it is working and not harmful (Steamworks, n.d.). Because this information is submitted by the author themselves, this project assumes that each page contains mostly accurate information about the video games themselves.</w:t>
       </w:r>
       <w:r>
         <w:t xml:space="preserve"> Missing or erroneous information will be fixed after scraping through normalisation.</w:t>
@@ -3360,7 +3529,7 @@
           <w:noProof/>
         </w:rPr>
         <w:drawing>
-          <wp:inline distT="0" distB="0" distL="0" distR="0" wp14:anchorId="48932937" wp14:editId="59623767">
+          <wp:inline distT="0" distB="0" distL="0" distR="0" wp14:anchorId="48932937" wp14:editId="3798BB18">
             <wp:extent cx="2476500" cy="2332517"/>
             <wp:effectExtent l="38100" t="38100" r="38100" b="29845"/>
             <wp:docPr id="1674870808" name="Picture 5" descr="A screenshot of a video game&#10;&#10;AI-generated content may be incorrect."/>
@@ -3550,7 +3719,7 @@
       <w:pPr>
         <w:pStyle w:val="Heading2"/>
       </w:pPr>
-      <w:bookmarkStart w:id="9" w:name="_Toc202808975"/>
+      <w:bookmarkStart w:id="9" w:name="_Toc202813174"/>
       <w:r>
         <w:lastRenderedPageBreak/>
         <w:t>Methodology</w:t>
@@ -3619,7 +3788,15 @@
     </w:p>
     <w:p>
       <w:r>
-        <w:t>Overall, the main goal of this project is to create a website that allows for users to search for video games similar to ones they already like. To achieve this, this project will be split into the following parts which can be seen in the above diagram:</w:t>
+        <w:t xml:space="preserve">Overall, the main goal of this project is to create a website that allows for users to search for video games </w:t>
+      </w:r>
+      <w:proofErr w:type="gramStart"/>
+      <w:r>
+        <w:t>similar to</w:t>
+      </w:r>
+      <w:proofErr w:type="gramEnd"/>
+      <w:r>
+        <w:t xml:space="preserve"> ones they already like. To achieve this, this project will be split into the following parts which can be seen in the above diagram:</w:t>
       </w:r>
     </w:p>
     <w:p>
@@ -3631,7 +3808,15 @@
         </w:numPr>
       </w:pPr>
       <w:r>
-        <w:t>Scraping program: As previously described, this program will go over the target website (in this case, Steam), and collect data about various video games. This should be limited to low number of video games to avoid affecting Steam with high amounts of traffic and to avoid the possibility of running out of storage or the program taking too long.</w:t>
+        <w:t>Scraping program: As previously described, this program will go over the target website (in this case, Steam</w:t>
+      </w:r>
+      <w:proofErr w:type="gramStart"/>
+      <w:r>
+        <w:t>), and</w:t>
+      </w:r>
+      <w:proofErr w:type="gramEnd"/>
+      <w:r>
+        <w:t xml:space="preserve"> collect data about various video games. This should be limited to low number of video games to avoid affecting Steam with high amounts of traffic and to avoid the possibility of running out of storage or the program taking too long.</w:t>
       </w:r>
     </w:p>
     <w:p>
@@ -3684,7 +3869,7 @@
       <w:pPr>
         <w:pStyle w:val="Heading2"/>
       </w:pPr>
-      <w:bookmarkStart w:id="10" w:name="_Toc202808976"/>
+      <w:bookmarkStart w:id="10" w:name="_Toc202813175"/>
       <w:r>
         <w:lastRenderedPageBreak/>
         <w:t>Data Plan</w:t>
@@ -3695,7 +3880,7 @@
       <w:pPr>
         <w:pStyle w:val="Heading3"/>
       </w:pPr>
-      <w:bookmarkStart w:id="11" w:name="_Toc202808977"/>
+      <w:bookmarkStart w:id="11" w:name="_Toc202813176"/>
       <w:r>
         <w:t>Target Website</w:t>
       </w:r>
@@ -3782,7 +3967,7 @@
       <w:pPr>
         <w:pStyle w:val="Heading3"/>
       </w:pPr>
-      <w:bookmarkStart w:id="12" w:name="_Toc202808978"/>
+      <w:bookmarkStart w:id="12" w:name="_Toc202813177"/>
       <w:r>
         <w:lastRenderedPageBreak/>
         <w:t>Scraping</w:t>
@@ -3844,7 +4029,15 @@
         <w:t xml:space="preserve">in a programmatic way </w:t>
       </w:r>
       <w:r>
-        <w:t>which allows for web scraping like the requests library but i</w:t>
+        <w:t xml:space="preserve">which allows for web scraping like the </w:t>
+      </w:r>
+      <w:proofErr w:type="gramStart"/>
+      <w:r>
+        <w:t>requests</w:t>
+      </w:r>
+      <w:proofErr w:type="gramEnd"/>
+      <w:r>
+        <w:t xml:space="preserve"> library but i</w:t>
       </w:r>
       <w:r>
         <w:t>n a browser instead of just a HTML</w:t>
@@ -3885,6 +4078,7 @@
       <w:r>
         <w:t xml:space="preserve">For the scraping program itself, the target website must have a page that lists </w:t>
       </w:r>
+      <w:proofErr w:type="gramStart"/>
       <w:r>
         <w:rPr>
           <w:i/>
@@ -3893,7 +4087,11 @@
         <w:t>all</w:t>
       </w:r>
       <w:r>
-        <w:t xml:space="preserve"> of its games. Using this page, the following should be done for each game in the list:</w:t>
+        <w:t xml:space="preserve"> of</w:t>
+      </w:r>
+      <w:proofErr w:type="gramEnd"/>
+      <w:r>
+        <w:t xml:space="preserve"> its games. Using this page, the following should be done for each game in the list:</w:t>
       </w:r>
     </w:p>
     <w:p>
@@ -3976,7 +4174,15 @@
         <w:t>o</w:t>
       </w:r>
       <w:r>
-        <w:t>t inherently useful, but this will still be scraped nonetheless to be used in the website as the game’s description.</w:t>
+        <w:t xml:space="preserve">t inherently useful, but this will still be scraped nonetheless to be used </w:t>
+      </w:r>
+      <w:proofErr w:type="gramStart"/>
+      <w:r>
+        <w:t>in</w:t>
+      </w:r>
+      <w:proofErr w:type="gramEnd"/>
+      <w:r>
+        <w:t xml:space="preserve"> the website as the game’s description.</w:t>
       </w:r>
     </w:p>
     <w:p>
@@ -4049,7 +4255,15 @@
         </w:numPr>
       </w:pPr>
       <w:r>
-        <w:t>The user defined tags which were mentioned previously. This will mostly be useful in the website but will still be used in data analysis.</w:t>
+        <w:t xml:space="preserve">The user defined tags which were mentioned previously. This will mostly be useful </w:t>
+      </w:r>
+      <w:proofErr w:type="gramStart"/>
+      <w:r>
+        <w:t>in</w:t>
+      </w:r>
+      <w:proofErr w:type="gramEnd"/>
+      <w:r>
+        <w:t xml:space="preserve"> the website but will still be used in data analysis.</w:t>
       </w:r>
     </w:p>
     <w:p>
@@ -4085,9 +4299,11 @@
       <w:r>
         <w:t>The game’s “features”. The section that contains these “features” does not have a heading or any text to title it, but the HTML calls it “</w:t>
       </w:r>
+      <w:proofErr w:type="spellStart"/>
       <w:r>
         <w:t>game_area_features_list_ctn</w:t>
       </w:r>
+      <w:proofErr w:type="spellEnd"/>
       <w:r>
         <w:t>”. This will be used in data analysis, but when used on the website, it will most likely be mixed with the user defined tags as they are both quite similar.</w:t>
       </w:r>
@@ -4104,7 +4320,15 @@
         <w:t xml:space="preserve">The game’s supported languages. This is laid out on each game’s page as a table which describes which parts of the game support which language (E.G: A game’s interface might support English, but it might not have English audio). </w:t>
       </w:r>
       <w:r>
-        <w:t>This will not be used in data analysis, but will be used on the website to show which game’s support which languages.</w:t>
+        <w:t xml:space="preserve">This will not be used in data </w:t>
+      </w:r>
+      <w:proofErr w:type="gramStart"/>
+      <w:r>
+        <w:t>analysis, but</w:t>
+      </w:r>
+      <w:proofErr w:type="gramEnd"/>
+      <w:r>
+        <w:t xml:space="preserve"> will be used on the website to show which game’s support which languages.</w:t>
       </w:r>
     </w:p>
     <w:p>
@@ -4116,7 +4340,15 @@
         </w:numPr>
       </w:pPr>
       <w:r>
-        <w:t>The game’s genres. This is very similar to user tags, but is more general. This will be used in data analysis and on the website.</w:t>
+        <w:t xml:space="preserve">The game’s genres. This is very similar to user </w:t>
+      </w:r>
+      <w:proofErr w:type="gramStart"/>
+      <w:r>
+        <w:t>tags, but</w:t>
+      </w:r>
+      <w:proofErr w:type="gramEnd"/>
+      <w:r>
+        <w:t xml:space="preserve"> is more general. This will be used in data analysis and on the website.</w:t>
       </w:r>
     </w:p>
     <w:p>
@@ -4128,7 +4360,7 @@
       <w:pPr>
         <w:pStyle w:val="Heading3"/>
       </w:pPr>
-      <w:bookmarkStart w:id="13" w:name="_Toc202808979"/>
+      <w:bookmarkStart w:id="13" w:name="_Toc202813178"/>
       <w:r>
         <w:lastRenderedPageBreak/>
         <w:t>Saving Format (.CSV)</w:t>
@@ -4171,7 +4403,7 @@
       <w:pPr>
         <w:pStyle w:val="Heading3"/>
       </w:pPr>
-      <w:bookmarkStart w:id="14" w:name="_Toc202808980"/>
+      <w:bookmarkStart w:id="14" w:name="_Toc202813179"/>
       <w:r>
         <w:lastRenderedPageBreak/>
         <w:t>Database (MySQL)</w:t>
@@ -4194,7 +4426,15 @@
         <w:t xml:space="preserve">. </w:t>
       </w:r>
       <w:r>
-        <w:t>This library allows Python to communicate with a MySQL database through an API which allows for the database to be connected to and, through the use of a cursor, allows for the execution of SQL commands on the database</w:t>
+        <w:t xml:space="preserve">This library allows Python to communicate with a MySQL database through an API which allows for the database to be connected to and, </w:t>
+      </w:r>
+      <w:proofErr w:type="gramStart"/>
+      <w:r>
+        <w:t>through the use of</w:t>
+      </w:r>
+      <w:proofErr w:type="gramEnd"/>
+      <w:r>
+        <w:t xml:space="preserve"> a cursor, allows for the execution of SQL commands on the database</w:t>
       </w:r>
       <w:r>
         <w:t xml:space="preserve"> (Pypi, n.d. -e)</w:t>
@@ -4273,7 +4513,15 @@
     </w:p>
     <w:p>
       <w:r>
-        <w:t xml:space="preserve">Above is a plan for the database. In it, the green boxes are regular tables that define different bits of data. The purple boxes, however, are link tables which describe how the data in two or more tables are linked. At the most basic level, the link tables hold the ids of the columns that are linked. For example, a user in the user table linked to their review in the review table will have a column in the link_user_review table that holds the user’s ID and their review’s ID. </w:t>
+        <w:t xml:space="preserve">Above is a plan for the database. In it, the green boxes are regular tables that define different bits of data. The purple boxes, however, are link tables which describe how the data in two or more tables are linked. At the most basic level, the link tables hold the ids of the columns that are linked. For example, a user in the user table linked to their review in the review table will have a column in the </w:t>
+      </w:r>
+      <w:proofErr w:type="spellStart"/>
+      <w:r>
+        <w:t>link_user_review</w:t>
+      </w:r>
+      <w:proofErr w:type="spellEnd"/>
+      <w:r>
+        <w:t xml:space="preserve"> table that holds the user’s ID and their review’s ID. </w:t>
       </w:r>
     </w:p>
     <w:p>
@@ -4358,7 +4606,7 @@
       <w:pPr>
         <w:pStyle w:val="Heading1"/>
       </w:pPr>
-      <w:bookmarkStart w:id="15" w:name="_Toc202808981"/>
+      <w:bookmarkStart w:id="15" w:name="_Toc202813180"/>
       <w:r>
         <w:lastRenderedPageBreak/>
         <w:t>Scraping Practice</w:t>
@@ -4367,12 +4615,68 @@
     </w:p>
     <w:p>
       <w:r>
-        <w:t>Before writing the actual scraping program, two practice scraping programs were made. One with the requests and Beautifulsoup libraries and the other with the selenium library. Primarily, this was to learn how all of those libraries work and how best to write them, but it also helped to show which was faster. For both practice programs, the special “All Pages” wiki page on Wikipedia was used. This page lists all of the wikis on the website as links. Due to this, both practice programs went through this wiki and then to each link and collected the data from each wiki page.</w:t>
-      </w:r>
-    </w:p>
-    <w:p>
-      <w:r>
-        <w:t>The page that lists all of the wikis is split into multiple pages, and on each page is a link to a single wiki page. Due to this, both programs get the HTML and search for a divider element with the class of “mw-allpages-nav” which holds all of the links. From there, all of the links are looped through and both programs visit the pages they hold. Once on each page, three elements are found, with those being:</w:t>
+        <w:t xml:space="preserve">Before writing the actual scraping program, two practice scraping programs were made. One with the requests and Beautifulsoup libraries and the other with the selenium library. Primarily, this was to learn how </w:t>
+      </w:r>
+      <w:proofErr w:type="gramStart"/>
+      <w:r>
+        <w:t>all of</w:t>
+      </w:r>
+      <w:proofErr w:type="gramEnd"/>
+      <w:r>
+        <w:t xml:space="preserve"> those libraries work and how best to write them, but it also helped to show which was faster. For both practice programs, the special “All Pages” wiki page on Wikipedia was used. This page lists </w:t>
+      </w:r>
+      <w:proofErr w:type="gramStart"/>
+      <w:r>
+        <w:t>all of</w:t>
+      </w:r>
+      <w:proofErr w:type="gramEnd"/>
+      <w:r>
+        <w:t xml:space="preserve"> the wikis on the website as links. Due to this, both practice programs went through this wiki and then to each link and collected the data from each wiki page.</w:t>
+      </w:r>
+    </w:p>
+    <w:p>
+      <w:r>
+        <w:t xml:space="preserve">The page that lists </w:t>
+      </w:r>
+      <w:proofErr w:type="gramStart"/>
+      <w:r>
+        <w:t>all of</w:t>
+      </w:r>
+      <w:proofErr w:type="gramEnd"/>
+      <w:r>
+        <w:t xml:space="preserve"> the wikis is split into multiple pages, and on each page is a link to a single wiki page. Due to this, both programs get the HTML and search for a divider element with the class of “mw-</w:t>
+      </w:r>
+      <w:proofErr w:type="spellStart"/>
+      <w:r>
+        <w:t>allpages</w:t>
+      </w:r>
+      <w:proofErr w:type="spellEnd"/>
+      <w:r>
+        <w:t xml:space="preserve">-nav” which holds </w:t>
+      </w:r>
+      <w:proofErr w:type="gramStart"/>
+      <w:r>
+        <w:t>all of</w:t>
+      </w:r>
+      <w:proofErr w:type="gramEnd"/>
+      <w:r>
+        <w:t xml:space="preserve"> the links. From there, </w:t>
+      </w:r>
+      <w:proofErr w:type="gramStart"/>
+      <w:r>
+        <w:t>all of</w:t>
+      </w:r>
+      <w:proofErr w:type="gramEnd"/>
+      <w:r>
+        <w:t xml:space="preserve"> the links are looped </w:t>
+      </w:r>
+      <w:proofErr w:type="gramStart"/>
+      <w:r>
+        <w:t>through</w:t>
+      </w:r>
+      <w:proofErr w:type="gramEnd"/>
+      <w:r>
+        <w:t xml:space="preserve"> and both programs visit the pages they hold. Once on each page, three elements are found, with those being:</w:t>
       </w:r>
     </w:p>
     <w:p>
@@ -4384,7 +4688,15 @@
         </w:numPr>
       </w:pPr>
       <w:r>
-        <w:t>The title. This is sometimes a span element with the class of “mw-page-title-main” and other times it is instead a “h1” element with the id of “firstHeading”.</w:t>
+        <w:t>The title. This is sometimes a span element with the class of “mw-page-title-main” and other times it is instead a “h1” element with the id of “</w:t>
+      </w:r>
+      <w:proofErr w:type="spellStart"/>
+      <w:r>
+        <w:t>firstHeading</w:t>
+      </w:r>
+      <w:proofErr w:type="spellEnd"/>
+      <w:r>
+        <w:t>”.</w:t>
       </w:r>
     </w:p>
     <w:p>
@@ -4422,10 +4734,42 @@
     </w:p>
     <w:p>
       <w:r>
-        <w:t xml:space="preserve">Along with these elements, the page’s URL is also saved and after looping through all of the pages, both programs return to the all wikis page and search for a link that contains the text “Next page” and go to the next all wikis page. </w:t>
-      </w:r>
-      <w:r>
-        <w:t>After doing this for a certain amount of pages specified at the start of the code, both programs save the list containing each page’s elements to a CSV file</w:t>
+        <w:t xml:space="preserve">Along with these elements, the page’s URL is also saved and after looping through </w:t>
+      </w:r>
+      <w:proofErr w:type="gramStart"/>
+      <w:r>
+        <w:t>all of</w:t>
+      </w:r>
+      <w:proofErr w:type="gramEnd"/>
+      <w:r>
+        <w:t xml:space="preserve"> the pages, both programs return to </w:t>
+      </w:r>
+      <w:proofErr w:type="gramStart"/>
+      <w:r>
+        <w:t>the all</w:t>
+      </w:r>
+      <w:proofErr w:type="gramEnd"/>
+      <w:r>
+        <w:t xml:space="preserve"> wikis page and search for a link that contains the text “Next page” and go to the next all wikis </w:t>
+      </w:r>
+      <w:proofErr w:type="gramStart"/>
+      <w:r>
+        <w:t>page</w:t>
+      </w:r>
+      <w:proofErr w:type="gramEnd"/>
+      <w:r>
+        <w:t xml:space="preserve">. </w:t>
+      </w:r>
+      <w:r>
+        <w:t xml:space="preserve">After doing this for a certain </w:t>
+      </w:r>
+      <w:proofErr w:type="gramStart"/>
+      <w:r>
+        <w:t>amount</w:t>
+      </w:r>
+      <w:proofErr w:type="gramEnd"/>
+      <w:r>
+        <w:t xml:space="preserve"> of pages specified at the start of the code, both programs save the list containing each page’s elements to a CSV file</w:t>
       </w:r>
       <w:r>
         <w:t xml:space="preserve"> using the CSV library.</w:t>
@@ -4510,7 +4854,15 @@
         <w:t>elements could be found with the “find all” method (after initialising beautiful soup on a request’s HTML) which returns all instances of the element requested</w:t>
       </w:r>
       <w:r>
-        <w:t xml:space="preserve"> (of which elements with specific classes or ids can be requested with the attrs attribute)</w:t>
+        <w:t xml:space="preserve"> (of which elements with specific classes or ids can be requested with the </w:t>
+      </w:r>
+      <w:proofErr w:type="spellStart"/>
+      <w:r>
+        <w:t>attrs</w:t>
+      </w:r>
+      <w:proofErr w:type="spellEnd"/>
+      <w:r>
+        <w:t xml:space="preserve"> attribute)</w:t>
       </w:r>
       <w:r>
         <w:t xml:space="preserve"> which can then be looped through to handle child elements</w:t>
@@ -4531,7 +4883,7 @@
           <w:noProof/>
         </w:rPr>
         <w:drawing>
-          <wp:inline distT="0" distB="0" distL="0" distR="0" wp14:anchorId="40ABE2E5" wp14:editId="44AA6E9C">
+          <wp:inline distT="0" distB="0" distL="0" distR="0" wp14:anchorId="40ABE2E5" wp14:editId="7B09874E">
             <wp:extent cx="4162425" cy="1246650"/>
             <wp:effectExtent l="38100" t="38100" r="28575" b="29845"/>
             <wp:docPr id="1701288164" name="Picture 2" descr="A computer screen with text on it&#10;&#10;AI-generated content may be incorrect."/>
@@ -4584,7 +4936,15 @@
     </w:p>
     <w:p>
       <w:r>
-        <w:t>However, from experimentation, Beautiful Soup does not allow for further searches on elements returned from a search. This lead to the multiple nested for loops shown above which were simply trying to find the contents elements of each page. Allowing for another search would have made this egregious looping unneeded.</w:t>
+        <w:t xml:space="preserve">However, from experimentation, Beautiful Soup does not allow for further searches on elements returned from a search. This </w:t>
+      </w:r>
+      <w:proofErr w:type="gramStart"/>
+      <w:r>
+        <w:t>lead</w:t>
+      </w:r>
+      <w:proofErr w:type="gramEnd"/>
+      <w:r>
+        <w:t xml:space="preserve"> to the multiple nested for loops shown above which were simply trying to find the contents elements of each page. Allowing for another search would have made this egregious looping unneeded.</w:t>
       </w:r>
     </w:p>
     <w:p>
@@ -4660,7 +5020,15 @@
     </w:p>
     <w:p>
       <w:r>
-        <w:t>For the selenium program (using the Firefox web browser), the code is quite similar to beautiful soup. Selenium allows for the search of elements through different tag attributes rather than searching for a specific element like in beautiful soup</w:t>
+        <w:t xml:space="preserve">For the selenium program (using the Firefox web browser), the code is quite </w:t>
+      </w:r>
+      <w:proofErr w:type="gramStart"/>
+      <w:r>
+        <w:t>similar to</w:t>
+      </w:r>
+      <w:proofErr w:type="gramEnd"/>
+      <w:r>
+        <w:t xml:space="preserve"> beautiful soup. Selenium allows for the search of elements through different tag attributes rather than searching for a specific element like in beautiful soup</w:t>
       </w:r>
       <w:r>
         <w:t xml:space="preserve"> (Selenium)</w:t>
@@ -4680,7 +5048,15 @@
         <w:t xml:space="preserve">However, while this makes Selenium a good option for scraping, there is one major issue with its use. It takes a lot longer to scrape than the requests library. </w:t>
       </w:r>
       <w:r>
-        <w:t xml:space="preserve">Using the time library, both programs were timed on how long it took them to scrape the links from five pages of the all pages wiki. </w:t>
+        <w:t xml:space="preserve">Using the time library, both programs were timed on how long it took them to scrape the links from five pages of </w:t>
+      </w:r>
+      <w:proofErr w:type="gramStart"/>
+      <w:r>
+        <w:t>the all</w:t>
+      </w:r>
+      <w:proofErr w:type="gramEnd"/>
+      <w:r>
+        <w:t xml:space="preserve"> pages wiki. </w:t>
       </w:r>
       <w:r>
         <w:t xml:space="preserve">The Beautiful Soup program took 220 seconds (about 3 minutes), while the Selenium program took 1606 seconds (about 26 minutes). </w:t>
@@ -4705,21 +5081,21 @@
       <w:pPr>
         <w:pStyle w:val="Heading1"/>
       </w:pPr>
-      <w:bookmarkStart w:id="16" w:name="_Toc202808982"/>
+      <w:bookmarkStart w:id="16" w:name="_Toc202813181"/>
       <w:r>
         <w:lastRenderedPageBreak/>
         <w:t>Development</w:t>
       </w:r>
+      <w:r>
+        <w:t xml:space="preserve"> &amp; Data Analysis</w:t>
+      </w:r>
       <w:bookmarkEnd w:id="16"/>
-      <w:r>
-        <w:t xml:space="preserve"> &amp; Data Analysis</w:t>
-      </w:r>
     </w:p>
     <w:p>
       <w:pPr>
         <w:pStyle w:val="Heading2"/>
       </w:pPr>
-      <w:bookmarkStart w:id="17" w:name="_Toc202808983"/>
+      <w:bookmarkStart w:id="17" w:name="_Toc202813182"/>
       <w:r>
         <w:t>Scraping Program</w:t>
       </w:r>
@@ -4735,10 +5111,12 @@
       <w:pPr>
         <w:pStyle w:val="Heading2"/>
       </w:pPr>
+      <w:bookmarkStart w:id="18" w:name="_Toc202813183"/>
       <w:r>
         <w:lastRenderedPageBreak/>
         <w:t>Data Analysis</w:t>
       </w:r>
+      <w:bookmarkEnd w:id="18"/>
     </w:p>
     <w:p>
       <w:r>
@@ -4749,12 +5127,12 @@
       <w:pPr>
         <w:pStyle w:val="Heading2"/>
       </w:pPr>
-      <w:bookmarkStart w:id="18" w:name="_Toc202808984"/>
+      <w:bookmarkStart w:id="19" w:name="_Toc202813184"/>
       <w:r>
         <w:lastRenderedPageBreak/>
         <w:t>MySQL Database</w:t>
       </w:r>
-      <w:bookmarkEnd w:id="18"/>
+      <w:bookmarkEnd w:id="19"/>
     </w:p>
     <w:p/>
     <w:p>
@@ -4766,12 +5144,12 @@
       <w:pPr>
         <w:pStyle w:val="Heading2"/>
       </w:pPr>
-      <w:bookmarkStart w:id="19" w:name="_Toc202808985"/>
+      <w:bookmarkStart w:id="20" w:name="_Toc202813185"/>
       <w:r>
         <w:lastRenderedPageBreak/>
         <w:t>Website</w:t>
       </w:r>
-      <w:bookmarkEnd w:id="19"/>
+      <w:bookmarkEnd w:id="20"/>
     </w:p>
     <w:p/>
     <w:p>
@@ -4783,22 +5161,22 @@
       <w:pPr>
         <w:pStyle w:val="Heading1"/>
       </w:pPr>
-      <w:bookmarkStart w:id="20" w:name="_Toc202808986"/>
+      <w:bookmarkStart w:id="21" w:name="_Toc202813186"/>
       <w:r>
         <w:lastRenderedPageBreak/>
         <w:t>Results/Findings</w:t>
       </w:r>
-      <w:bookmarkEnd w:id="20"/>
+      <w:bookmarkEnd w:id="21"/>
     </w:p>
     <w:p>
       <w:pPr>
         <w:pStyle w:val="Heading2"/>
       </w:pPr>
-      <w:bookmarkStart w:id="21" w:name="_Toc202808987"/>
+      <w:bookmarkStart w:id="22" w:name="_Toc202813187"/>
       <w:r>
         <w:t>Scraping Program</w:t>
       </w:r>
-      <w:bookmarkEnd w:id="21"/>
+      <w:bookmarkEnd w:id="22"/>
     </w:p>
     <w:p/>
     <w:p>
@@ -4810,12 +5188,12 @@
       <w:pPr>
         <w:pStyle w:val="Heading2"/>
       </w:pPr>
-      <w:bookmarkStart w:id="22" w:name="_Toc202808988"/>
+      <w:bookmarkStart w:id="23" w:name="_Toc202813188"/>
       <w:r>
         <w:lastRenderedPageBreak/>
         <w:t>MySQL Database</w:t>
       </w:r>
-      <w:bookmarkEnd w:id="22"/>
+      <w:bookmarkEnd w:id="23"/>
     </w:p>
     <w:p/>
     <w:p>
@@ -4827,12 +5205,12 @@
       <w:pPr>
         <w:pStyle w:val="Heading2"/>
       </w:pPr>
-      <w:bookmarkStart w:id="23" w:name="_Toc202808989"/>
+      <w:bookmarkStart w:id="24" w:name="_Toc202813189"/>
       <w:r>
         <w:lastRenderedPageBreak/>
         <w:t>Website</w:t>
       </w:r>
-      <w:bookmarkEnd w:id="23"/>
+      <w:bookmarkEnd w:id="24"/>
     </w:p>
     <w:p/>
     <w:p>
@@ -4844,12 +5222,12 @@
       <w:pPr>
         <w:pStyle w:val="Heading1"/>
       </w:pPr>
-      <w:bookmarkStart w:id="24" w:name="_Toc202808990"/>
+      <w:bookmarkStart w:id="25" w:name="_Toc202813190"/>
       <w:r>
         <w:lastRenderedPageBreak/>
         <w:t>Conclusion</w:t>
       </w:r>
-      <w:bookmarkEnd w:id="24"/>
+      <w:bookmarkEnd w:id="25"/>
     </w:p>
     <w:p/>
     <w:p>
@@ -4861,12 +5239,12 @@
       <w:pPr>
         <w:pStyle w:val="Heading1"/>
       </w:pPr>
-      <w:bookmarkStart w:id="25" w:name="_Toc202808991"/>
+      <w:bookmarkStart w:id="26" w:name="_Toc202813191"/>
       <w:r>
         <w:lastRenderedPageBreak/>
         <w:t>References</w:t>
       </w:r>
-      <w:bookmarkEnd w:id="25"/>
+      <w:bookmarkEnd w:id="26"/>
     </w:p>
     <w:p>
       <w:pPr>
@@ -4912,7 +5290,15 @@
         <w:t>, Jun</w:t>
       </w:r>
       <w:r>
-        <w:t xml:space="preserve">). Overwhelmed by Choices. American Journal of Neuroradiology : AJNR, 34(6), 1111–1112. </w:t>
+        <w:t xml:space="preserve">). Overwhelmed by Choices. American Journal of </w:t>
+      </w:r>
+      <w:proofErr w:type="gramStart"/>
+      <w:r>
+        <w:t>Neuroradiology :</w:t>
+      </w:r>
+      <w:proofErr w:type="gramEnd"/>
+      <w:r>
+        <w:t xml:space="preserve"> AJNR, 34(6), 1111–1112. </w:t>
       </w:r>
       <w:hyperlink r:id="rId21" w:history="1">
         <w:r>
@@ -4935,7 +5321,31 @@
         </w:numPr>
       </w:pPr>
       <w:r>
-        <w:t>Conklin, L., Drake, V., Strittmatter, Sven., Braiterman, Z., &amp; Shostack, A. (n.d.). Threat Modeling Process</w:t>
+        <w:t xml:space="preserve">Conklin, L., Drake, V., Strittmatter, Sven., </w:t>
+      </w:r>
+      <w:proofErr w:type="spellStart"/>
+      <w:r>
+        <w:t>Braiterman</w:t>
+      </w:r>
+      <w:proofErr w:type="spellEnd"/>
+      <w:r>
+        <w:t xml:space="preserve">, Z., &amp; </w:t>
+      </w:r>
+      <w:proofErr w:type="spellStart"/>
+      <w:r>
+        <w:t>Shostack</w:t>
+      </w:r>
+      <w:proofErr w:type="spellEnd"/>
+      <w:r>
+        <w:t xml:space="preserve">, A. (n.d.). Threat </w:t>
+      </w:r>
+      <w:proofErr w:type="spellStart"/>
+      <w:r>
+        <w:t>Modeling</w:t>
+      </w:r>
+      <w:proofErr w:type="spellEnd"/>
+      <w:r>
+        <w:t xml:space="preserve"> Process</w:t>
       </w:r>
       <w:r>
         <w:t xml:space="preserve">. OWASP. </w:t>
@@ -5333,7 +5743,15 @@
         </w:numPr>
       </w:pPr>
       <w:r>
-        <w:t xml:space="preserve">Pypi. (n.d. -e). mysql-connector-python 9.3.0. Pypi. </w:t>
+        <w:t xml:space="preserve">Pypi. (n.d. -e). </w:t>
+      </w:r>
+      <w:proofErr w:type="spellStart"/>
+      <w:r>
+        <w:t>mysql</w:t>
+      </w:r>
+      <w:proofErr w:type="spellEnd"/>
+      <w:r>
+        <w:t xml:space="preserve">-connector-python 9.3.0. Pypi. </w:t>
       </w:r>
       <w:hyperlink r:id="rId38" w:history="1">
         <w:r>
@@ -5357,7 +5775,15 @@
       </w:pPr>
       <w:r>
         <w:lastRenderedPageBreak/>
-        <w:t xml:space="preserve">Raneri, P., Montag, C., Rozgonjuk, D., Satel, J., &amp; Pontes, H. (2022, June). The role of microtransactions in Internet Gaming Disorder and Gambling Disorder: A preregistered systematic review. Addictive Behaviors Reports. 15, 100415. </w:t>
+        <w:t xml:space="preserve">Raneri, P., Montag, C., Rozgonjuk, D., Satel, J., &amp; Pontes, H. (2022, June). The role of microtransactions in Internet Gaming Disorder and Gambling Disorder: A preregistered systematic review. Addictive </w:t>
+      </w:r>
+      <w:proofErr w:type="spellStart"/>
+      <w:r>
+        <w:t>Behaviors</w:t>
+      </w:r>
+      <w:proofErr w:type="spellEnd"/>
+      <w:r>
+        <w:t xml:space="preserve"> Reports. 15, 100415. </w:t>
       </w:r>
       <w:hyperlink r:id="rId39" w:history="1">
         <w:r>
@@ -5435,7 +5861,15 @@
         <w:t>st</w:t>
       </w:r>
       <w:r>
-        <w:t xml:space="preserve"> Edition). Packt Publishing.</w:t>
+        <w:t xml:space="preserve"> Edition). </w:t>
+      </w:r>
+      <w:proofErr w:type="spellStart"/>
+      <w:r>
+        <w:t>Packt</w:t>
+      </w:r>
+      <w:proofErr w:type="spellEnd"/>
+      <w:r>
+        <w:t xml:space="preserve"> Publishing.</w:t>
       </w:r>
     </w:p>
     <w:p>
@@ -5470,7 +5904,15 @@
         </w:numPr>
       </w:pPr>
       <w:r>
-        <w:t xml:space="preserve">Steamworks. (n.d.). Steam Direct (Joining The Steamworks Distribution Program). Steam. </w:t>
+        <w:t xml:space="preserve">Steamworks. (n.d.). Steam Direct (Joining </w:t>
+      </w:r>
+      <w:proofErr w:type="gramStart"/>
+      <w:r>
+        <w:t>The</w:t>
+      </w:r>
+      <w:proofErr w:type="gramEnd"/>
+      <w:r>
+        <w:t xml:space="preserve"> Steamworks Distribution Program). Steam. </w:t>
       </w:r>
       <w:hyperlink r:id="rId43" w:history="1">
         <w:r>
@@ -5559,8 +6001,13 @@
       <w:r>
         <w:t xml:space="preserve">Zhao, B. (2017). Web Scraping. </w:t>
       </w:r>
-      <w:r>
-        <w:t xml:space="preserve">Encyclopedia </w:t>
+      <w:proofErr w:type="spellStart"/>
+      <w:r>
+        <w:t>Encyclopedia</w:t>
+      </w:r>
+      <w:proofErr w:type="spellEnd"/>
+      <w:r>
+        <w:t xml:space="preserve"> </w:t>
       </w:r>
       <w:r>
         <w:t xml:space="preserve">of Big Data. </w:t>

</xml_diff>

<commit_message>
Minor changes to report
</commit_message>
<xml_diff>
--- a/Disertation/Dissertation.docx
+++ b/Disertation/Dissertation.docx
@@ -23,6 +23,53 @@
           <w:bCs/>
         </w:rPr>
         <w:t xml:space="preserve"> Data</w:t>
+      </w:r>
+    </w:p>
+    <w:p>
+      <w:pPr>
+        <w:jc w:val="center"/>
+        <w:rPr>
+          <w:sz w:val="40"/>
+          <w:szCs w:val="40"/>
+        </w:rPr>
+      </w:pPr>
+      <w:r>
+        <w:rPr>
+          <w:sz w:val="40"/>
+          <w:szCs w:val="40"/>
+        </w:rPr>
+        <w:t>By Harry Martin</w:t>
+      </w:r>
+    </w:p>
+    <w:p>
+      <w:pPr>
+        <w:jc w:val="center"/>
+        <w:rPr>
+          <w:sz w:val="40"/>
+          <w:szCs w:val="40"/>
+        </w:rPr>
+      </w:pPr>
+      <w:r>
+        <w:rPr>
+          <w:sz w:val="40"/>
+          <w:szCs w:val="40"/>
+        </w:rPr>
+        <w:t>22</w:t>
+      </w:r>
+      <w:r>
+        <w:rPr>
+          <w:sz w:val="40"/>
+          <w:szCs w:val="40"/>
+          <w:vertAlign w:val="superscript"/>
+        </w:rPr>
+        <w:t>nd</w:t>
+      </w:r>
+      <w:r>
+        <w:rPr>
+          <w:sz w:val="40"/>
+          <w:szCs w:val="40"/>
+        </w:rPr>
+        <w:t xml:space="preserve"> of August 2025</w:t>
       </w:r>
     </w:p>
     <w:p>
@@ -78,7 +125,7 @@
       <w:r>
         <w:fldChar w:fldCharType="separate"/>
       </w:r>
-      <w:hyperlink w:anchor="_Toc202813165" w:history="1">
+      <w:hyperlink w:anchor="_Toc202873446" w:history="1">
         <w:r>
           <w:rPr>
             <w:rStyle w:val="Hyperlink"/>
@@ -105,7 +152,7 @@
             <w:noProof/>
             <w:webHidden/>
           </w:rPr>
-          <w:instrText xml:space="preserve"> PAGEREF _Toc202813165 \h </w:instrText>
+          <w:instrText xml:space="preserve"> PAGEREF _Toc202873446 \h </w:instrText>
         </w:r>
         <w:r>
           <w:rPr>
@@ -148,13 +195,13 @@
           <w:lang w:eastAsia="en-GB"/>
         </w:rPr>
       </w:pPr>
-      <w:hyperlink w:anchor="_Toc202813166" w:history="1">
+      <w:hyperlink w:anchor="_Toc202873447" w:history="1">
         <w:r>
           <w:rPr>
             <w:rStyle w:val="Hyperlink"/>
             <w:noProof/>
           </w:rPr>
-          <w:t>Design and Planning</w:t>
+          <w:t>Literature Review</w:t>
         </w:r>
         <w:r>
           <w:rPr>
@@ -175,7 +222,7 @@
             <w:noProof/>
             <w:webHidden/>
           </w:rPr>
-          <w:instrText xml:space="preserve"> PAGEREF _Toc202813166 \h </w:instrText>
+          <w:instrText xml:space="preserve"> PAGEREF _Toc202873447 \h </w:instrText>
         </w:r>
         <w:r>
           <w:rPr>
@@ -218,7 +265,7 @@
           <w:lang w:eastAsia="en-GB"/>
         </w:rPr>
       </w:pPr>
-      <w:hyperlink w:anchor="_Toc202813167" w:history="1">
+      <w:hyperlink w:anchor="_Toc202873448" w:history="1">
         <w:r>
           <w:rPr>
             <w:rStyle w:val="Hyperlink"/>
@@ -245,7 +292,7 @@
             <w:noProof/>
             <w:webHidden/>
           </w:rPr>
-          <w:instrText xml:space="preserve"> PAGEREF _Toc202813167 \h </w:instrText>
+          <w:instrText xml:space="preserve"> PAGEREF _Toc202873448 \h </w:instrText>
         </w:r>
         <w:r>
           <w:rPr>
@@ -288,7 +335,7 @@
           <w:lang w:eastAsia="en-GB"/>
         </w:rPr>
       </w:pPr>
-      <w:hyperlink w:anchor="_Toc202813168" w:history="1">
+      <w:hyperlink w:anchor="_Toc202873449" w:history="1">
         <w:r>
           <w:rPr>
             <w:rStyle w:val="Hyperlink"/>
@@ -315,7 +362,7 @@
             <w:noProof/>
             <w:webHidden/>
           </w:rPr>
-          <w:instrText xml:space="preserve"> PAGEREF _Toc202813168 \h </w:instrText>
+          <w:instrText xml:space="preserve"> PAGEREF _Toc202873449 \h </w:instrText>
         </w:r>
         <w:r>
           <w:rPr>
@@ -358,7 +405,7 @@
           <w:lang w:eastAsia="en-GB"/>
         </w:rPr>
       </w:pPr>
-      <w:hyperlink w:anchor="_Toc202813169" w:history="1">
+      <w:hyperlink w:anchor="_Toc202873450" w:history="1">
         <w:r>
           <w:rPr>
             <w:rStyle w:val="Hyperlink"/>
@@ -385,7 +432,7 @@
             <w:noProof/>
             <w:webHidden/>
           </w:rPr>
-          <w:instrText xml:space="preserve"> PAGEREF _Toc202813169 \h </w:instrText>
+          <w:instrText xml:space="preserve"> PAGEREF _Toc202873450 \h </w:instrText>
         </w:r>
         <w:r>
           <w:rPr>
@@ -428,7 +475,7 @@
           <w:lang w:eastAsia="en-GB"/>
         </w:rPr>
       </w:pPr>
-      <w:hyperlink w:anchor="_Toc202813170" w:history="1">
+      <w:hyperlink w:anchor="_Toc202873451" w:history="1">
         <w:r>
           <w:rPr>
             <w:rStyle w:val="Hyperlink"/>
@@ -455,7 +502,7 @@
             <w:noProof/>
             <w:webHidden/>
           </w:rPr>
-          <w:instrText xml:space="preserve"> PAGEREF _Toc202813170 \h </w:instrText>
+          <w:instrText xml:space="preserve"> PAGEREF _Toc202873451 \h </w:instrText>
         </w:r>
         <w:r>
           <w:rPr>
@@ -498,7 +545,7 @@
           <w:lang w:eastAsia="en-GB"/>
         </w:rPr>
       </w:pPr>
-      <w:hyperlink w:anchor="_Toc202813171" w:history="1">
+      <w:hyperlink w:anchor="_Toc202873452" w:history="1">
         <w:r>
           <w:rPr>
             <w:rStyle w:val="Hyperlink"/>
@@ -525,7 +572,7 @@
             <w:noProof/>
             <w:webHidden/>
           </w:rPr>
-          <w:instrText xml:space="preserve"> PAGEREF _Toc202813171 \h </w:instrText>
+          <w:instrText xml:space="preserve"> PAGEREF _Toc202873452 \h </w:instrText>
         </w:r>
         <w:r>
           <w:rPr>
@@ -568,7 +615,7 @@
           <w:lang w:eastAsia="en-GB"/>
         </w:rPr>
       </w:pPr>
-      <w:hyperlink w:anchor="_Toc202813172" w:history="1">
+      <w:hyperlink w:anchor="_Toc202873453" w:history="1">
         <w:r>
           <w:rPr>
             <w:rStyle w:val="Hyperlink"/>
@@ -595,7 +642,7 @@
             <w:noProof/>
             <w:webHidden/>
           </w:rPr>
-          <w:instrText xml:space="preserve"> PAGEREF _Toc202813172 \h </w:instrText>
+          <w:instrText xml:space="preserve"> PAGEREF _Toc202873453 \h </w:instrText>
         </w:r>
         <w:r>
           <w:rPr>
@@ -638,7 +685,7 @@
           <w:lang w:eastAsia="en-GB"/>
         </w:rPr>
       </w:pPr>
-      <w:hyperlink w:anchor="_Toc202813173" w:history="1">
+      <w:hyperlink w:anchor="_Toc202873454" w:history="1">
         <w:r>
           <w:rPr>
             <w:rStyle w:val="Hyperlink"/>
@@ -665,7 +712,7 @@
             <w:noProof/>
             <w:webHidden/>
           </w:rPr>
-          <w:instrText xml:space="preserve"> PAGEREF _Toc202813173 \h </w:instrText>
+          <w:instrText xml:space="preserve"> PAGEREF _Toc202873454 \h </w:instrText>
         </w:r>
         <w:r>
           <w:rPr>
@@ -686,6 +733,146 @@
             <w:webHidden/>
           </w:rPr>
           <w:t>9</w:t>
+        </w:r>
+        <w:r>
+          <w:rPr>
+            <w:noProof/>
+            <w:webHidden/>
+          </w:rPr>
+          <w:fldChar w:fldCharType="end"/>
+        </w:r>
+      </w:hyperlink>
+    </w:p>
+    <w:p>
+      <w:pPr>
+        <w:pStyle w:val="TOC1"/>
+        <w:tabs>
+          <w:tab w:val="right" w:leader="dot" w:pos="9016"/>
+        </w:tabs>
+        <w:rPr>
+          <w:rFonts w:asciiTheme="minorHAnsi" w:eastAsiaTheme="minorEastAsia" w:hAnsiTheme="minorHAnsi"/>
+          <w:noProof/>
+          <w:lang w:eastAsia="en-GB"/>
+        </w:rPr>
+      </w:pPr>
+      <w:hyperlink w:anchor="_Toc202873455" w:history="1">
+        <w:r>
+          <w:rPr>
+            <w:rStyle w:val="Hyperlink"/>
+            <w:noProof/>
+          </w:rPr>
+          <w:t>Methodology</w:t>
+        </w:r>
+        <w:r>
+          <w:rPr>
+            <w:noProof/>
+            <w:webHidden/>
+          </w:rPr>
+          <w:tab/>
+        </w:r>
+        <w:r>
+          <w:rPr>
+            <w:noProof/>
+            <w:webHidden/>
+          </w:rPr>
+          <w:fldChar w:fldCharType="begin"/>
+        </w:r>
+        <w:r>
+          <w:rPr>
+            <w:noProof/>
+            <w:webHidden/>
+          </w:rPr>
+          <w:instrText xml:space="preserve"> PAGEREF _Toc202873455 \h </w:instrText>
+        </w:r>
+        <w:r>
+          <w:rPr>
+            <w:noProof/>
+            <w:webHidden/>
+          </w:rPr>
+        </w:r>
+        <w:r>
+          <w:rPr>
+            <w:noProof/>
+            <w:webHidden/>
+          </w:rPr>
+          <w:fldChar w:fldCharType="separate"/>
+        </w:r>
+        <w:r>
+          <w:rPr>
+            <w:noProof/>
+            <w:webHidden/>
+          </w:rPr>
+          <w:t>11</w:t>
+        </w:r>
+        <w:r>
+          <w:rPr>
+            <w:noProof/>
+            <w:webHidden/>
+          </w:rPr>
+          <w:fldChar w:fldCharType="end"/>
+        </w:r>
+      </w:hyperlink>
+    </w:p>
+    <w:p>
+      <w:pPr>
+        <w:pStyle w:val="TOC1"/>
+        <w:tabs>
+          <w:tab w:val="right" w:leader="dot" w:pos="9016"/>
+        </w:tabs>
+        <w:rPr>
+          <w:rFonts w:asciiTheme="minorHAnsi" w:eastAsiaTheme="minorEastAsia" w:hAnsiTheme="minorHAnsi"/>
+          <w:noProof/>
+          <w:lang w:eastAsia="en-GB"/>
+        </w:rPr>
+      </w:pPr>
+      <w:hyperlink w:anchor="_Toc202873456" w:history="1">
+        <w:r>
+          <w:rPr>
+            <w:rStyle w:val="Hyperlink"/>
+            <w:noProof/>
+          </w:rPr>
+          <w:t>Design/Plan</w:t>
+        </w:r>
+        <w:r>
+          <w:rPr>
+            <w:noProof/>
+            <w:webHidden/>
+          </w:rPr>
+          <w:tab/>
+        </w:r>
+        <w:r>
+          <w:rPr>
+            <w:noProof/>
+            <w:webHidden/>
+          </w:rPr>
+          <w:fldChar w:fldCharType="begin"/>
+        </w:r>
+        <w:r>
+          <w:rPr>
+            <w:noProof/>
+            <w:webHidden/>
+          </w:rPr>
+          <w:instrText xml:space="preserve"> PAGEREF _Toc202873456 \h </w:instrText>
+        </w:r>
+        <w:r>
+          <w:rPr>
+            <w:noProof/>
+            <w:webHidden/>
+          </w:rPr>
+        </w:r>
+        <w:r>
+          <w:rPr>
+            <w:noProof/>
+            <w:webHidden/>
+          </w:rPr>
+          <w:fldChar w:fldCharType="separate"/>
+        </w:r>
+        <w:r>
+          <w:rPr>
+            <w:noProof/>
+            <w:webHidden/>
+          </w:rPr>
+          <w:t>12</w:t>
         </w:r>
         <w:r>
           <w:rPr>
@@ -708,13 +895,13 @@
           <w:lang w:eastAsia="en-GB"/>
         </w:rPr>
       </w:pPr>
-      <w:hyperlink w:anchor="_Toc202813174" w:history="1">
+      <w:hyperlink w:anchor="_Toc202873457" w:history="1">
         <w:r>
           <w:rPr>
             <w:rStyle w:val="Hyperlink"/>
             <w:noProof/>
           </w:rPr>
-          <w:t>Methodology</w:t>
+          <w:t>Data Plan</w:t>
         </w:r>
         <w:r>
           <w:rPr>
@@ -735,7 +922,7 @@
             <w:noProof/>
             <w:webHidden/>
           </w:rPr>
-          <w:instrText xml:space="preserve"> PAGEREF _Toc202813174 \h </w:instrText>
+          <w:instrText xml:space="preserve"> PAGEREF _Toc202873457 \h </w:instrText>
         </w:r>
         <w:r>
           <w:rPr>
@@ -755,7 +942,427 @@
             <w:noProof/>
             <w:webHidden/>
           </w:rPr>
-          <w:t>11</w:t>
+          <w:t>12</w:t>
+        </w:r>
+        <w:r>
+          <w:rPr>
+            <w:noProof/>
+            <w:webHidden/>
+          </w:rPr>
+          <w:fldChar w:fldCharType="end"/>
+        </w:r>
+      </w:hyperlink>
+    </w:p>
+    <w:p>
+      <w:pPr>
+        <w:pStyle w:val="TOC3"/>
+        <w:tabs>
+          <w:tab w:val="right" w:leader="dot" w:pos="9016"/>
+        </w:tabs>
+        <w:rPr>
+          <w:rFonts w:asciiTheme="minorHAnsi" w:eastAsiaTheme="minorEastAsia" w:hAnsiTheme="minorHAnsi"/>
+          <w:noProof/>
+          <w:lang w:eastAsia="en-GB"/>
+        </w:rPr>
+      </w:pPr>
+      <w:hyperlink w:anchor="_Toc202873458" w:history="1">
+        <w:r>
+          <w:rPr>
+            <w:rStyle w:val="Hyperlink"/>
+            <w:noProof/>
+          </w:rPr>
+          <w:t>Target Website</w:t>
+        </w:r>
+        <w:r>
+          <w:rPr>
+            <w:noProof/>
+            <w:webHidden/>
+          </w:rPr>
+          <w:tab/>
+        </w:r>
+        <w:r>
+          <w:rPr>
+            <w:noProof/>
+            <w:webHidden/>
+          </w:rPr>
+          <w:fldChar w:fldCharType="begin"/>
+        </w:r>
+        <w:r>
+          <w:rPr>
+            <w:noProof/>
+            <w:webHidden/>
+          </w:rPr>
+          <w:instrText xml:space="preserve"> PAGEREF _Toc202873458 \h </w:instrText>
+        </w:r>
+        <w:r>
+          <w:rPr>
+            <w:noProof/>
+            <w:webHidden/>
+          </w:rPr>
+        </w:r>
+        <w:r>
+          <w:rPr>
+            <w:noProof/>
+            <w:webHidden/>
+          </w:rPr>
+          <w:fldChar w:fldCharType="separate"/>
+        </w:r>
+        <w:r>
+          <w:rPr>
+            <w:noProof/>
+            <w:webHidden/>
+          </w:rPr>
+          <w:t>12</w:t>
+        </w:r>
+        <w:r>
+          <w:rPr>
+            <w:noProof/>
+            <w:webHidden/>
+          </w:rPr>
+          <w:fldChar w:fldCharType="end"/>
+        </w:r>
+      </w:hyperlink>
+    </w:p>
+    <w:p>
+      <w:pPr>
+        <w:pStyle w:val="TOC3"/>
+        <w:tabs>
+          <w:tab w:val="right" w:leader="dot" w:pos="9016"/>
+        </w:tabs>
+        <w:rPr>
+          <w:rFonts w:asciiTheme="minorHAnsi" w:eastAsiaTheme="minorEastAsia" w:hAnsiTheme="minorHAnsi"/>
+          <w:noProof/>
+          <w:lang w:eastAsia="en-GB"/>
+        </w:rPr>
+      </w:pPr>
+      <w:hyperlink w:anchor="_Toc202873459" w:history="1">
+        <w:r>
+          <w:rPr>
+            <w:rStyle w:val="Hyperlink"/>
+            <w:noProof/>
+          </w:rPr>
+          <w:t>Scraping</w:t>
+        </w:r>
+        <w:r>
+          <w:rPr>
+            <w:noProof/>
+            <w:webHidden/>
+          </w:rPr>
+          <w:tab/>
+        </w:r>
+        <w:r>
+          <w:rPr>
+            <w:noProof/>
+            <w:webHidden/>
+          </w:rPr>
+          <w:fldChar w:fldCharType="begin"/>
+        </w:r>
+        <w:r>
+          <w:rPr>
+            <w:noProof/>
+            <w:webHidden/>
+          </w:rPr>
+          <w:instrText xml:space="preserve"> PAGEREF _Toc202873459 \h </w:instrText>
+        </w:r>
+        <w:r>
+          <w:rPr>
+            <w:noProof/>
+            <w:webHidden/>
+          </w:rPr>
+        </w:r>
+        <w:r>
+          <w:rPr>
+            <w:noProof/>
+            <w:webHidden/>
+          </w:rPr>
+          <w:fldChar w:fldCharType="separate"/>
+        </w:r>
+        <w:r>
+          <w:rPr>
+            <w:noProof/>
+            <w:webHidden/>
+          </w:rPr>
+          <w:t>13</w:t>
+        </w:r>
+        <w:r>
+          <w:rPr>
+            <w:noProof/>
+            <w:webHidden/>
+          </w:rPr>
+          <w:fldChar w:fldCharType="end"/>
+        </w:r>
+      </w:hyperlink>
+    </w:p>
+    <w:p>
+      <w:pPr>
+        <w:pStyle w:val="TOC3"/>
+        <w:tabs>
+          <w:tab w:val="right" w:leader="dot" w:pos="9016"/>
+        </w:tabs>
+        <w:rPr>
+          <w:rFonts w:asciiTheme="minorHAnsi" w:eastAsiaTheme="minorEastAsia" w:hAnsiTheme="minorHAnsi"/>
+          <w:noProof/>
+          <w:lang w:eastAsia="en-GB"/>
+        </w:rPr>
+      </w:pPr>
+      <w:hyperlink w:anchor="_Toc202873460" w:history="1">
+        <w:r>
+          <w:rPr>
+            <w:rStyle w:val="Hyperlink"/>
+            <w:noProof/>
+          </w:rPr>
+          <w:t>Saving Format (.CSV)</w:t>
+        </w:r>
+        <w:r>
+          <w:rPr>
+            <w:noProof/>
+            <w:webHidden/>
+          </w:rPr>
+          <w:tab/>
+        </w:r>
+        <w:r>
+          <w:rPr>
+            <w:noProof/>
+            <w:webHidden/>
+          </w:rPr>
+          <w:fldChar w:fldCharType="begin"/>
+        </w:r>
+        <w:r>
+          <w:rPr>
+            <w:noProof/>
+            <w:webHidden/>
+          </w:rPr>
+          <w:instrText xml:space="preserve"> PAGEREF _Toc202873460 \h </w:instrText>
+        </w:r>
+        <w:r>
+          <w:rPr>
+            <w:noProof/>
+            <w:webHidden/>
+          </w:rPr>
+        </w:r>
+        <w:r>
+          <w:rPr>
+            <w:noProof/>
+            <w:webHidden/>
+          </w:rPr>
+          <w:fldChar w:fldCharType="separate"/>
+        </w:r>
+        <w:r>
+          <w:rPr>
+            <w:noProof/>
+            <w:webHidden/>
+          </w:rPr>
+          <w:t>15</w:t>
+        </w:r>
+        <w:r>
+          <w:rPr>
+            <w:noProof/>
+            <w:webHidden/>
+          </w:rPr>
+          <w:fldChar w:fldCharType="end"/>
+        </w:r>
+      </w:hyperlink>
+    </w:p>
+    <w:p>
+      <w:pPr>
+        <w:pStyle w:val="TOC3"/>
+        <w:tabs>
+          <w:tab w:val="right" w:leader="dot" w:pos="9016"/>
+        </w:tabs>
+        <w:rPr>
+          <w:rFonts w:asciiTheme="minorHAnsi" w:eastAsiaTheme="minorEastAsia" w:hAnsiTheme="minorHAnsi"/>
+          <w:noProof/>
+          <w:lang w:eastAsia="en-GB"/>
+        </w:rPr>
+      </w:pPr>
+      <w:hyperlink w:anchor="_Toc202873461" w:history="1">
+        <w:r>
+          <w:rPr>
+            <w:rStyle w:val="Hyperlink"/>
+            <w:noProof/>
+          </w:rPr>
+          <w:t>Database (MySQL)</w:t>
+        </w:r>
+        <w:r>
+          <w:rPr>
+            <w:noProof/>
+            <w:webHidden/>
+          </w:rPr>
+          <w:tab/>
+        </w:r>
+        <w:r>
+          <w:rPr>
+            <w:noProof/>
+            <w:webHidden/>
+          </w:rPr>
+          <w:fldChar w:fldCharType="begin"/>
+        </w:r>
+        <w:r>
+          <w:rPr>
+            <w:noProof/>
+            <w:webHidden/>
+          </w:rPr>
+          <w:instrText xml:space="preserve"> PAGEREF _Toc202873461 \h </w:instrText>
+        </w:r>
+        <w:r>
+          <w:rPr>
+            <w:noProof/>
+            <w:webHidden/>
+          </w:rPr>
+        </w:r>
+        <w:r>
+          <w:rPr>
+            <w:noProof/>
+            <w:webHidden/>
+          </w:rPr>
+          <w:fldChar w:fldCharType="separate"/>
+        </w:r>
+        <w:r>
+          <w:rPr>
+            <w:noProof/>
+            <w:webHidden/>
+          </w:rPr>
+          <w:t>16</w:t>
+        </w:r>
+        <w:r>
+          <w:rPr>
+            <w:noProof/>
+            <w:webHidden/>
+          </w:rPr>
+          <w:fldChar w:fldCharType="end"/>
+        </w:r>
+      </w:hyperlink>
+    </w:p>
+    <w:p>
+      <w:pPr>
+        <w:pStyle w:val="TOC1"/>
+        <w:tabs>
+          <w:tab w:val="right" w:leader="dot" w:pos="9016"/>
+        </w:tabs>
+        <w:rPr>
+          <w:rFonts w:asciiTheme="minorHAnsi" w:eastAsiaTheme="minorEastAsia" w:hAnsiTheme="minorHAnsi"/>
+          <w:noProof/>
+          <w:lang w:eastAsia="en-GB"/>
+        </w:rPr>
+      </w:pPr>
+      <w:hyperlink w:anchor="_Toc202873462" w:history="1">
+        <w:r>
+          <w:rPr>
+            <w:rStyle w:val="Hyperlink"/>
+            <w:noProof/>
+          </w:rPr>
+          <w:t>Scraping Practice</w:t>
+        </w:r>
+        <w:r>
+          <w:rPr>
+            <w:noProof/>
+            <w:webHidden/>
+          </w:rPr>
+          <w:tab/>
+        </w:r>
+        <w:r>
+          <w:rPr>
+            <w:noProof/>
+            <w:webHidden/>
+          </w:rPr>
+          <w:fldChar w:fldCharType="begin"/>
+        </w:r>
+        <w:r>
+          <w:rPr>
+            <w:noProof/>
+            <w:webHidden/>
+          </w:rPr>
+          <w:instrText xml:space="preserve"> PAGEREF _Toc202873462 \h </w:instrText>
+        </w:r>
+        <w:r>
+          <w:rPr>
+            <w:noProof/>
+            <w:webHidden/>
+          </w:rPr>
+        </w:r>
+        <w:r>
+          <w:rPr>
+            <w:noProof/>
+            <w:webHidden/>
+          </w:rPr>
+          <w:fldChar w:fldCharType="separate"/>
+        </w:r>
+        <w:r>
+          <w:rPr>
+            <w:noProof/>
+            <w:webHidden/>
+          </w:rPr>
+          <w:t>19</w:t>
+        </w:r>
+        <w:r>
+          <w:rPr>
+            <w:noProof/>
+            <w:webHidden/>
+          </w:rPr>
+          <w:fldChar w:fldCharType="end"/>
+        </w:r>
+      </w:hyperlink>
+    </w:p>
+    <w:p>
+      <w:pPr>
+        <w:pStyle w:val="TOC1"/>
+        <w:tabs>
+          <w:tab w:val="right" w:leader="dot" w:pos="9016"/>
+        </w:tabs>
+        <w:rPr>
+          <w:rFonts w:asciiTheme="minorHAnsi" w:eastAsiaTheme="minorEastAsia" w:hAnsiTheme="minorHAnsi"/>
+          <w:noProof/>
+          <w:lang w:eastAsia="en-GB"/>
+        </w:rPr>
+      </w:pPr>
+      <w:hyperlink w:anchor="_Toc202873463" w:history="1">
+        <w:r>
+          <w:rPr>
+            <w:rStyle w:val="Hyperlink"/>
+            <w:noProof/>
+          </w:rPr>
+          <w:t>Development &amp; Data Analysis</w:t>
+        </w:r>
+        <w:r>
+          <w:rPr>
+            <w:noProof/>
+            <w:webHidden/>
+          </w:rPr>
+          <w:tab/>
+        </w:r>
+        <w:r>
+          <w:rPr>
+            <w:noProof/>
+            <w:webHidden/>
+          </w:rPr>
+          <w:fldChar w:fldCharType="begin"/>
+        </w:r>
+        <w:r>
+          <w:rPr>
+            <w:noProof/>
+            <w:webHidden/>
+          </w:rPr>
+          <w:instrText xml:space="preserve"> PAGEREF _Toc202873463 \h </w:instrText>
+        </w:r>
+        <w:r>
+          <w:rPr>
+            <w:noProof/>
+            <w:webHidden/>
+          </w:rPr>
+        </w:r>
+        <w:r>
+          <w:rPr>
+            <w:noProof/>
+            <w:webHidden/>
+          </w:rPr>
+          <w:fldChar w:fldCharType="separate"/>
+        </w:r>
+        <w:r>
+          <w:rPr>
+            <w:noProof/>
+            <w:webHidden/>
+          </w:rPr>
+          <w:t>22</w:t>
         </w:r>
         <w:r>
           <w:rPr>
@@ -778,13 +1385,13 @@
           <w:lang w:eastAsia="en-GB"/>
         </w:rPr>
       </w:pPr>
-      <w:hyperlink w:anchor="_Toc202813175" w:history="1">
+      <w:hyperlink w:anchor="_Toc202873464" w:history="1">
         <w:r>
           <w:rPr>
             <w:rStyle w:val="Hyperlink"/>
             <w:noProof/>
           </w:rPr>
-          <w:t>Data Plan</w:t>
+          <w:t>Scraping Program</w:t>
         </w:r>
         <w:r>
           <w:rPr>
@@ -805,7 +1412,7 @@
             <w:noProof/>
             <w:webHidden/>
           </w:rPr>
-          <w:instrText xml:space="preserve"> PAGEREF _Toc202813175 \h </w:instrText>
+          <w:instrText xml:space="preserve"> PAGEREF _Toc202873464 \h </w:instrText>
         </w:r>
         <w:r>
           <w:rPr>
@@ -825,7 +1432,7 @@
             <w:noProof/>
             <w:webHidden/>
           </w:rPr>
-          <w:t>12</w:t>
+          <w:t>22</w:t>
         </w:r>
         <w:r>
           <w:rPr>
@@ -838,7 +1445,7 @@
     </w:p>
     <w:p>
       <w:pPr>
-        <w:pStyle w:val="TOC3"/>
+        <w:pStyle w:val="TOC2"/>
         <w:tabs>
           <w:tab w:val="right" w:leader="dot" w:pos="9016"/>
         </w:tabs>
@@ -848,27 +1455,13 @@
           <w:lang w:eastAsia="en-GB"/>
         </w:rPr>
       </w:pPr>
-      <w:hyperlink w:anchor="_Toc202813176" w:history="1">
+      <w:hyperlink w:anchor="_Toc202873465" w:history="1">
         <w:r>
           <w:rPr>
             <w:rStyle w:val="Hyperlink"/>
             <w:noProof/>
           </w:rPr>
-          <w:t xml:space="preserve">Target </w:t>
-        </w:r>
-        <w:r>
-          <w:rPr>
-            <w:rStyle w:val="Hyperlink"/>
-            <w:noProof/>
-          </w:rPr>
-          <w:t>W</w:t>
-        </w:r>
-        <w:r>
-          <w:rPr>
-            <w:rStyle w:val="Hyperlink"/>
-            <w:noProof/>
-          </w:rPr>
-          <w:t>ebsite</w:t>
+          <w:t>Data Analysis</w:t>
         </w:r>
         <w:r>
           <w:rPr>
@@ -889,7 +1482,7 @@
             <w:noProof/>
             <w:webHidden/>
           </w:rPr>
-          <w:instrText xml:space="preserve"> PAGEREF _Toc202813176 \h </w:instrText>
+          <w:instrText xml:space="preserve"> PAGEREF _Toc202873465 \h </w:instrText>
         </w:r>
         <w:r>
           <w:rPr>
@@ -909,7 +1502,7 @@
             <w:noProof/>
             <w:webHidden/>
           </w:rPr>
-          <w:t>12</w:t>
+          <w:t>23</w:t>
         </w:r>
         <w:r>
           <w:rPr>
@@ -922,7 +1515,7 @@
     </w:p>
     <w:p>
       <w:pPr>
-        <w:pStyle w:val="TOC3"/>
+        <w:pStyle w:val="TOC2"/>
         <w:tabs>
           <w:tab w:val="right" w:leader="dot" w:pos="9016"/>
         </w:tabs>
@@ -932,13 +1525,13 @@
           <w:lang w:eastAsia="en-GB"/>
         </w:rPr>
       </w:pPr>
-      <w:hyperlink w:anchor="_Toc202813177" w:history="1">
+      <w:hyperlink w:anchor="_Toc202873466" w:history="1">
         <w:r>
           <w:rPr>
             <w:rStyle w:val="Hyperlink"/>
             <w:noProof/>
           </w:rPr>
-          <w:t>Scraping</w:t>
+          <w:t>MySQL Database</w:t>
         </w:r>
         <w:r>
           <w:rPr>
@@ -959,7 +1552,7 @@
             <w:noProof/>
             <w:webHidden/>
           </w:rPr>
-          <w:instrText xml:space="preserve"> PAGEREF _Toc202813177 \h </w:instrText>
+          <w:instrText xml:space="preserve"> PAGEREF _Toc202873466 \h </w:instrText>
         </w:r>
         <w:r>
           <w:rPr>
@@ -979,7 +1572,7 @@
             <w:noProof/>
             <w:webHidden/>
           </w:rPr>
-          <w:t>13</w:t>
+          <w:t>24</w:t>
         </w:r>
         <w:r>
           <w:rPr>
@@ -992,7 +1585,7 @@
     </w:p>
     <w:p>
       <w:pPr>
-        <w:pStyle w:val="TOC3"/>
+        <w:pStyle w:val="TOC2"/>
         <w:tabs>
           <w:tab w:val="right" w:leader="dot" w:pos="9016"/>
         </w:tabs>
@@ -1002,13 +1595,13 @@
           <w:lang w:eastAsia="en-GB"/>
         </w:rPr>
       </w:pPr>
-      <w:hyperlink w:anchor="_Toc202813178" w:history="1">
+      <w:hyperlink w:anchor="_Toc202873467" w:history="1">
         <w:r>
           <w:rPr>
             <w:rStyle w:val="Hyperlink"/>
             <w:noProof/>
           </w:rPr>
-          <w:t>Saving Format (.CSV)</w:t>
+          <w:t>Website</w:t>
         </w:r>
         <w:r>
           <w:rPr>
@@ -1029,7 +1622,7 @@
             <w:noProof/>
             <w:webHidden/>
           </w:rPr>
-          <w:instrText xml:space="preserve"> PAGEREF _Toc202813178 \h </w:instrText>
+          <w:instrText xml:space="preserve"> PAGEREF _Toc202873467 \h </w:instrText>
         </w:r>
         <w:r>
           <w:rPr>
@@ -1049,77 +1642,7 @@
             <w:noProof/>
             <w:webHidden/>
           </w:rPr>
-          <w:t>15</w:t>
-        </w:r>
-        <w:r>
-          <w:rPr>
-            <w:noProof/>
-            <w:webHidden/>
-          </w:rPr>
-          <w:fldChar w:fldCharType="end"/>
-        </w:r>
-      </w:hyperlink>
-    </w:p>
-    <w:p>
-      <w:pPr>
-        <w:pStyle w:val="TOC3"/>
-        <w:tabs>
-          <w:tab w:val="right" w:leader="dot" w:pos="9016"/>
-        </w:tabs>
-        <w:rPr>
-          <w:rFonts w:asciiTheme="minorHAnsi" w:eastAsiaTheme="minorEastAsia" w:hAnsiTheme="minorHAnsi"/>
-          <w:noProof/>
-          <w:lang w:eastAsia="en-GB"/>
-        </w:rPr>
-      </w:pPr>
-      <w:hyperlink w:anchor="_Toc202813179" w:history="1">
-        <w:r>
-          <w:rPr>
-            <w:rStyle w:val="Hyperlink"/>
-            <w:noProof/>
-          </w:rPr>
-          <w:t>Database (MySQL)</w:t>
-        </w:r>
-        <w:r>
-          <w:rPr>
-            <w:noProof/>
-            <w:webHidden/>
-          </w:rPr>
-          <w:tab/>
-        </w:r>
-        <w:r>
-          <w:rPr>
-            <w:noProof/>
-            <w:webHidden/>
-          </w:rPr>
-          <w:fldChar w:fldCharType="begin"/>
-        </w:r>
-        <w:r>
-          <w:rPr>
-            <w:noProof/>
-            <w:webHidden/>
-          </w:rPr>
-          <w:instrText xml:space="preserve"> PAGEREF _Toc202813179 \h </w:instrText>
-        </w:r>
-        <w:r>
-          <w:rPr>
-            <w:noProof/>
-            <w:webHidden/>
-          </w:rPr>
-        </w:r>
-        <w:r>
-          <w:rPr>
-            <w:noProof/>
-            <w:webHidden/>
-          </w:rPr>
-          <w:fldChar w:fldCharType="separate"/>
-        </w:r>
-        <w:r>
-          <w:rPr>
-            <w:noProof/>
-            <w:webHidden/>
-          </w:rPr>
-          <w:t>16</w:t>
+          <w:t>25</w:t>
         </w:r>
         <w:r>
           <w:rPr>
@@ -1142,13 +1665,13 @@
           <w:lang w:eastAsia="en-GB"/>
         </w:rPr>
       </w:pPr>
-      <w:hyperlink w:anchor="_Toc202813180" w:history="1">
+      <w:hyperlink w:anchor="_Toc202873468" w:history="1">
         <w:r>
           <w:rPr>
             <w:rStyle w:val="Hyperlink"/>
             <w:noProof/>
           </w:rPr>
-          <w:t>Scraping Practice</w:t>
+          <w:t>Results/Findings</w:t>
         </w:r>
         <w:r>
           <w:rPr>
@@ -1169,7 +1692,7 @@
             <w:noProof/>
             <w:webHidden/>
           </w:rPr>
-          <w:instrText xml:space="preserve"> PAGEREF _Toc202813180 \h </w:instrText>
+          <w:instrText xml:space="preserve"> PAGEREF _Toc202873468 \h </w:instrText>
         </w:r>
         <w:r>
           <w:rPr>
@@ -1189,7 +1712,217 @@
             <w:noProof/>
             <w:webHidden/>
           </w:rPr>
-          <w:t>19</w:t>
+          <w:t>26</w:t>
+        </w:r>
+        <w:r>
+          <w:rPr>
+            <w:noProof/>
+            <w:webHidden/>
+          </w:rPr>
+          <w:fldChar w:fldCharType="end"/>
+        </w:r>
+      </w:hyperlink>
+    </w:p>
+    <w:p>
+      <w:pPr>
+        <w:pStyle w:val="TOC2"/>
+        <w:tabs>
+          <w:tab w:val="right" w:leader="dot" w:pos="9016"/>
+        </w:tabs>
+        <w:rPr>
+          <w:rFonts w:asciiTheme="minorHAnsi" w:eastAsiaTheme="minorEastAsia" w:hAnsiTheme="minorHAnsi"/>
+          <w:noProof/>
+          <w:lang w:eastAsia="en-GB"/>
+        </w:rPr>
+      </w:pPr>
+      <w:hyperlink w:anchor="_Toc202873469" w:history="1">
+        <w:r>
+          <w:rPr>
+            <w:rStyle w:val="Hyperlink"/>
+            <w:noProof/>
+          </w:rPr>
+          <w:t>Scraping Program</w:t>
+        </w:r>
+        <w:r>
+          <w:rPr>
+            <w:noProof/>
+            <w:webHidden/>
+          </w:rPr>
+          <w:tab/>
+        </w:r>
+        <w:r>
+          <w:rPr>
+            <w:noProof/>
+            <w:webHidden/>
+          </w:rPr>
+          <w:fldChar w:fldCharType="begin"/>
+        </w:r>
+        <w:r>
+          <w:rPr>
+            <w:noProof/>
+            <w:webHidden/>
+          </w:rPr>
+          <w:instrText xml:space="preserve"> PAGEREF _Toc202873469 \h </w:instrText>
+        </w:r>
+        <w:r>
+          <w:rPr>
+            <w:noProof/>
+            <w:webHidden/>
+          </w:rPr>
+        </w:r>
+        <w:r>
+          <w:rPr>
+            <w:noProof/>
+            <w:webHidden/>
+          </w:rPr>
+          <w:fldChar w:fldCharType="separate"/>
+        </w:r>
+        <w:r>
+          <w:rPr>
+            <w:noProof/>
+            <w:webHidden/>
+          </w:rPr>
+          <w:t>26</w:t>
+        </w:r>
+        <w:r>
+          <w:rPr>
+            <w:noProof/>
+            <w:webHidden/>
+          </w:rPr>
+          <w:fldChar w:fldCharType="end"/>
+        </w:r>
+      </w:hyperlink>
+    </w:p>
+    <w:p>
+      <w:pPr>
+        <w:pStyle w:val="TOC2"/>
+        <w:tabs>
+          <w:tab w:val="right" w:leader="dot" w:pos="9016"/>
+        </w:tabs>
+        <w:rPr>
+          <w:rFonts w:asciiTheme="minorHAnsi" w:eastAsiaTheme="minorEastAsia" w:hAnsiTheme="minorHAnsi"/>
+          <w:noProof/>
+          <w:lang w:eastAsia="en-GB"/>
+        </w:rPr>
+      </w:pPr>
+      <w:hyperlink w:anchor="_Toc202873470" w:history="1">
+        <w:r>
+          <w:rPr>
+            <w:rStyle w:val="Hyperlink"/>
+            <w:noProof/>
+          </w:rPr>
+          <w:t>MySQL Database</w:t>
+        </w:r>
+        <w:r>
+          <w:rPr>
+            <w:noProof/>
+            <w:webHidden/>
+          </w:rPr>
+          <w:tab/>
+        </w:r>
+        <w:r>
+          <w:rPr>
+            <w:noProof/>
+            <w:webHidden/>
+          </w:rPr>
+          <w:fldChar w:fldCharType="begin"/>
+        </w:r>
+        <w:r>
+          <w:rPr>
+            <w:noProof/>
+            <w:webHidden/>
+          </w:rPr>
+          <w:instrText xml:space="preserve"> PAGEREF _Toc202873470 \h </w:instrText>
+        </w:r>
+        <w:r>
+          <w:rPr>
+            <w:noProof/>
+            <w:webHidden/>
+          </w:rPr>
+        </w:r>
+        <w:r>
+          <w:rPr>
+            <w:noProof/>
+            <w:webHidden/>
+          </w:rPr>
+          <w:fldChar w:fldCharType="separate"/>
+        </w:r>
+        <w:r>
+          <w:rPr>
+            <w:noProof/>
+            <w:webHidden/>
+          </w:rPr>
+          <w:t>27</w:t>
+        </w:r>
+        <w:r>
+          <w:rPr>
+            <w:noProof/>
+            <w:webHidden/>
+          </w:rPr>
+          <w:fldChar w:fldCharType="end"/>
+        </w:r>
+      </w:hyperlink>
+    </w:p>
+    <w:p>
+      <w:pPr>
+        <w:pStyle w:val="TOC2"/>
+        <w:tabs>
+          <w:tab w:val="right" w:leader="dot" w:pos="9016"/>
+        </w:tabs>
+        <w:rPr>
+          <w:rFonts w:asciiTheme="minorHAnsi" w:eastAsiaTheme="minorEastAsia" w:hAnsiTheme="minorHAnsi"/>
+          <w:noProof/>
+          <w:lang w:eastAsia="en-GB"/>
+        </w:rPr>
+      </w:pPr>
+      <w:hyperlink w:anchor="_Toc202873471" w:history="1">
+        <w:r>
+          <w:rPr>
+            <w:rStyle w:val="Hyperlink"/>
+            <w:noProof/>
+          </w:rPr>
+          <w:t>Website</w:t>
+        </w:r>
+        <w:r>
+          <w:rPr>
+            <w:noProof/>
+            <w:webHidden/>
+          </w:rPr>
+          <w:tab/>
+        </w:r>
+        <w:r>
+          <w:rPr>
+            <w:noProof/>
+            <w:webHidden/>
+          </w:rPr>
+          <w:fldChar w:fldCharType="begin"/>
+        </w:r>
+        <w:r>
+          <w:rPr>
+            <w:noProof/>
+            <w:webHidden/>
+          </w:rPr>
+          <w:instrText xml:space="preserve"> PAGEREF _Toc202873471 \h </w:instrText>
+        </w:r>
+        <w:r>
+          <w:rPr>
+            <w:noProof/>
+            <w:webHidden/>
+          </w:rPr>
+        </w:r>
+        <w:r>
+          <w:rPr>
+            <w:noProof/>
+            <w:webHidden/>
+          </w:rPr>
+          <w:fldChar w:fldCharType="separate"/>
+        </w:r>
+        <w:r>
+          <w:rPr>
+            <w:noProof/>
+            <w:webHidden/>
+          </w:rPr>
+          <w:t>28</w:t>
         </w:r>
         <w:r>
           <w:rPr>
@@ -1212,13 +1945,13 @@
           <w:lang w:eastAsia="en-GB"/>
         </w:rPr>
       </w:pPr>
-      <w:hyperlink w:anchor="_Toc202813181" w:history="1">
+      <w:hyperlink w:anchor="_Toc202873472" w:history="1">
         <w:r>
           <w:rPr>
             <w:rStyle w:val="Hyperlink"/>
             <w:noProof/>
           </w:rPr>
-          <w:t>Development &amp; Data Analysis</w:t>
+          <w:t>Conclusion</w:t>
         </w:r>
         <w:r>
           <w:rPr>
@@ -1239,7 +1972,7 @@
             <w:noProof/>
             <w:webHidden/>
           </w:rPr>
-          <w:instrText xml:space="preserve"> PAGEREF _Toc202813181 \h </w:instrText>
+          <w:instrText xml:space="preserve"> PAGEREF _Toc202873472 \h </w:instrText>
         </w:r>
         <w:r>
           <w:rPr>
@@ -1259,287 +1992,7 @@
             <w:noProof/>
             <w:webHidden/>
           </w:rPr>
-          <w:t>22</w:t>
-        </w:r>
-        <w:r>
-          <w:rPr>
-            <w:noProof/>
-            <w:webHidden/>
-          </w:rPr>
-          <w:fldChar w:fldCharType="end"/>
-        </w:r>
-      </w:hyperlink>
-    </w:p>
-    <w:p>
-      <w:pPr>
-        <w:pStyle w:val="TOC2"/>
-        <w:tabs>
-          <w:tab w:val="right" w:leader="dot" w:pos="9016"/>
-        </w:tabs>
-        <w:rPr>
-          <w:rFonts w:asciiTheme="minorHAnsi" w:eastAsiaTheme="minorEastAsia" w:hAnsiTheme="minorHAnsi"/>
-          <w:noProof/>
-          <w:lang w:eastAsia="en-GB"/>
-        </w:rPr>
-      </w:pPr>
-      <w:hyperlink w:anchor="_Toc202813182" w:history="1">
-        <w:r>
-          <w:rPr>
-            <w:rStyle w:val="Hyperlink"/>
-            <w:noProof/>
-          </w:rPr>
-          <w:t>Scraping Program</w:t>
-        </w:r>
-        <w:r>
-          <w:rPr>
-            <w:noProof/>
-            <w:webHidden/>
-          </w:rPr>
-          <w:tab/>
-        </w:r>
-        <w:r>
-          <w:rPr>
-            <w:noProof/>
-            <w:webHidden/>
-          </w:rPr>
-          <w:fldChar w:fldCharType="begin"/>
-        </w:r>
-        <w:r>
-          <w:rPr>
-            <w:noProof/>
-            <w:webHidden/>
-          </w:rPr>
-          <w:instrText xml:space="preserve"> PAGEREF _Toc202813182 \h </w:instrText>
-        </w:r>
-        <w:r>
-          <w:rPr>
-            <w:noProof/>
-            <w:webHidden/>
-          </w:rPr>
-        </w:r>
-        <w:r>
-          <w:rPr>
-            <w:noProof/>
-            <w:webHidden/>
-          </w:rPr>
-          <w:fldChar w:fldCharType="separate"/>
-        </w:r>
-        <w:r>
-          <w:rPr>
-            <w:noProof/>
-            <w:webHidden/>
-          </w:rPr>
-          <w:t>22</w:t>
-        </w:r>
-        <w:r>
-          <w:rPr>
-            <w:noProof/>
-            <w:webHidden/>
-          </w:rPr>
-          <w:fldChar w:fldCharType="end"/>
-        </w:r>
-      </w:hyperlink>
-    </w:p>
-    <w:p>
-      <w:pPr>
-        <w:pStyle w:val="TOC2"/>
-        <w:tabs>
-          <w:tab w:val="right" w:leader="dot" w:pos="9016"/>
-        </w:tabs>
-        <w:rPr>
-          <w:rFonts w:asciiTheme="minorHAnsi" w:eastAsiaTheme="minorEastAsia" w:hAnsiTheme="minorHAnsi"/>
-          <w:noProof/>
-          <w:lang w:eastAsia="en-GB"/>
-        </w:rPr>
-      </w:pPr>
-      <w:hyperlink w:anchor="_Toc202813183" w:history="1">
-        <w:r>
-          <w:rPr>
-            <w:rStyle w:val="Hyperlink"/>
-            <w:noProof/>
-          </w:rPr>
-          <w:t>Data Analysis</w:t>
-        </w:r>
-        <w:r>
-          <w:rPr>
-            <w:noProof/>
-            <w:webHidden/>
-          </w:rPr>
-          <w:tab/>
-        </w:r>
-        <w:r>
-          <w:rPr>
-            <w:noProof/>
-            <w:webHidden/>
-          </w:rPr>
-          <w:fldChar w:fldCharType="begin"/>
-        </w:r>
-        <w:r>
-          <w:rPr>
-            <w:noProof/>
-            <w:webHidden/>
-          </w:rPr>
-          <w:instrText xml:space="preserve"> PAGEREF _Toc202813183 \h </w:instrText>
-        </w:r>
-        <w:r>
-          <w:rPr>
-            <w:noProof/>
-            <w:webHidden/>
-          </w:rPr>
-        </w:r>
-        <w:r>
-          <w:rPr>
-            <w:noProof/>
-            <w:webHidden/>
-          </w:rPr>
-          <w:fldChar w:fldCharType="separate"/>
-        </w:r>
-        <w:r>
-          <w:rPr>
-            <w:noProof/>
-            <w:webHidden/>
-          </w:rPr>
-          <w:t>23</w:t>
-        </w:r>
-        <w:r>
-          <w:rPr>
-            <w:noProof/>
-            <w:webHidden/>
-          </w:rPr>
-          <w:fldChar w:fldCharType="end"/>
-        </w:r>
-      </w:hyperlink>
-    </w:p>
-    <w:p>
-      <w:pPr>
-        <w:pStyle w:val="TOC2"/>
-        <w:tabs>
-          <w:tab w:val="right" w:leader="dot" w:pos="9016"/>
-        </w:tabs>
-        <w:rPr>
-          <w:rFonts w:asciiTheme="minorHAnsi" w:eastAsiaTheme="minorEastAsia" w:hAnsiTheme="minorHAnsi"/>
-          <w:noProof/>
-          <w:lang w:eastAsia="en-GB"/>
-        </w:rPr>
-      </w:pPr>
-      <w:hyperlink w:anchor="_Toc202813184" w:history="1">
-        <w:r>
-          <w:rPr>
-            <w:rStyle w:val="Hyperlink"/>
-            <w:noProof/>
-          </w:rPr>
-          <w:t>MySQL Database</w:t>
-        </w:r>
-        <w:r>
-          <w:rPr>
-            <w:noProof/>
-            <w:webHidden/>
-          </w:rPr>
-          <w:tab/>
-        </w:r>
-        <w:r>
-          <w:rPr>
-            <w:noProof/>
-            <w:webHidden/>
-          </w:rPr>
-          <w:fldChar w:fldCharType="begin"/>
-        </w:r>
-        <w:r>
-          <w:rPr>
-            <w:noProof/>
-            <w:webHidden/>
-          </w:rPr>
-          <w:instrText xml:space="preserve"> PAGEREF _Toc202813184 \h </w:instrText>
-        </w:r>
-        <w:r>
-          <w:rPr>
-            <w:noProof/>
-            <w:webHidden/>
-          </w:rPr>
-        </w:r>
-        <w:r>
-          <w:rPr>
-            <w:noProof/>
-            <w:webHidden/>
-          </w:rPr>
-          <w:fldChar w:fldCharType="separate"/>
-        </w:r>
-        <w:r>
-          <w:rPr>
-            <w:noProof/>
-            <w:webHidden/>
-          </w:rPr>
-          <w:t>24</w:t>
-        </w:r>
-        <w:r>
-          <w:rPr>
-            <w:noProof/>
-            <w:webHidden/>
-          </w:rPr>
-          <w:fldChar w:fldCharType="end"/>
-        </w:r>
-      </w:hyperlink>
-    </w:p>
-    <w:p>
-      <w:pPr>
-        <w:pStyle w:val="TOC2"/>
-        <w:tabs>
-          <w:tab w:val="right" w:leader="dot" w:pos="9016"/>
-        </w:tabs>
-        <w:rPr>
-          <w:rFonts w:asciiTheme="minorHAnsi" w:eastAsiaTheme="minorEastAsia" w:hAnsiTheme="minorHAnsi"/>
-          <w:noProof/>
-          <w:lang w:eastAsia="en-GB"/>
-        </w:rPr>
-      </w:pPr>
-      <w:hyperlink w:anchor="_Toc202813185" w:history="1">
-        <w:r>
-          <w:rPr>
-            <w:rStyle w:val="Hyperlink"/>
-            <w:noProof/>
-          </w:rPr>
-          <w:t>Website</w:t>
-        </w:r>
-        <w:r>
-          <w:rPr>
-            <w:noProof/>
-            <w:webHidden/>
-          </w:rPr>
-          <w:tab/>
-        </w:r>
-        <w:r>
-          <w:rPr>
-            <w:noProof/>
-            <w:webHidden/>
-          </w:rPr>
-          <w:fldChar w:fldCharType="begin"/>
-        </w:r>
-        <w:r>
-          <w:rPr>
-            <w:noProof/>
-            <w:webHidden/>
-          </w:rPr>
-          <w:instrText xml:space="preserve"> PAGEREF _Toc202813185 \h </w:instrText>
-        </w:r>
-        <w:r>
-          <w:rPr>
-            <w:noProof/>
-            <w:webHidden/>
-          </w:rPr>
-        </w:r>
-        <w:r>
-          <w:rPr>
-            <w:noProof/>
-            <w:webHidden/>
-          </w:rPr>
-          <w:fldChar w:fldCharType="separate"/>
-        </w:r>
-        <w:r>
-          <w:rPr>
-            <w:noProof/>
-            <w:webHidden/>
-          </w:rPr>
-          <w:t>25</w:t>
+          <w:t>29</w:t>
         </w:r>
         <w:r>
           <w:rPr>
@@ -1562,13 +2015,13 @@
           <w:lang w:eastAsia="en-GB"/>
         </w:rPr>
       </w:pPr>
-      <w:hyperlink w:anchor="_Toc202813186" w:history="1">
+      <w:hyperlink w:anchor="_Toc202873473" w:history="1">
         <w:r>
           <w:rPr>
             <w:rStyle w:val="Hyperlink"/>
             <w:noProof/>
           </w:rPr>
-          <w:t>Results/Findings</w:t>
+          <w:t>References</w:t>
         </w:r>
         <w:r>
           <w:rPr>
@@ -1589,7 +2042,7 @@
             <w:noProof/>
             <w:webHidden/>
           </w:rPr>
-          <w:instrText xml:space="preserve"> PAGEREF _Toc202813186 \h </w:instrText>
+          <w:instrText xml:space="preserve"> PAGEREF _Toc202873473 \h </w:instrText>
         </w:r>
         <w:r>
           <w:rPr>
@@ -1609,7 +2062,7 @@
             <w:noProof/>
             <w:webHidden/>
           </w:rPr>
-          <w:t>26</w:t>
+          <w:t>30</w:t>
         </w:r>
         <w:r>
           <w:rPr>
@@ -1621,370 +2074,36 @@
       </w:hyperlink>
     </w:p>
     <w:p>
-      <w:pPr>
-        <w:pStyle w:val="TOC2"/>
-        <w:tabs>
-          <w:tab w:val="right" w:leader="dot" w:pos="9016"/>
-        </w:tabs>
-        <w:rPr>
-          <w:rFonts w:asciiTheme="minorHAnsi" w:eastAsiaTheme="minorEastAsia" w:hAnsiTheme="minorHAnsi"/>
-          <w:noProof/>
-          <w:lang w:eastAsia="en-GB"/>
-        </w:rPr>
-      </w:pPr>
-      <w:hyperlink w:anchor="_Toc202813187" w:history="1">
-        <w:r>
-          <w:rPr>
-            <w:rStyle w:val="Hyperlink"/>
-            <w:noProof/>
-          </w:rPr>
-          <w:t>Scraping Program</w:t>
-        </w:r>
-        <w:r>
-          <w:rPr>
-            <w:noProof/>
-            <w:webHidden/>
-          </w:rPr>
-          <w:tab/>
-        </w:r>
-        <w:r>
-          <w:rPr>
-            <w:noProof/>
-            <w:webHidden/>
-          </w:rPr>
-          <w:fldChar w:fldCharType="begin"/>
-        </w:r>
-        <w:r>
-          <w:rPr>
-            <w:noProof/>
-            <w:webHidden/>
-          </w:rPr>
-          <w:instrText xml:space="preserve"> PAGEREF _Toc202813187 \h </w:instrText>
-        </w:r>
-        <w:r>
-          <w:rPr>
-            <w:noProof/>
-            <w:webHidden/>
-          </w:rPr>
-        </w:r>
-        <w:r>
-          <w:rPr>
-            <w:noProof/>
-            <w:webHidden/>
-          </w:rPr>
-          <w:fldChar w:fldCharType="separate"/>
-        </w:r>
-        <w:r>
-          <w:rPr>
-            <w:noProof/>
-            <w:webHidden/>
-          </w:rPr>
-          <w:t>26</w:t>
-        </w:r>
-        <w:r>
-          <w:rPr>
-            <w:noProof/>
-            <w:webHidden/>
-          </w:rPr>
-          <w:fldChar w:fldCharType="end"/>
-        </w:r>
-      </w:hyperlink>
-    </w:p>
-    <w:p>
-      <w:pPr>
-        <w:pStyle w:val="TOC2"/>
-        <w:tabs>
-          <w:tab w:val="right" w:leader="dot" w:pos="9016"/>
-        </w:tabs>
-        <w:rPr>
-          <w:rFonts w:asciiTheme="minorHAnsi" w:eastAsiaTheme="minorEastAsia" w:hAnsiTheme="minorHAnsi"/>
-          <w:noProof/>
-          <w:lang w:eastAsia="en-GB"/>
-        </w:rPr>
-      </w:pPr>
-      <w:hyperlink w:anchor="_Toc202813188" w:history="1">
-        <w:r>
-          <w:rPr>
-            <w:rStyle w:val="Hyperlink"/>
-            <w:noProof/>
-          </w:rPr>
-          <w:t>MySQL Database</w:t>
-        </w:r>
-        <w:r>
-          <w:rPr>
-            <w:noProof/>
-            <w:webHidden/>
-          </w:rPr>
-          <w:tab/>
-        </w:r>
-        <w:r>
-          <w:rPr>
-            <w:noProof/>
-            <w:webHidden/>
-          </w:rPr>
-          <w:fldChar w:fldCharType="begin"/>
-        </w:r>
-        <w:r>
-          <w:rPr>
-            <w:noProof/>
-            <w:webHidden/>
-          </w:rPr>
-          <w:instrText xml:space="preserve"> PAGEREF _Toc202813188 \h </w:instrText>
-        </w:r>
-        <w:r>
-          <w:rPr>
-            <w:noProof/>
-            <w:webHidden/>
-          </w:rPr>
-        </w:r>
-        <w:r>
-          <w:rPr>
-            <w:noProof/>
-            <w:webHidden/>
-          </w:rPr>
-          <w:fldChar w:fldCharType="separate"/>
-        </w:r>
-        <w:r>
-          <w:rPr>
-            <w:noProof/>
-            <w:webHidden/>
-          </w:rPr>
-          <w:t>27</w:t>
-        </w:r>
-        <w:r>
-          <w:rPr>
-            <w:noProof/>
-            <w:webHidden/>
-          </w:rPr>
-          <w:fldChar w:fldCharType="end"/>
-        </w:r>
-      </w:hyperlink>
-    </w:p>
-    <w:p>
-      <w:pPr>
-        <w:pStyle w:val="TOC2"/>
-        <w:tabs>
-          <w:tab w:val="right" w:leader="dot" w:pos="9016"/>
-        </w:tabs>
-        <w:rPr>
-          <w:rFonts w:asciiTheme="minorHAnsi" w:eastAsiaTheme="minorEastAsia" w:hAnsiTheme="minorHAnsi"/>
-          <w:noProof/>
-          <w:lang w:eastAsia="en-GB"/>
-        </w:rPr>
-      </w:pPr>
-      <w:hyperlink w:anchor="_Toc202813189" w:history="1">
-        <w:r>
-          <w:rPr>
-            <w:rStyle w:val="Hyperlink"/>
-            <w:noProof/>
-          </w:rPr>
-          <w:t>Website</w:t>
-        </w:r>
-        <w:r>
-          <w:rPr>
-            <w:noProof/>
-            <w:webHidden/>
-          </w:rPr>
-          <w:tab/>
-        </w:r>
-        <w:r>
-          <w:rPr>
-            <w:noProof/>
-            <w:webHidden/>
-          </w:rPr>
-          <w:fldChar w:fldCharType="begin"/>
-        </w:r>
-        <w:r>
-          <w:rPr>
-            <w:noProof/>
-            <w:webHidden/>
-          </w:rPr>
-          <w:instrText xml:space="preserve"> PAGEREF _Toc202813189 \h </w:instrText>
-        </w:r>
-        <w:r>
-          <w:rPr>
-            <w:noProof/>
-            <w:webHidden/>
-          </w:rPr>
-        </w:r>
-        <w:r>
-          <w:rPr>
-            <w:noProof/>
-            <w:webHidden/>
-          </w:rPr>
-          <w:fldChar w:fldCharType="separate"/>
-        </w:r>
-        <w:r>
-          <w:rPr>
-            <w:noProof/>
-            <w:webHidden/>
-          </w:rPr>
-          <w:t>28</w:t>
-        </w:r>
-        <w:r>
-          <w:rPr>
-            <w:noProof/>
-            <w:webHidden/>
-          </w:rPr>
-          <w:fldChar w:fldCharType="end"/>
-        </w:r>
-      </w:hyperlink>
-    </w:p>
-    <w:p>
-      <w:pPr>
-        <w:pStyle w:val="TOC1"/>
-        <w:tabs>
-          <w:tab w:val="right" w:leader="dot" w:pos="9016"/>
-        </w:tabs>
-        <w:rPr>
-          <w:rFonts w:asciiTheme="minorHAnsi" w:eastAsiaTheme="minorEastAsia" w:hAnsiTheme="minorHAnsi"/>
-          <w:noProof/>
-          <w:lang w:eastAsia="en-GB"/>
-        </w:rPr>
-      </w:pPr>
-      <w:hyperlink w:anchor="_Toc202813190" w:history="1">
-        <w:r>
-          <w:rPr>
-            <w:rStyle w:val="Hyperlink"/>
-            <w:noProof/>
-          </w:rPr>
-          <w:t>Conclusion</w:t>
-        </w:r>
-        <w:r>
-          <w:rPr>
-            <w:noProof/>
-            <w:webHidden/>
-          </w:rPr>
-          <w:tab/>
-        </w:r>
-        <w:r>
-          <w:rPr>
-            <w:noProof/>
-            <w:webHidden/>
-          </w:rPr>
-          <w:fldChar w:fldCharType="begin"/>
-        </w:r>
-        <w:r>
-          <w:rPr>
-            <w:noProof/>
-            <w:webHidden/>
-          </w:rPr>
-          <w:instrText xml:space="preserve"> PAGEREF _Toc202813190 \h </w:instrText>
-        </w:r>
-        <w:r>
-          <w:rPr>
-            <w:noProof/>
-            <w:webHidden/>
-          </w:rPr>
-        </w:r>
-        <w:r>
-          <w:rPr>
-            <w:noProof/>
-            <w:webHidden/>
-          </w:rPr>
-          <w:fldChar w:fldCharType="separate"/>
-        </w:r>
-        <w:r>
-          <w:rPr>
-            <w:noProof/>
-            <w:webHidden/>
-          </w:rPr>
-          <w:t>29</w:t>
-        </w:r>
-        <w:r>
-          <w:rPr>
-            <w:noProof/>
-            <w:webHidden/>
-          </w:rPr>
-          <w:fldChar w:fldCharType="end"/>
-        </w:r>
-      </w:hyperlink>
-    </w:p>
-    <w:p>
-      <w:pPr>
-        <w:pStyle w:val="TOC1"/>
-        <w:tabs>
-          <w:tab w:val="right" w:leader="dot" w:pos="9016"/>
-        </w:tabs>
-        <w:rPr>
-          <w:rFonts w:asciiTheme="minorHAnsi" w:eastAsiaTheme="minorEastAsia" w:hAnsiTheme="minorHAnsi"/>
-          <w:noProof/>
-          <w:lang w:eastAsia="en-GB"/>
-        </w:rPr>
-      </w:pPr>
-      <w:hyperlink w:anchor="_Toc202813191" w:history="1">
-        <w:r>
-          <w:rPr>
-            <w:rStyle w:val="Hyperlink"/>
-            <w:noProof/>
-          </w:rPr>
-          <w:t>References</w:t>
-        </w:r>
-        <w:r>
-          <w:rPr>
-            <w:noProof/>
-            <w:webHidden/>
-          </w:rPr>
-          <w:tab/>
-        </w:r>
-        <w:r>
-          <w:rPr>
-            <w:noProof/>
-            <w:webHidden/>
-          </w:rPr>
-          <w:fldChar w:fldCharType="begin"/>
-        </w:r>
-        <w:r>
-          <w:rPr>
-            <w:noProof/>
-            <w:webHidden/>
-          </w:rPr>
-          <w:instrText xml:space="preserve"> PAGEREF _Toc202813191 \h </w:instrText>
-        </w:r>
-        <w:r>
-          <w:rPr>
-            <w:noProof/>
-            <w:webHidden/>
-          </w:rPr>
-        </w:r>
-        <w:r>
-          <w:rPr>
-            <w:noProof/>
-            <w:webHidden/>
-          </w:rPr>
-          <w:fldChar w:fldCharType="separate"/>
-        </w:r>
-        <w:r>
-          <w:rPr>
-            <w:noProof/>
-            <w:webHidden/>
-          </w:rPr>
-          <w:t>30</w:t>
-        </w:r>
-        <w:r>
-          <w:rPr>
-            <w:noProof/>
-            <w:webHidden/>
-          </w:rPr>
-          <w:fldChar w:fldCharType="end"/>
-        </w:r>
-      </w:hyperlink>
-    </w:p>
-    <w:p>
       <w:r>
         <w:fldChar w:fldCharType="end"/>
       </w:r>
-    </w:p>
-    <w:p>
       <w:r>
         <w:br w:type="page"/>
       </w:r>
     </w:p>
     <w:p>
+      <w:fldSimple w:instr=" TOC \h \z \c &quot;Figure&quot; ">
+        <w:r>
+          <w:rPr>
+            <w:b/>
+            <w:bCs/>
+            <w:noProof/>
+            <w:lang w:val="en-US"/>
+          </w:rPr>
+          <w:t>No table of figures entries found.</w:t>
+        </w:r>
+      </w:fldSimple>
+    </w:p>
+    <w:p>
+      <w:r>
+        <w:br w:type="page"/>
+      </w:r>
+    </w:p>
+    <w:p>
       <w:pPr>
         <w:pStyle w:val="Heading1"/>
       </w:pPr>
-      <w:bookmarkStart w:id="0" w:name="_Toc202813165"/>
+      <w:bookmarkStart w:id="0" w:name="_Toc202873446"/>
       <w:r>
         <w:lastRenderedPageBreak/>
         <w:t>Introduction</w:t>
@@ -2059,10 +2178,10 @@
       <w:pPr>
         <w:pStyle w:val="Heading1"/>
       </w:pPr>
-      <w:bookmarkStart w:id="1" w:name="_Toc202813166"/>
+      <w:bookmarkStart w:id="1" w:name="_Toc202873447"/>
       <w:r>
         <w:lastRenderedPageBreak/>
-        <w:t>Design and Planning</w:t>
+        <w:t>Literature Review</w:t>
       </w:r>
       <w:bookmarkEnd w:id="1"/>
     </w:p>
@@ -2070,7 +2189,7 @@
       <w:pPr>
         <w:pStyle w:val="Heading2"/>
       </w:pPr>
-      <w:bookmarkStart w:id="2" w:name="_Toc202813167"/>
+      <w:bookmarkStart w:id="2" w:name="_Toc202873448"/>
       <w:r>
         <w:t>Why a Tagging Website?</w:t>
       </w:r>
@@ -2312,7 +2431,7 @@
       <w:pPr>
         <w:pStyle w:val="Heading2"/>
       </w:pPr>
-      <w:bookmarkStart w:id="3" w:name="_Toc202813168"/>
+      <w:bookmarkStart w:id="3" w:name="_Toc202873449"/>
       <w:r>
         <w:lastRenderedPageBreak/>
         <w:t>What is</w:t>
@@ -2429,7 +2548,7 @@
       <w:pPr>
         <w:pStyle w:val="Heading2"/>
       </w:pPr>
-      <w:bookmarkStart w:id="4" w:name="_Toc202813169"/>
+      <w:bookmarkStart w:id="4" w:name="_Toc202873450"/>
       <w:r>
         <w:lastRenderedPageBreak/>
         <w:t>Legal and Security Issues</w:t>
@@ -2440,7 +2559,7 @@
       <w:pPr>
         <w:pStyle w:val="Heading3"/>
       </w:pPr>
-      <w:bookmarkStart w:id="5" w:name="_Toc202813170"/>
+      <w:bookmarkStart w:id="5" w:name="_Toc202873451"/>
       <w:r>
         <w:t>GDPR</w:t>
       </w:r>
@@ -2689,7 +2808,7 @@
       <w:pPr>
         <w:pStyle w:val="Heading3"/>
       </w:pPr>
-      <w:bookmarkStart w:id="6" w:name="_Toc202813171"/>
+      <w:bookmarkStart w:id="6" w:name="_Toc202873452"/>
       <w:r>
         <w:lastRenderedPageBreak/>
         <w:t>Computer Misuse Act 1990</w:t>
@@ -2768,7 +2887,7 @@
       <w:pPr>
         <w:pStyle w:val="Heading3"/>
       </w:pPr>
-      <w:bookmarkStart w:id="7" w:name="_Toc202813172"/>
+      <w:bookmarkStart w:id="7" w:name="_Toc202873453"/>
       <w:r>
         <w:lastRenderedPageBreak/>
         <w:t>STRIDE</w:t>
@@ -3239,7 +3358,7 @@
           <w:szCs w:val="20"/>
         </w:rPr>
       </w:pPr>
-      <w:bookmarkStart w:id="8" w:name="_Toc202813173"/>
+      <w:bookmarkStart w:id="8" w:name="_Toc202873454"/>
       <w:r>
         <w:lastRenderedPageBreak/>
         <w:t>Ad-Hoc</w:t>
@@ -3285,6 +3404,11 @@
       <w:r>
         <w:t>:</w:t>
       </w:r>
+    </w:p>
+    <w:p>
+      <w:pPr>
+        <w:jc w:val="center"/>
+      </w:pPr>
     </w:p>
     <w:p>
       <w:pPr>
@@ -3295,10 +3419,10 @@
           <w:noProof/>
         </w:rPr>
         <w:drawing>
-          <wp:inline distT="0" distB="0" distL="0" distR="0" wp14:anchorId="13167983" wp14:editId="60404199">
-            <wp:extent cx="4781550" cy="2545917"/>
-            <wp:effectExtent l="38100" t="38100" r="38100" b="45085"/>
-            <wp:docPr id="1727231612" name="Picture 1" descr="A screenshot of a computer&#10;&#10;AI-generated content may be incorrect."/>
+          <wp:inline distT="0" distB="0" distL="0" distR="0" wp14:anchorId="38673157" wp14:editId="5C7F8DC1">
+            <wp:extent cx="1566936" cy="3086100"/>
+            <wp:effectExtent l="38100" t="38100" r="33655" b="38100"/>
+            <wp:docPr id="1335605883" name="Picture 2"/>
             <wp:cNvGraphicFramePr>
               <a:graphicFrameLocks xmlns:a="http://schemas.openxmlformats.org/drawingml/2006/main" noChangeAspect="1"/>
             </wp:cNvGraphicFramePr>
@@ -3306,7 +3430,7 @@
               <a:graphicData uri="http://schemas.openxmlformats.org/drawingml/2006/picture">
                 <pic:pic xmlns:pic="http://schemas.openxmlformats.org/drawingml/2006/picture">
                   <pic:nvPicPr>
-                    <pic:cNvPr id="1727231612" name="Picture 1" descr="A screenshot of a computer&#10;&#10;AI-generated content may be incorrect."/>
+                    <pic:cNvPr id="0" name="Picture 2"/>
                     <pic:cNvPicPr>
                       <a:picLocks noChangeAspect="1" noChangeArrowheads="1"/>
                     </pic:cNvPicPr>
@@ -3327,67 +3451,7 @@
                   <pic:spPr bwMode="auto">
                     <a:xfrm>
                       <a:off x="0" y="0"/>
-                      <a:ext cx="4790199" cy="2550522"/>
-                    </a:xfrm>
-                    <a:prstGeom prst="rect">
-                      <a:avLst/>
-                    </a:prstGeom>
-                    <a:noFill/>
-                    <a:ln w="38100">
-                      <a:solidFill>
-                        <a:schemeClr val="accent4"/>
-                      </a:solidFill>
-                    </a:ln>
-                  </pic:spPr>
-                </pic:pic>
-              </a:graphicData>
-            </a:graphic>
-          </wp:inline>
-        </w:drawing>
-      </w:r>
-    </w:p>
-    <w:p>
-      <w:pPr>
-        <w:jc w:val="center"/>
-      </w:pPr>
-      <w:r>
-        <w:rPr>
-          <w:noProof/>
-        </w:rPr>
-        <w:drawing>
-          <wp:inline distT="0" distB="0" distL="0" distR="0" wp14:anchorId="38673157" wp14:editId="69E12B43">
-            <wp:extent cx="1566936" cy="3086100"/>
-            <wp:effectExtent l="38100" t="38100" r="33655" b="38100"/>
-            <wp:docPr id="1335605883" name="Picture 2"/>
-            <wp:cNvGraphicFramePr>
-              <a:graphicFrameLocks xmlns:a="http://schemas.openxmlformats.org/drawingml/2006/main" noChangeAspect="1"/>
-            </wp:cNvGraphicFramePr>
-            <a:graphic xmlns:a="http://schemas.openxmlformats.org/drawingml/2006/main">
-              <a:graphicData uri="http://schemas.openxmlformats.org/drawingml/2006/picture">
-                <pic:pic xmlns:pic="http://schemas.openxmlformats.org/drawingml/2006/picture">
-                  <pic:nvPicPr>
-                    <pic:cNvPr id="0" name="Picture 2"/>
-                    <pic:cNvPicPr>
-                      <a:picLocks noChangeAspect="1" noChangeArrowheads="1"/>
-                    </pic:cNvPicPr>
-                  </pic:nvPicPr>
-                  <pic:blipFill>
-                    <a:blip r:embed="rId7">
-                      <a:extLst>
-                        <a:ext uri="{28A0092B-C50C-407E-A947-70E740481C1C}">
-                          <a14:useLocalDpi xmlns:a14="http://schemas.microsoft.com/office/drawing/2010/main" val="0"/>
-                        </a:ext>
-                      </a:extLst>
-                    </a:blip>
-                    <a:srcRect/>
-                    <a:stretch>
-                      <a:fillRect/>
-                    </a:stretch>
-                  </pic:blipFill>
-                  <pic:spPr bwMode="auto">
-                    <a:xfrm>
-                      <a:off x="0" y="0"/>
-                      <a:ext cx="1571162" cy="3094423"/>
+                      <a:ext cx="1566936" cy="3086100"/>
                     </a:xfrm>
                     <a:prstGeom prst="rect">
                       <a:avLst/>
@@ -3430,7 +3494,7 @@
                     </pic:cNvPicPr>
                   </pic:nvPicPr>
                   <pic:blipFill>
-                    <a:blip r:embed="rId8">
+                    <a:blip r:embed="rId7">
                       <a:extLst>
                         <a:ext uri="{28A0092B-C50C-407E-A947-70E740481C1C}">
                           <a14:useLocalDpi xmlns:a14="http://schemas.microsoft.com/office/drawing/2010/main" val="0"/>
@@ -3463,18 +3527,12 @@
           </wp:inline>
         </w:drawing>
       </w:r>
-    </w:p>
-    <w:p>
-      <w:pPr>
-        <w:jc w:val="center"/>
-      </w:pPr>
       <w:r>
         <w:rPr>
           <w:noProof/>
         </w:rPr>
-        <w:lastRenderedPageBreak/>
         <w:drawing>
-          <wp:inline distT="0" distB="0" distL="0" distR="0" wp14:anchorId="20BC6DF3" wp14:editId="32B4A305">
+          <wp:inline distT="0" distB="0" distL="0" distR="0" wp14:anchorId="6889AF94" wp14:editId="0521B116">
             <wp:extent cx="2390924" cy="2428875"/>
             <wp:effectExtent l="38100" t="38100" r="47625" b="28575"/>
             <wp:docPr id="1629302814" name="Picture 4" descr="A screenshot of a computer&#10;&#10;AI-generated content may be incorrect."/>
@@ -3491,7 +3549,7 @@
                     </pic:cNvPicPr>
                   </pic:nvPicPr>
                   <pic:blipFill>
-                    <a:blip r:embed="rId9">
+                    <a:blip r:embed="rId8">
                       <a:extLst>
                         <a:ext uri="{28A0092B-C50C-407E-A947-70E740481C1C}">
                           <a14:useLocalDpi xmlns:a14="http://schemas.microsoft.com/office/drawing/2010/main" val="0"/>
@@ -3524,121 +3582,16 @@
           </wp:inline>
         </w:drawing>
       </w:r>
-      <w:r>
-        <w:rPr>
-          <w:noProof/>
-        </w:rPr>
-        <w:drawing>
-          <wp:inline distT="0" distB="0" distL="0" distR="0" wp14:anchorId="48932937" wp14:editId="3798BB18">
-            <wp:extent cx="2476500" cy="2332517"/>
-            <wp:effectExtent l="38100" t="38100" r="38100" b="29845"/>
-            <wp:docPr id="1674870808" name="Picture 5" descr="A screenshot of a video game&#10;&#10;AI-generated content may be incorrect."/>
-            <wp:cNvGraphicFramePr>
-              <a:graphicFrameLocks xmlns:a="http://schemas.openxmlformats.org/drawingml/2006/main" noChangeAspect="1"/>
-            </wp:cNvGraphicFramePr>
-            <a:graphic xmlns:a="http://schemas.openxmlformats.org/drawingml/2006/main">
-              <a:graphicData uri="http://schemas.openxmlformats.org/drawingml/2006/picture">
-                <pic:pic xmlns:pic="http://schemas.openxmlformats.org/drawingml/2006/picture">
-                  <pic:nvPicPr>
-                    <pic:cNvPr id="1674870808" name="Picture 5" descr="A screenshot of a video game&#10;&#10;AI-generated content may be incorrect."/>
-                    <pic:cNvPicPr>
-                      <a:picLocks noChangeAspect="1" noChangeArrowheads="1"/>
-                    </pic:cNvPicPr>
-                  </pic:nvPicPr>
-                  <pic:blipFill>
-                    <a:blip r:embed="rId10" cstate="print">
-                      <a:extLst>
-                        <a:ext uri="{28A0092B-C50C-407E-A947-70E740481C1C}">
-                          <a14:useLocalDpi xmlns:a14="http://schemas.microsoft.com/office/drawing/2010/main" val="0"/>
-                        </a:ext>
-                      </a:extLst>
-                    </a:blip>
-                    <a:srcRect/>
-                    <a:stretch>
-                      <a:fillRect/>
-                    </a:stretch>
-                  </pic:blipFill>
-                  <pic:spPr bwMode="auto">
-                    <a:xfrm>
-                      <a:off x="0" y="0"/>
-                      <a:ext cx="2489799" cy="2345043"/>
-                    </a:xfrm>
-                    <a:prstGeom prst="rect">
-                      <a:avLst/>
-                    </a:prstGeom>
-                    <a:noFill/>
-                    <a:ln w="38100">
-                      <a:solidFill>
-                        <a:schemeClr val="accent4"/>
-                      </a:solidFill>
-                    </a:ln>
-                  </pic:spPr>
-                </pic:pic>
-              </a:graphicData>
-            </a:graphic>
-          </wp:inline>
-        </w:drawing>
-      </w:r>
     </w:p>
     <w:p>
       <w:pPr>
         <w:jc w:val="center"/>
       </w:pPr>
-      <w:r>
-        <w:rPr>
-          <w:noProof/>
-        </w:rPr>
-        <w:drawing>
-          <wp:inline distT="0" distB="0" distL="0" distR="0" wp14:anchorId="6FD1F241" wp14:editId="4EEBEAF0">
-            <wp:extent cx="4476750" cy="2145265"/>
-            <wp:effectExtent l="38100" t="38100" r="38100" b="45720"/>
-            <wp:docPr id="1636351976" name="Picture 6"/>
-            <wp:cNvGraphicFramePr>
-              <a:graphicFrameLocks xmlns:a="http://schemas.openxmlformats.org/drawingml/2006/main" noChangeAspect="1"/>
-            </wp:cNvGraphicFramePr>
-            <a:graphic xmlns:a="http://schemas.openxmlformats.org/drawingml/2006/main">
-              <a:graphicData uri="http://schemas.openxmlformats.org/drawingml/2006/picture">
-                <pic:pic xmlns:pic="http://schemas.openxmlformats.org/drawingml/2006/picture">
-                  <pic:nvPicPr>
-                    <pic:cNvPr id="0" name="Picture 6"/>
-                    <pic:cNvPicPr>
-                      <a:picLocks noChangeAspect="1" noChangeArrowheads="1"/>
-                    </pic:cNvPicPr>
-                  </pic:nvPicPr>
-                  <pic:blipFill>
-                    <a:blip r:embed="rId11">
-                      <a:extLst>
-                        <a:ext uri="{28A0092B-C50C-407E-A947-70E740481C1C}">
-                          <a14:useLocalDpi xmlns:a14="http://schemas.microsoft.com/office/drawing/2010/main" val="0"/>
-                        </a:ext>
-                      </a:extLst>
-                    </a:blip>
-                    <a:srcRect/>
-                    <a:stretch>
-                      <a:fillRect/>
-                    </a:stretch>
-                  </pic:blipFill>
-                  <pic:spPr bwMode="auto">
-                    <a:xfrm>
-                      <a:off x="0" y="0"/>
-                      <a:ext cx="4481202" cy="2147398"/>
-                    </a:xfrm>
-                    <a:prstGeom prst="rect">
-                      <a:avLst/>
-                    </a:prstGeom>
-                    <a:noFill/>
-                    <a:ln w="38100">
-                      <a:solidFill>
-                        <a:schemeClr val="accent4"/>
-                      </a:solidFill>
-                    </a:ln>
-                  </pic:spPr>
-                </pic:pic>
-              </a:graphicData>
-            </a:graphic>
-          </wp:inline>
-        </w:drawing>
-      </w:r>
+    </w:p>
+    <w:p>
+      <w:pPr>
+        <w:jc w:val="center"/>
+      </w:pPr>
     </w:p>
     <w:p>
       <w:r>
@@ -3671,7 +3624,7 @@
                     </pic:cNvPicPr>
                   </pic:nvPicPr>
                   <pic:blipFill>
-                    <a:blip r:embed="rId12">
+                    <a:blip r:embed="rId9">
                       <a:extLst>
                         <a:ext uri="{28A0092B-C50C-407E-A947-70E740481C1C}">
                           <a14:useLocalDpi xmlns:a14="http://schemas.microsoft.com/office/drawing/2010/main" val="0"/>
@@ -3717,9 +3670,9 @@
     </w:p>
     <w:p>
       <w:pPr>
-        <w:pStyle w:val="Heading2"/>
-      </w:pPr>
-      <w:bookmarkStart w:id="9" w:name="_Toc202813174"/>
+        <w:pStyle w:val="Heading1"/>
+      </w:pPr>
+      <w:bookmarkStart w:id="9" w:name="_Toc202873455"/>
       <w:r>
         <w:lastRenderedPageBreak/>
         <w:t>Methodology</w:t>
@@ -3752,7 +3705,7 @@
                     </pic:cNvPicPr>
                   </pic:nvPicPr>
                   <pic:blipFill>
-                    <a:blip r:embed="rId13">
+                    <a:blip r:embed="rId10">
                       <a:extLst>
                         <a:ext uri="{28A0092B-C50C-407E-A947-70E740481C1C}">
                           <a14:useLocalDpi xmlns:a14="http://schemas.microsoft.com/office/drawing/2010/main" val="0"/>
@@ -3808,15 +3761,7 @@
         </w:numPr>
       </w:pPr>
       <w:r>
-        <w:t>Scraping program: As previously described, this program will go over the target website (in this case, Steam</w:t>
-      </w:r>
-      <w:proofErr w:type="gramStart"/>
-      <w:r>
-        <w:t>), and</w:t>
-      </w:r>
-      <w:proofErr w:type="gramEnd"/>
-      <w:r>
-        <w:t xml:space="preserve"> collect data about various video games. This should be limited to low number of video games to avoid affecting Steam with high amounts of traffic and to avoid the possibility of running out of storage or the program taking too long.</w:t>
+        <w:t>Scraping program: As previously described, this program will go over the target website (in this case, Steam), and collect data about various video games. This should be limited to low number of video games to avoid affecting Steam with high amounts of traffic and to avoid the possibility of running out of storage or the program taking too long.</w:t>
       </w:r>
     </w:p>
     <w:p>
@@ -3867,24 +3812,34 @@
     </w:p>
     <w:p>
       <w:pPr>
+        <w:pStyle w:val="Heading1"/>
+      </w:pPr>
+      <w:bookmarkStart w:id="10" w:name="_Toc202873456"/>
+      <w:r>
+        <w:lastRenderedPageBreak/>
+        <w:t>Design/Plan</w:t>
+      </w:r>
+      <w:bookmarkEnd w:id="10"/>
+    </w:p>
+    <w:p>
+      <w:pPr>
         <w:pStyle w:val="Heading2"/>
       </w:pPr>
-      <w:bookmarkStart w:id="10" w:name="_Toc202813175"/>
-      <w:r>
-        <w:lastRenderedPageBreak/>
+      <w:bookmarkStart w:id="11" w:name="_Toc202873457"/>
+      <w:r>
         <w:t>Data Plan</w:t>
       </w:r>
-      <w:bookmarkEnd w:id="10"/>
+      <w:bookmarkEnd w:id="11"/>
     </w:p>
     <w:p>
       <w:pPr>
         <w:pStyle w:val="Heading3"/>
       </w:pPr>
-      <w:bookmarkStart w:id="11" w:name="_Toc202813176"/>
+      <w:bookmarkStart w:id="12" w:name="_Toc202873458"/>
       <w:r>
         <w:t>Target Website</w:t>
       </w:r>
-      <w:bookmarkEnd w:id="11"/>
+      <w:bookmarkEnd w:id="12"/>
     </w:p>
     <w:p>
       <w:r>
@@ -3909,7 +3864,7 @@
                     </pic:cNvPicPr>
                   </pic:nvPicPr>
                   <pic:blipFill>
-                    <a:blip r:embed="rId14">
+                    <a:blip r:embed="rId11">
                       <a:extLst>
                         <a:ext uri="{28A0092B-C50C-407E-A947-70E740481C1C}">
                           <a14:useLocalDpi xmlns:a14="http://schemas.microsoft.com/office/drawing/2010/main" val="0"/>
@@ -3967,12 +3922,12 @@
       <w:pPr>
         <w:pStyle w:val="Heading3"/>
       </w:pPr>
-      <w:bookmarkStart w:id="12" w:name="_Toc202813177"/>
+      <w:bookmarkStart w:id="13" w:name="_Toc202873459"/>
       <w:r>
         <w:lastRenderedPageBreak/>
         <w:t>Scraping</w:t>
       </w:r>
-      <w:bookmarkEnd w:id="12"/>
+      <w:bookmarkEnd w:id="13"/>
     </w:p>
     <w:p>
       <w:r>
@@ -4360,12 +4315,12 @@
       <w:pPr>
         <w:pStyle w:val="Heading3"/>
       </w:pPr>
-      <w:bookmarkStart w:id="13" w:name="_Toc202813178"/>
+      <w:bookmarkStart w:id="14" w:name="_Toc202873460"/>
       <w:r>
         <w:lastRenderedPageBreak/>
         <w:t>Saving Format (.CSV)</w:t>
       </w:r>
-      <w:bookmarkEnd w:id="13"/>
+      <w:bookmarkEnd w:id="14"/>
     </w:p>
     <w:p>
       <w:r>
@@ -4403,12 +4358,12 @@
       <w:pPr>
         <w:pStyle w:val="Heading3"/>
       </w:pPr>
-      <w:bookmarkStart w:id="14" w:name="_Toc202813179"/>
+      <w:bookmarkStart w:id="15" w:name="_Toc202873461"/>
       <w:r>
         <w:lastRenderedPageBreak/>
         <w:t>Database (MySQL)</w:t>
       </w:r>
-      <w:bookmarkEnd w:id="14"/>
+      <w:bookmarkEnd w:id="15"/>
     </w:p>
     <w:p>
       <w:r>
@@ -4477,7 +4432,7 @@
                     </pic:cNvPicPr>
                   </pic:nvPicPr>
                   <pic:blipFill>
-                    <a:blip r:embed="rId15" cstate="print">
+                    <a:blip r:embed="rId12" cstate="print">
                       <a:extLst>
                         <a:ext uri="{28A0092B-C50C-407E-A947-70E740481C1C}">
                           <a14:useLocalDpi xmlns:a14="http://schemas.microsoft.com/office/drawing/2010/main" val="0"/>
@@ -4558,7 +4513,7 @@
                     </pic:cNvPicPr>
                   </pic:nvPicPr>
                   <pic:blipFill>
-                    <a:blip r:embed="rId16">
+                    <a:blip r:embed="rId13">
                       <a:extLst>
                         <a:ext uri="{28A0092B-C50C-407E-A947-70E740481C1C}">
                           <a14:useLocalDpi xmlns:a14="http://schemas.microsoft.com/office/drawing/2010/main" val="0"/>
@@ -4606,12 +4561,12 @@
       <w:pPr>
         <w:pStyle w:val="Heading1"/>
       </w:pPr>
-      <w:bookmarkStart w:id="15" w:name="_Toc202813180"/>
+      <w:bookmarkStart w:id="16" w:name="_Toc202873462"/>
       <w:r>
         <w:lastRenderedPageBreak/>
         <w:t>Scraping Practice</w:t>
       </w:r>
-      <w:bookmarkEnd w:id="15"/>
+      <w:bookmarkEnd w:id="16"/>
     </w:p>
     <w:p>
       <w:r>
@@ -4668,15 +4623,7 @@
       </w:r>
       <w:proofErr w:type="gramEnd"/>
       <w:r>
-        <w:t xml:space="preserve"> the links are looped </w:t>
-      </w:r>
-      <w:proofErr w:type="gramStart"/>
-      <w:r>
-        <w:t>through</w:t>
-      </w:r>
-      <w:proofErr w:type="gramEnd"/>
-      <w:r>
-        <w:t xml:space="preserve"> and both programs visit the pages they hold. Once on each page, three elements are found, with those being:</w:t>
+        <w:t xml:space="preserve"> the links are looped through and both programs visit the pages they hold. Once on each page, three elements are found, with those being:</w:t>
       </w:r>
     </w:p>
     <w:p>
@@ -4812,7 +4759,7 @@
                     </pic:cNvPicPr>
                   </pic:nvPicPr>
                   <pic:blipFill>
-                    <a:blip r:embed="rId17">
+                    <a:blip r:embed="rId14">
                       <a:extLst>
                         <a:ext uri="{28A0092B-C50C-407E-A947-70E740481C1C}">
                           <a14:useLocalDpi xmlns:a14="http://schemas.microsoft.com/office/drawing/2010/main" val="0"/>
@@ -4883,7 +4830,7 @@
           <w:noProof/>
         </w:rPr>
         <w:drawing>
-          <wp:inline distT="0" distB="0" distL="0" distR="0" wp14:anchorId="40ABE2E5" wp14:editId="7B09874E">
+          <wp:inline distT="0" distB="0" distL="0" distR="0" wp14:anchorId="40ABE2E5" wp14:editId="7B02BFCC">
             <wp:extent cx="4162425" cy="1246650"/>
             <wp:effectExtent l="38100" t="38100" r="28575" b="29845"/>
             <wp:docPr id="1701288164" name="Picture 2" descr="A computer screen with text on it&#10;&#10;AI-generated content may be incorrect."/>
@@ -4900,7 +4847,7 @@
                     </pic:cNvPicPr>
                   </pic:nvPicPr>
                   <pic:blipFill>
-                    <a:blip r:embed="rId18" cstate="print">
+                    <a:blip r:embed="rId15" cstate="print">
                       <a:extLst>
                         <a:ext uri="{28A0092B-C50C-407E-A947-70E740481C1C}">
                           <a14:useLocalDpi xmlns:a14="http://schemas.microsoft.com/office/drawing/2010/main" val="0"/>
@@ -4984,7 +4931,7 @@
                     </pic:cNvPicPr>
                   </pic:nvPicPr>
                   <pic:blipFill>
-                    <a:blip r:embed="rId19">
+                    <a:blip r:embed="rId16">
                       <a:extLst>
                         <a:ext uri="{28A0092B-C50C-407E-A947-70E740481C1C}">
                           <a14:useLocalDpi xmlns:a14="http://schemas.microsoft.com/office/drawing/2010/main" val="0"/>
@@ -5081,7 +5028,7 @@
       <w:pPr>
         <w:pStyle w:val="Heading1"/>
       </w:pPr>
-      <w:bookmarkStart w:id="16" w:name="_Toc202813181"/>
+      <w:bookmarkStart w:id="17" w:name="_Toc202873463"/>
       <w:r>
         <w:lastRenderedPageBreak/>
         <w:t>Development</w:t>
@@ -5089,17 +5036,17 @@
       <w:r>
         <w:t xml:space="preserve"> &amp; Data Analysis</w:t>
       </w:r>
-      <w:bookmarkEnd w:id="16"/>
+      <w:bookmarkEnd w:id="17"/>
     </w:p>
     <w:p>
       <w:pPr>
         <w:pStyle w:val="Heading2"/>
       </w:pPr>
-      <w:bookmarkStart w:id="17" w:name="_Toc202813182"/>
+      <w:bookmarkStart w:id="18" w:name="_Toc202873464"/>
       <w:r>
         <w:t>Scraping Program</w:t>
       </w:r>
-      <w:bookmarkEnd w:id="17"/>
+      <w:bookmarkEnd w:id="18"/>
     </w:p>
     <w:p/>
     <w:p>
@@ -5111,12 +5058,12 @@
       <w:pPr>
         <w:pStyle w:val="Heading2"/>
       </w:pPr>
-      <w:bookmarkStart w:id="18" w:name="_Toc202813183"/>
+      <w:bookmarkStart w:id="19" w:name="_Toc202873465"/>
       <w:r>
         <w:lastRenderedPageBreak/>
         <w:t>Data Analysis</w:t>
       </w:r>
-      <w:bookmarkEnd w:id="18"/>
+      <w:bookmarkEnd w:id="19"/>
     </w:p>
     <w:p>
       <w:r>
@@ -5127,12 +5074,12 @@
       <w:pPr>
         <w:pStyle w:val="Heading2"/>
       </w:pPr>
-      <w:bookmarkStart w:id="19" w:name="_Toc202813184"/>
+      <w:bookmarkStart w:id="20" w:name="_Toc202873466"/>
       <w:r>
         <w:lastRenderedPageBreak/>
         <w:t>MySQL Database</w:t>
       </w:r>
-      <w:bookmarkEnd w:id="19"/>
+      <w:bookmarkEnd w:id="20"/>
     </w:p>
     <w:p/>
     <w:p>
@@ -5144,12 +5091,12 @@
       <w:pPr>
         <w:pStyle w:val="Heading2"/>
       </w:pPr>
-      <w:bookmarkStart w:id="20" w:name="_Toc202813185"/>
+      <w:bookmarkStart w:id="21" w:name="_Toc202873467"/>
       <w:r>
         <w:lastRenderedPageBreak/>
         <w:t>Website</w:t>
       </w:r>
-      <w:bookmarkEnd w:id="20"/>
+      <w:bookmarkEnd w:id="21"/>
     </w:p>
     <w:p/>
     <w:p>
@@ -5161,22 +5108,22 @@
       <w:pPr>
         <w:pStyle w:val="Heading1"/>
       </w:pPr>
-      <w:bookmarkStart w:id="21" w:name="_Toc202813186"/>
+      <w:bookmarkStart w:id="22" w:name="_Toc202873468"/>
       <w:r>
         <w:lastRenderedPageBreak/>
         <w:t>Results/Findings</w:t>
       </w:r>
-      <w:bookmarkEnd w:id="21"/>
+      <w:bookmarkEnd w:id="22"/>
     </w:p>
     <w:p>
       <w:pPr>
         <w:pStyle w:val="Heading2"/>
       </w:pPr>
-      <w:bookmarkStart w:id="22" w:name="_Toc202813187"/>
+      <w:bookmarkStart w:id="23" w:name="_Toc202873469"/>
       <w:r>
         <w:t>Scraping Program</w:t>
       </w:r>
-      <w:bookmarkEnd w:id="22"/>
+      <w:bookmarkEnd w:id="23"/>
     </w:p>
     <w:p/>
     <w:p>
@@ -5188,12 +5135,12 @@
       <w:pPr>
         <w:pStyle w:val="Heading2"/>
       </w:pPr>
-      <w:bookmarkStart w:id="23" w:name="_Toc202813188"/>
+      <w:bookmarkStart w:id="24" w:name="_Toc202873470"/>
       <w:r>
         <w:lastRenderedPageBreak/>
         <w:t>MySQL Database</w:t>
       </w:r>
-      <w:bookmarkEnd w:id="23"/>
+      <w:bookmarkEnd w:id="24"/>
     </w:p>
     <w:p/>
     <w:p>
@@ -5205,12 +5152,12 @@
       <w:pPr>
         <w:pStyle w:val="Heading2"/>
       </w:pPr>
-      <w:bookmarkStart w:id="24" w:name="_Toc202813189"/>
+      <w:bookmarkStart w:id="25" w:name="_Toc202873471"/>
       <w:r>
         <w:lastRenderedPageBreak/>
         <w:t>Website</w:t>
       </w:r>
-      <w:bookmarkEnd w:id="24"/>
+      <w:bookmarkEnd w:id="25"/>
     </w:p>
     <w:p/>
     <w:p>
@@ -5222,12 +5169,12 @@
       <w:pPr>
         <w:pStyle w:val="Heading1"/>
       </w:pPr>
-      <w:bookmarkStart w:id="25" w:name="_Toc202813190"/>
+      <w:bookmarkStart w:id="26" w:name="_Toc202873472"/>
       <w:r>
         <w:lastRenderedPageBreak/>
         <w:t>Conclusion</w:t>
       </w:r>
-      <w:bookmarkEnd w:id="25"/>
+      <w:bookmarkEnd w:id="26"/>
     </w:p>
     <w:p/>
     <w:p>
@@ -5239,12 +5186,12 @@
       <w:pPr>
         <w:pStyle w:val="Heading1"/>
       </w:pPr>
-      <w:bookmarkStart w:id="26" w:name="_Toc202813191"/>
+      <w:bookmarkStart w:id="27" w:name="_Toc202873473"/>
       <w:r>
         <w:lastRenderedPageBreak/>
         <w:t>References</w:t>
       </w:r>
-      <w:bookmarkEnd w:id="26"/>
+      <w:bookmarkEnd w:id="27"/>
     </w:p>
     <w:p>
       <w:pPr>
@@ -5263,7 +5210,7 @@
       <w:r>
         <w:t xml:space="preserve">. Beautiful Soup. </w:t>
       </w:r>
-      <w:hyperlink r:id="rId20" w:history="1">
+      <w:hyperlink r:id="rId17" w:history="1">
         <w:r>
           <w:rPr>
             <w:rStyle w:val="Hyperlink"/>
@@ -5300,7 +5247,7 @@
       <w:r>
         <w:t xml:space="preserve"> AJNR, 34(6), 1111–1112. </w:t>
       </w:r>
-      <w:hyperlink r:id="rId21" w:history="1">
+      <w:hyperlink r:id="rId18" w:history="1">
         <w:r>
           <w:rPr>
             <w:rStyle w:val="Hyperlink"/>
@@ -5350,7 +5297,7 @@
       <w:r>
         <w:t xml:space="preserve">. OWASP. </w:t>
       </w:r>
-      <w:hyperlink r:id="rId22" w:history="1">
+      <w:hyperlink r:id="rId19" w:history="1">
         <w:r>
           <w:rPr>
             <w:rStyle w:val="Hyperlink"/>
@@ -5382,7 +5329,7 @@
       <w:r>
         <w:t xml:space="preserve">). Computer Misuse Act. The Code for Crown Prosecutors. </w:t>
       </w:r>
-      <w:hyperlink r:id="rId23" w:history="1">
+      <w:hyperlink r:id="rId20" w:history="1">
         <w:r>
           <w:rPr>
             <w:rStyle w:val="Hyperlink"/>
@@ -5414,7 +5361,7 @@
       <w:r>
         <w:t xml:space="preserve">, b). Fraud Act 2006. The Code for Crown Prosecutors. </w:t>
       </w:r>
-      <w:hyperlink r:id="rId24" w:history="1">
+      <w:hyperlink r:id="rId21" w:history="1">
         <w:r>
           <w:rPr>
             <w:rStyle w:val="Hyperlink"/>
@@ -5437,7 +5384,7 @@
       <w:r>
         <w:t xml:space="preserve">GDPR. (n.d.). What is GDPR, the EU’s new data protection law? GDPR. </w:t>
       </w:r>
-      <w:hyperlink r:id="rId25" w:history="1">
+      <w:hyperlink r:id="rId22" w:history="1">
         <w:r>
           <w:rPr>
             <w:rStyle w:val="Hyperlink"/>
@@ -5460,7 +5407,7 @@
       <w:r>
         <w:t xml:space="preserve">Creativyst Software. (n.d.). How To: The Comma Separated Value (CSV) File Format. Creativyst Software. </w:t>
       </w:r>
-      <w:hyperlink r:id="rId26" w:history="1">
+      <w:hyperlink r:id="rId23" w:history="1">
         <w:r>
           <w:rPr>
             <w:rStyle w:val="Hyperlink"/>
@@ -5483,7 +5430,7 @@
       <w:r>
         <w:t xml:space="preserve">GeeksForGeeks. (2025). Python Web Scraping Tutorial. GeeksForGeeks. </w:t>
       </w:r>
-      <w:hyperlink r:id="rId27" w:history="1">
+      <w:hyperlink r:id="rId24" w:history="1">
         <w:r>
           <w:rPr>
             <w:rStyle w:val="Hyperlink"/>
@@ -5506,7 +5453,7 @@
       <w:r>
         <w:t xml:space="preserve">Iwanna, B., Rizvi, S., Ahmed, S., Dengel, A., &amp; Uchida, S. Judging a Book By its Cover. Cornell University. </w:t>
       </w:r>
-      <w:hyperlink r:id="rId28" w:history="1">
+      <w:hyperlink r:id="rId25" w:history="1">
         <w:r>
           <w:rPr>
             <w:rStyle w:val="Hyperlink"/>
@@ -5535,7 +5482,7 @@
       <w:r>
         <w:t xml:space="preserve">). A descriptive study of assumptions in STRIDE security threat modelling. Software and Systems Modelling, 21(6), 2311-2328. </w:t>
       </w:r>
-      <w:hyperlink r:id="rId29" w:history="1">
+      <w:hyperlink r:id="rId26" w:history="1">
         <w:r>
           <w:rPr>
             <w:rStyle w:val="Hyperlink"/>
@@ -5558,7 +5505,7 @@
       <w:r>
         <w:t xml:space="preserve">Microsoft Learn. (2009). The STRIDE Threat Model. Microsoft Learn. </w:t>
       </w:r>
-      <w:hyperlink r:id="rId30" w:history="1">
+      <w:hyperlink r:id="rId27" w:history="1">
         <w:r>
           <w:rPr>
             <w:rStyle w:val="Hyperlink"/>
@@ -5581,7 +5528,7 @@
       <w:r>
         <w:t xml:space="preserve">Microsoft Support. (n.d.). Create or edit .csv files to import into Outlook. Microsoft Support. </w:t>
       </w:r>
-      <w:hyperlink r:id="rId31" w:history="1">
+      <w:hyperlink r:id="rId28" w:history="1">
         <w:r>
           <w:rPr>
             <w:rStyle w:val="Hyperlink"/>
@@ -5604,7 +5551,7 @@
       <w:r>
         <w:t xml:space="preserve">MySQL. (n.d.). 1.2.1 What is MySQL? MySQL Documentation. </w:t>
       </w:r>
-      <w:hyperlink r:id="rId32" w:history="1">
+      <w:hyperlink r:id="rId29" w:history="1">
         <w:r>
           <w:rPr>
             <w:rStyle w:val="Hyperlink"/>
@@ -5627,7 +5574,7 @@
       <w:r>
         <w:t xml:space="preserve">Pypi. (n.d. -a). requests 2.32.3. Pypi. </w:t>
       </w:r>
-      <w:hyperlink r:id="rId33" w:history="1">
+      <w:hyperlink r:id="rId30" w:history="1">
         <w:r>
           <w:rPr>
             <w:rStyle w:val="Hyperlink"/>
@@ -5653,7 +5600,7 @@
       <w:r>
         <w:t xml:space="preserve">soup4 4.13.4. Pypi. </w:t>
       </w:r>
-      <w:hyperlink r:id="rId34" w:history="1">
+      <w:hyperlink r:id="rId31" w:history="1">
         <w:r>
           <w:rPr>
             <w:rStyle w:val="Hyperlink"/>
@@ -5676,7 +5623,7 @@
       <w:r>
         <w:t xml:space="preserve">Pypi. (n.d. -c). selenium 4.33.0. Pypi. </w:t>
       </w:r>
-      <w:hyperlink r:id="rId35" w:history="1">
+      <w:hyperlink r:id="rId32" w:history="1">
         <w:r>
           <w:rPr>
             <w:rStyle w:val="Hyperlink"/>
@@ -5699,7 +5646,7 @@
       <w:r>
         <w:t xml:space="preserve">Pypi. (n.d. -d). schedule 1.2.2. Pypi. </w:t>
       </w:r>
-      <w:hyperlink r:id="rId36" w:history="1">
+      <w:hyperlink r:id="rId33" w:history="1">
         <w:r>
           <w:rPr>
             <w:rStyle w:val="Hyperlink"/>
@@ -5722,7 +5669,7 @@
       <w:r>
         <w:t xml:space="preserve">Python Documentation. (n.d.). csv – CSV File Reading and Writing. Python. </w:t>
       </w:r>
-      <w:hyperlink r:id="rId37" w:history="1">
+      <w:hyperlink r:id="rId34" w:history="1">
         <w:r>
           <w:rPr>
             <w:rStyle w:val="Hyperlink"/>
@@ -5753,7 +5700,7 @@
       <w:r>
         <w:t xml:space="preserve">-connector-python 9.3.0. Pypi. </w:t>
       </w:r>
-      <w:hyperlink r:id="rId38" w:history="1">
+      <w:hyperlink r:id="rId35" w:history="1">
         <w:r>
           <w:rPr>
             <w:rStyle w:val="Hyperlink"/>
@@ -5785,7 +5732,7 @@
       <w:r>
         <w:t xml:space="preserve"> Reports. 15, 100415. </w:t>
       </w:r>
-      <w:hyperlink r:id="rId39" w:history="1">
+      <w:hyperlink r:id="rId36" w:history="1">
         <w:r>
           <w:rPr>
             <w:rStyle w:val="Hyperlink"/>
@@ -5808,7 +5755,7 @@
       <w:r>
         <w:t xml:space="preserve">Samuli, K. (2022, January 19th). Pricing economics of video games: a panel data study on the effects of versioning on revenue. University of Oulu Repository. </w:t>
       </w:r>
-      <w:hyperlink r:id="rId40" w:history="1">
+      <w:hyperlink r:id="rId37" w:history="1">
         <w:r>
           <w:rPr>
             <w:rStyle w:val="Hyperlink"/>
@@ -5831,7 +5778,7 @@
       <w:r>
         <w:t xml:space="preserve">Selenium. (n.d.). Locating Elements. Selenium. </w:t>
       </w:r>
-      <w:hyperlink r:id="rId41" w:history="1">
+      <w:hyperlink r:id="rId38" w:history="1">
         <w:r>
           <w:rPr>
             <w:rStyle w:val="Hyperlink"/>
@@ -5883,7 +5830,7 @@
       <w:r>
         <w:t xml:space="preserve">Steam. (n.d.). Portal 2. Steam. </w:t>
       </w:r>
-      <w:hyperlink r:id="rId42" w:history="1">
+      <w:hyperlink r:id="rId39" w:history="1">
         <w:r>
           <w:rPr>
             <w:rStyle w:val="Hyperlink"/>
@@ -5914,7 +5861,7 @@
       <w:r>
         <w:t xml:space="preserve"> Steamworks Distribution Program). Steam. </w:t>
       </w:r>
-      <w:hyperlink r:id="rId43" w:history="1">
+      <w:hyperlink r:id="rId40" w:history="1">
         <w:r>
           <w:rPr>
             <w:rStyle w:val="Hyperlink"/>
@@ -5937,7 +5884,7 @@
       <w:r>
         <w:t xml:space="preserve">United Kingdom. (n.d.). Data protection (The UK’s data protection legislation). United Kingdom. </w:t>
       </w:r>
-      <w:hyperlink r:id="rId44" w:history="1">
+      <w:hyperlink r:id="rId41" w:history="1">
         <w:r>
           <w:rPr>
             <w:rStyle w:val="Hyperlink"/>
@@ -5966,7 +5913,7 @@
       <w:r>
         <w:t xml:space="preserve">). The UK Copyright Service. </w:t>
       </w:r>
-      <w:hyperlink r:id="rId45" w:history="1">
+      <w:hyperlink r:id="rId42" w:history="1">
         <w:r>
           <w:rPr>
             <w:rStyle w:val="Hyperlink"/>
@@ -6012,7 +5959,7 @@
       <w:r>
         <w:t xml:space="preserve">of Big Data. </w:t>
       </w:r>
-      <w:hyperlink r:id="rId46" w:history="1">
+      <w:hyperlink r:id="rId43" w:history="1">
         <w:r>
           <w:rPr>
             <w:rStyle w:val="Hyperlink"/>
@@ -6031,7 +5978,7 @@
       <w:r>
         <w:t xml:space="preserve">ALT: </w:t>
       </w:r>
-      <w:hyperlink r:id="rId47" w:history="1">
+      <w:hyperlink r:id="rId44" w:history="1">
         <w:r>
           <w:rPr>
             <w:rStyle w:val="Hyperlink"/>
@@ -8943,6 +8890,33 @@
       </w:tblBorders>
     </w:tblPr>
   </w:style>
+  <w:style w:type="character" w:styleId="LineNumber">
+    <w:name w:val="line number"/>
+    <w:basedOn w:val="DefaultParagraphFont"/>
+    <w:uiPriority w:val="99"/>
+    <w:semiHidden/>
+    <w:unhideWhenUsed/>
+    <w:rsid w:val="001E36BA"/>
+  </w:style>
+  <w:style w:type="paragraph" w:styleId="Caption">
+    <w:name w:val="caption"/>
+    <w:basedOn w:val="Normal"/>
+    <w:next w:val="Normal"/>
+    <w:uiPriority w:val="35"/>
+    <w:unhideWhenUsed/>
+    <w:qFormat/>
+    <w:rsid w:val="00056AB3"/>
+    <w:pPr>
+      <w:spacing w:after="200" w:line="240" w:lineRule="auto"/>
+    </w:pPr>
+    <w:rPr>
+      <w:i/>
+      <w:iCs/>
+      <w:color w:val="0E2841" w:themeColor="text2"/>
+      <w:sz w:val="18"/>
+      <w:szCs w:val="18"/>
+    </w:rPr>
+  </w:style>
 </w:styles>
 </file>
 

</xml_diff>

<commit_message>
Modified previously written sections of the report
</commit_message>
<xml_diff>
--- a/Disertation/Dissertation.docx
+++ b/Disertation/Dissertation.docx
@@ -125,13 +125,13 @@
       <w:r>
         <w:fldChar w:fldCharType="separate"/>
       </w:r>
-      <w:hyperlink w:anchor="_Toc202873446" w:history="1">
+      <w:hyperlink w:anchor="_Toc202900748" w:history="1">
         <w:r>
           <w:rPr>
             <w:rStyle w:val="Hyperlink"/>
             <w:noProof/>
           </w:rPr>
-          <w:t>Introduction</w:t>
+          <w:t>Figures</w:t>
         </w:r>
         <w:r>
           <w:rPr>
@@ -152,7 +152,7 @@
             <w:noProof/>
             <w:webHidden/>
           </w:rPr>
-          <w:instrText xml:space="preserve"> PAGEREF _Toc202873446 \h </w:instrText>
+          <w:instrText xml:space="preserve"> PAGEREF _Toc202900748 \h </w:instrText>
         </w:r>
         <w:r>
           <w:rPr>
@@ -195,12 +195,82 @@
           <w:lang w:eastAsia="en-GB"/>
         </w:rPr>
       </w:pPr>
-      <w:hyperlink w:anchor="_Toc202873447" w:history="1">
+      <w:hyperlink w:anchor="_Toc202900749" w:history="1">
         <w:r>
           <w:rPr>
             <w:rStyle w:val="Hyperlink"/>
             <w:noProof/>
           </w:rPr>
+          <w:t>Introduction</w:t>
+        </w:r>
+        <w:r>
+          <w:rPr>
+            <w:noProof/>
+            <w:webHidden/>
+          </w:rPr>
+          <w:tab/>
+        </w:r>
+        <w:r>
+          <w:rPr>
+            <w:noProof/>
+            <w:webHidden/>
+          </w:rPr>
+          <w:fldChar w:fldCharType="begin"/>
+        </w:r>
+        <w:r>
+          <w:rPr>
+            <w:noProof/>
+            <w:webHidden/>
+          </w:rPr>
+          <w:instrText xml:space="preserve"> PAGEREF _Toc202900749 \h </w:instrText>
+        </w:r>
+        <w:r>
+          <w:rPr>
+            <w:noProof/>
+            <w:webHidden/>
+          </w:rPr>
+        </w:r>
+        <w:r>
+          <w:rPr>
+            <w:noProof/>
+            <w:webHidden/>
+          </w:rPr>
+          <w:fldChar w:fldCharType="separate"/>
+        </w:r>
+        <w:r>
+          <w:rPr>
+            <w:noProof/>
+            <w:webHidden/>
+          </w:rPr>
+          <w:t>4</w:t>
+        </w:r>
+        <w:r>
+          <w:rPr>
+            <w:noProof/>
+            <w:webHidden/>
+          </w:rPr>
+          <w:fldChar w:fldCharType="end"/>
+        </w:r>
+      </w:hyperlink>
+    </w:p>
+    <w:p>
+      <w:pPr>
+        <w:pStyle w:val="TOC1"/>
+        <w:tabs>
+          <w:tab w:val="right" w:leader="dot" w:pos="9016"/>
+        </w:tabs>
+        <w:rPr>
+          <w:rFonts w:asciiTheme="minorHAnsi" w:eastAsiaTheme="minorEastAsia" w:hAnsiTheme="minorHAnsi"/>
+          <w:noProof/>
+          <w:lang w:eastAsia="en-GB"/>
+        </w:rPr>
+      </w:pPr>
+      <w:hyperlink w:anchor="_Toc202900750" w:history="1">
+        <w:r>
+          <w:rPr>
+            <w:rStyle w:val="Hyperlink"/>
+            <w:noProof/>
+          </w:rPr>
           <w:t>Literature Review</w:t>
         </w:r>
         <w:r>
@@ -222,7 +292,7 @@
             <w:noProof/>
             <w:webHidden/>
           </w:rPr>
-          <w:instrText xml:space="preserve"> PAGEREF _Toc202873447 \h </w:instrText>
+          <w:instrText xml:space="preserve"> PAGEREF _Toc202900750 \h </w:instrText>
         </w:r>
         <w:r>
           <w:rPr>
@@ -242,7 +312,7 @@
             <w:noProof/>
             <w:webHidden/>
           </w:rPr>
-          <w:t>4</w:t>
+          <w:t>5</w:t>
         </w:r>
         <w:r>
           <w:rPr>
@@ -265,7 +335,7 @@
           <w:lang w:eastAsia="en-GB"/>
         </w:rPr>
       </w:pPr>
-      <w:hyperlink w:anchor="_Toc202873448" w:history="1">
+      <w:hyperlink w:anchor="_Toc202900751" w:history="1">
         <w:r>
           <w:rPr>
             <w:rStyle w:val="Hyperlink"/>
@@ -292,7 +362,7 @@
             <w:noProof/>
             <w:webHidden/>
           </w:rPr>
-          <w:instrText xml:space="preserve"> PAGEREF _Toc202873448 \h </w:instrText>
+          <w:instrText xml:space="preserve"> PAGEREF _Toc202900751 \h </w:instrText>
         </w:r>
         <w:r>
           <w:rPr>
@@ -312,7 +382,7 @@
             <w:noProof/>
             <w:webHidden/>
           </w:rPr>
-          <w:t>4</w:t>
+          <w:t>5</w:t>
         </w:r>
         <w:r>
           <w:rPr>
@@ -335,7 +405,7 @@
           <w:lang w:eastAsia="en-GB"/>
         </w:rPr>
       </w:pPr>
-      <w:hyperlink w:anchor="_Toc202873449" w:history="1">
+      <w:hyperlink w:anchor="_Toc202900752" w:history="1">
         <w:r>
           <w:rPr>
             <w:rStyle w:val="Hyperlink"/>
@@ -362,7 +432,7 @@
             <w:noProof/>
             <w:webHidden/>
           </w:rPr>
-          <w:instrText xml:space="preserve"> PAGEREF _Toc202873449 \h </w:instrText>
+          <w:instrText xml:space="preserve"> PAGEREF _Toc202900752 \h </w:instrText>
         </w:r>
         <w:r>
           <w:rPr>
@@ -382,7 +452,7 @@
             <w:noProof/>
             <w:webHidden/>
           </w:rPr>
-          <w:t>5</w:t>
+          <w:t>6</w:t>
         </w:r>
         <w:r>
           <w:rPr>
@@ -405,7 +475,7 @@
           <w:lang w:eastAsia="en-GB"/>
         </w:rPr>
       </w:pPr>
-      <w:hyperlink w:anchor="_Toc202873450" w:history="1">
+      <w:hyperlink w:anchor="_Toc202900753" w:history="1">
         <w:r>
           <w:rPr>
             <w:rStyle w:val="Hyperlink"/>
@@ -432,7 +502,7 @@
             <w:noProof/>
             <w:webHidden/>
           </w:rPr>
-          <w:instrText xml:space="preserve"> PAGEREF _Toc202873450 \h </w:instrText>
+          <w:instrText xml:space="preserve"> PAGEREF _Toc202900753 \h </w:instrText>
         </w:r>
         <w:r>
           <w:rPr>
@@ -452,7 +522,7 @@
             <w:noProof/>
             <w:webHidden/>
           </w:rPr>
-          <w:t>6</w:t>
+          <w:t>7</w:t>
         </w:r>
         <w:r>
           <w:rPr>
@@ -475,7 +545,7 @@
           <w:lang w:eastAsia="en-GB"/>
         </w:rPr>
       </w:pPr>
-      <w:hyperlink w:anchor="_Toc202873451" w:history="1">
+      <w:hyperlink w:anchor="_Toc202900754" w:history="1">
         <w:r>
           <w:rPr>
             <w:rStyle w:val="Hyperlink"/>
@@ -502,7 +572,7 @@
             <w:noProof/>
             <w:webHidden/>
           </w:rPr>
-          <w:instrText xml:space="preserve"> PAGEREF _Toc202873451 \h </w:instrText>
+          <w:instrText xml:space="preserve"> PAGEREF _Toc202900754 \h </w:instrText>
         </w:r>
         <w:r>
           <w:rPr>
@@ -522,7 +592,7 @@
             <w:noProof/>
             <w:webHidden/>
           </w:rPr>
-          <w:t>6</w:t>
+          <w:t>7</w:t>
         </w:r>
         <w:r>
           <w:rPr>
@@ -545,7 +615,7 @@
           <w:lang w:eastAsia="en-GB"/>
         </w:rPr>
       </w:pPr>
-      <w:hyperlink w:anchor="_Toc202873452" w:history="1">
+      <w:hyperlink w:anchor="_Toc202900755" w:history="1">
         <w:r>
           <w:rPr>
             <w:rStyle w:val="Hyperlink"/>
@@ -572,7 +642,7 @@
             <w:noProof/>
             <w:webHidden/>
           </w:rPr>
-          <w:instrText xml:space="preserve"> PAGEREF _Toc202873452 \h </w:instrText>
+          <w:instrText xml:space="preserve"> PAGEREF _Toc202900755 \h </w:instrText>
         </w:r>
         <w:r>
           <w:rPr>
@@ -592,7 +662,7 @@
             <w:noProof/>
             <w:webHidden/>
           </w:rPr>
-          <w:t>7</w:t>
+          <w:t>8</w:t>
         </w:r>
         <w:r>
           <w:rPr>
@@ -615,7 +685,7 @@
           <w:lang w:eastAsia="en-GB"/>
         </w:rPr>
       </w:pPr>
-      <w:hyperlink w:anchor="_Toc202873453" w:history="1">
+      <w:hyperlink w:anchor="_Toc202900756" w:history="1">
         <w:r>
           <w:rPr>
             <w:rStyle w:val="Hyperlink"/>
@@ -642,7 +712,7 @@
             <w:noProof/>
             <w:webHidden/>
           </w:rPr>
-          <w:instrText xml:space="preserve"> PAGEREF _Toc202873453 \h </w:instrText>
+          <w:instrText xml:space="preserve"> PAGEREF _Toc202900756 \h </w:instrText>
         </w:r>
         <w:r>
           <w:rPr>
@@ -662,7 +732,7 @@
             <w:noProof/>
             <w:webHidden/>
           </w:rPr>
-          <w:t>8</w:t>
+          <w:t>9</w:t>
         </w:r>
         <w:r>
           <w:rPr>
@@ -685,7 +755,7 @@
           <w:lang w:eastAsia="en-GB"/>
         </w:rPr>
       </w:pPr>
-      <w:hyperlink w:anchor="_Toc202873454" w:history="1">
+      <w:hyperlink w:anchor="_Toc202900757" w:history="1">
         <w:r>
           <w:rPr>
             <w:rStyle w:val="Hyperlink"/>
@@ -712,7 +782,7 @@
             <w:noProof/>
             <w:webHidden/>
           </w:rPr>
-          <w:instrText xml:space="preserve"> PAGEREF _Toc202873454 \h </w:instrText>
+          <w:instrText xml:space="preserve"> PAGEREF _Toc202900757 \h </w:instrText>
         </w:r>
         <w:r>
           <w:rPr>
@@ -732,7 +802,7 @@
             <w:noProof/>
             <w:webHidden/>
           </w:rPr>
-          <w:t>9</w:t>
+          <w:t>10</w:t>
         </w:r>
         <w:r>
           <w:rPr>
@@ -755,7 +825,7 @@
           <w:lang w:eastAsia="en-GB"/>
         </w:rPr>
       </w:pPr>
-      <w:hyperlink w:anchor="_Toc202873455" w:history="1">
+      <w:hyperlink w:anchor="_Toc202900758" w:history="1">
         <w:r>
           <w:rPr>
             <w:rStyle w:val="Hyperlink"/>
@@ -782,7 +852,7 @@
             <w:noProof/>
             <w:webHidden/>
           </w:rPr>
-          <w:instrText xml:space="preserve"> PAGEREF _Toc202873455 \h </w:instrText>
+          <w:instrText xml:space="preserve"> PAGEREF _Toc202900758 \h </w:instrText>
         </w:r>
         <w:r>
           <w:rPr>
@@ -802,7 +872,7 @@
             <w:noProof/>
             <w:webHidden/>
           </w:rPr>
-          <w:t>11</w:t>
+          <w:t>12</w:t>
         </w:r>
         <w:r>
           <w:rPr>
@@ -825,7 +895,7 @@
           <w:lang w:eastAsia="en-GB"/>
         </w:rPr>
       </w:pPr>
-      <w:hyperlink w:anchor="_Toc202873456" w:history="1">
+      <w:hyperlink w:anchor="_Toc202900759" w:history="1">
         <w:r>
           <w:rPr>
             <w:rStyle w:val="Hyperlink"/>
@@ -852,7 +922,7 @@
             <w:noProof/>
             <w:webHidden/>
           </w:rPr>
-          <w:instrText xml:space="preserve"> PAGEREF _Toc202873456 \h </w:instrText>
+          <w:instrText xml:space="preserve"> PAGEREF _Toc202900759 \h </w:instrText>
         </w:r>
         <w:r>
           <w:rPr>
@@ -872,7 +942,7 @@
             <w:noProof/>
             <w:webHidden/>
           </w:rPr>
-          <w:t>12</w:t>
+          <w:t>13</w:t>
         </w:r>
         <w:r>
           <w:rPr>
@@ -895,7 +965,7 @@
           <w:lang w:eastAsia="en-GB"/>
         </w:rPr>
       </w:pPr>
-      <w:hyperlink w:anchor="_Toc202873457" w:history="1">
+      <w:hyperlink w:anchor="_Toc202900760" w:history="1">
         <w:r>
           <w:rPr>
             <w:rStyle w:val="Hyperlink"/>
@@ -922,7 +992,7 @@
             <w:noProof/>
             <w:webHidden/>
           </w:rPr>
-          <w:instrText xml:space="preserve"> PAGEREF _Toc202873457 \h </w:instrText>
+          <w:instrText xml:space="preserve"> PAGEREF _Toc202900760 \h </w:instrText>
         </w:r>
         <w:r>
           <w:rPr>
@@ -942,7 +1012,7 @@
             <w:noProof/>
             <w:webHidden/>
           </w:rPr>
-          <w:t>12</w:t>
+          <w:t>13</w:t>
         </w:r>
         <w:r>
           <w:rPr>
@@ -965,7 +1035,7 @@
           <w:lang w:eastAsia="en-GB"/>
         </w:rPr>
       </w:pPr>
-      <w:hyperlink w:anchor="_Toc202873458" w:history="1">
+      <w:hyperlink w:anchor="_Toc202900761" w:history="1">
         <w:r>
           <w:rPr>
             <w:rStyle w:val="Hyperlink"/>
@@ -992,7 +1062,7 @@
             <w:noProof/>
             <w:webHidden/>
           </w:rPr>
-          <w:instrText xml:space="preserve"> PAGEREF _Toc202873458 \h </w:instrText>
+          <w:instrText xml:space="preserve"> PAGEREF _Toc202900761 \h </w:instrText>
         </w:r>
         <w:r>
           <w:rPr>
@@ -1012,7 +1082,7 @@
             <w:noProof/>
             <w:webHidden/>
           </w:rPr>
-          <w:t>12</w:t>
+          <w:t>13</w:t>
         </w:r>
         <w:r>
           <w:rPr>
@@ -1035,7 +1105,7 @@
           <w:lang w:eastAsia="en-GB"/>
         </w:rPr>
       </w:pPr>
-      <w:hyperlink w:anchor="_Toc202873459" w:history="1">
+      <w:hyperlink w:anchor="_Toc202900762" w:history="1">
         <w:r>
           <w:rPr>
             <w:rStyle w:val="Hyperlink"/>
@@ -1062,7 +1132,7 @@
             <w:noProof/>
             <w:webHidden/>
           </w:rPr>
-          <w:instrText xml:space="preserve"> PAGEREF _Toc202873459 \h </w:instrText>
+          <w:instrText xml:space="preserve"> PAGEREF _Toc202900762 \h </w:instrText>
         </w:r>
         <w:r>
           <w:rPr>
@@ -1082,7 +1152,7 @@
             <w:noProof/>
             <w:webHidden/>
           </w:rPr>
-          <w:t>13</w:t>
+          <w:t>14</w:t>
         </w:r>
         <w:r>
           <w:rPr>
@@ -1105,7 +1175,7 @@
           <w:lang w:eastAsia="en-GB"/>
         </w:rPr>
       </w:pPr>
-      <w:hyperlink w:anchor="_Toc202873460" w:history="1">
+      <w:hyperlink w:anchor="_Toc202900763" w:history="1">
         <w:r>
           <w:rPr>
             <w:rStyle w:val="Hyperlink"/>
@@ -1132,7 +1202,7 @@
             <w:noProof/>
             <w:webHidden/>
           </w:rPr>
-          <w:instrText xml:space="preserve"> PAGEREF _Toc202873460 \h </w:instrText>
+          <w:instrText xml:space="preserve"> PAGEREF _Toc202900763 \h </w:instrText>
         </w:r>
         <w:r>
           <w:rPr>
@@ -1152,7 +1222,7 @@
             <w:noProof/>
             <w:webHidden/>
           </w:rPr>
-          <w:t>15</w:t>
+          <w:t>16</w:t>
         </w:r>
         <w:r>
           <w:rPr>
@@ -1175,7 +1245,7 @@
           <w:lang w:eastAsia="en-GB"/>
         </w:rPr>
       </w:pPr>
-      <w:hyperlink w:anchor="_Toc202873461" w:history="1">
+      <w:hyperlink w:anchor="_Toc202900764" w:history="1">
         <w:r>
           <w:rPr>
             <w:rStyle w:val="Hyperlink"/>
@@ -1202,7 +1272,7 @@
             <w:noProof/>
             <w:webHidden/>
           </w:rPr>
-          <w:instrText xml:space="preserve"> PAGEREF _Toc202873461 \h </w:instrText>
+          <w:instrText xml:space="preserve"> PAGEREF _Toc202900764 \h </w:instrText>
         </w:r>
         <w:r>
           <w:rPr>
@@ -1222,7 +1292,7 @@
             <w:noProof/>
             <w:webHidden/>
           </w:rPr>
-          <w:t>16</w:t>
+          <w:t>17</w:t>
         </w:r>
         <w:r>
           <w:rPr>
@@ -1245,7 +1315,7 @@
           <w:lang w:eastAsia="en-GB"/>
         </w:rPr>
       </w:pPr>
-      <w:hyperlink w:anchor="_Toc202873462" w:history="1">
+      <w:hyperlink w:anchor="_Toc202900765" w:history="1">
         <w:r>
           <w:rPr>
             <w:rStyle w:val="Hyperlink"/>
@@ -1272,7 +1342,7 @@
             <w:noProof/>
             <w:webHidden/>
           </w:rPr>
-          <w:instrText xml:space="preserve"> PAGEREF _Toc202873462 \h </w:instrText>
+          <w:instrText xml:space="preserve"> PAGEREF _Toc202900765 \h </w:instrText>
         </w:r>
         <w:r>
           <w:rPr>
@@ -1292,7 +1362,7 @@
             <w:noProof/>
             <w:webHidden/>
           </w:rPr>
-          <w:t>19</w:t>
+          <w:t>20</w:t>
         </w:r>
         <w:r>
           <w:rPr>
@@ -1315,13 +1385,13 @@
           <w:lang w:eastAsia="en-GB"/>
         </w:rPr>
       </w:pPr>
-      <w:hyperlink w:anchor="_Toc202873463" w:history="1">
+      <w:hyperlink w:anchor="_Toc202900766" w:history="1">
         <w:r>
           <w:rPr>
             <w:rStyle w:val="Hyperlink"/>
             <w:noProof/>
           </w:rPr>
-          <w:t>Development &amp; Data Analysis</w:t>
+          <w:t>Development</w:t>
         </w:r>
         <w:r>
           <w:rPr>
@@ -1342,7 +1412,7 @@
             <w:noProof/>
             <w:webHidden/>
           </w:rPr>
-          <w:instrText xml:space="preserve"> PAGEREF _Toc202873463 \h </w:instrText>
+          <w:instrText xml:space="preserve"> PAGEREF _Toc202900766 \h </w:instrText>
         </w:r>
         <w:r>
           <w:rPr>
@@ -1362,7 +1432,7 @@
             <w:noProof/>
             <w:webHidden/>
           </w:rPr>
-          <w:t>22</w:t>
+          <w:t>23</w:t>
         </w:r>
         <w:r>
           <w:rPr>
@@ -1385,7 +1455,7 @@
           <w:lang w:eastAsia="en-GB"/>
         </w:rPr>
       </w:pPr>
-      <w:hyperlink w:anchor="_Toc202873464" w:history="1">
+      <w:hyperlink w:anchor="_Toc202900767" w:history="1">
         <w:r>
           <w:rPr>
             <w:rStyle w:val="Hyperlink"/>
@@ -1412,7 +1482,7 @@
             <w:noProof/>
             <w:webHidden/>
           </w:rPr>
-          <w:instrText xml:space="preserve"> PAGEREF _Toc202873464 \h </w:instrText>
+          <w:instrText xml:space="preserve"> PAGEREF _Toc202900767 \h </w:instrText>
         </w:r>
         <w:r>
           <w:rPr>
@@ -1432,7 +1502,7 @@
             <w:noProof/>
             <w:webHidden/>
           </w:rPr>
-          <w:t>22</w:t>
+          <w:t>23</w:t>
         </w:r>
         <w:r>
           <w:rPr>
@@ -1455,13 +1525,13 @@
           <w:lang w:eastAsia="en-GB"/>
         </w:rPr>
       </w:pPr>
-      <w:hyperlink w:anchor="_Toc202873465" w:history="1">
+      <w:hyperlink w:anchor="_Toc202900768" w:history="1">
         <w:r>
           <w:rPr>
             <w:rStyle w:val="Hyperlink"/>
             <w:noProof/>
           </w:rPr>
-          <w:t>Data Analysis</w:t>
+          <w:t>MySQL Database</w:t>
         </w:r>
         <w:r>
           <w:rPr>
@@ -1482,7 +1552,7 @@
             <w:noProof/>
             <w:webHidden/>
           </w:rPr>
-          <w:instrText xml:space="preserve"> PAGEREF _Toc202873465 \h </w:instrText>
+          <w:instrText xml:space="preserve"> PAGEREF _Toc202900768 \h </w:instrText>
         </w:r>
         <w:r>
           <w:rPr>
@@ -1502,7 +1572,7 @@
             <w:noProof/>
             <w:webHidden/>
           </w:rPr>
-          <w:t>23</w:t>
+          <w:t>24</w:t>
         </w:r>
         <w:r>
           <w:rPr>
@@ -1525,13 +1595,13 @@
           <w:lang w:eastAsia="en-GB"/>
         </w:rPr>
       </w:pPr>
-      <w:hyperlink w:anchor="_Toc202873466" w:history="1">
+      <w:hyperlink w:anchor="_Toc202900769" w:history="1">
         <w:r>
           <w:rPr>
             <w:rStyle w:val="Hyperlink"/>
             <w:noProof/>
           </w:rPr>
-          <w:t>MySQL Database</w:t>
+          <w:t>Website</w:t>
         </w:r>
         <w:r>
           <w:rPr>
@@ -1552,7 +1622,7 @@
             <w:noProof/>
             <w:webHidden/>
           </w:rPr>
-          <w:instrText xml:space="preserve"> PAGEREF _Toc202873466 \h </w:instrText>
+          <w:instrText xml:space="preserve"> PAGEREF _Toc202900769 \h </w:instrText>
         </w:r>
         <w:r>
           <w:rPr>
@@ -1572,7 +1642,77 @@
             <w:noProof/>
             <w:webHidden/>
           </w:rPr>
-          <w:t>24</w:t>
+          <w:t>25</w:t>
+        </w:r>
+        <w:r>
+          <w:rPr>
+            <w:noProof/>
+            <w:webHidden/>
+          </w:rPr>
+          <w:fldChar w:fldCharType="end"/>
+        </w:r>
+      </w:hyperlink>
+    </w:p>
+    <w:p>
+      <w:pPr>
+        <w:pStyle w:val="TOC1"/>
+        <w:tabs>
+          <w:tab w:val="right" w:leader="dot" w:pos="9016"/>
+        </w:tabs>
+        <w:rPr>
+          <w:rFonts w:asciiTheme="minorHAnsi" w:eastAsiaTheme="minorEastAsia" w:hAnsiTheme="minorHAnsi"/>
+          <w:noProof/>
+          <w:lang w:eastAsia="en-GB"/>
+        </w:rPr>
+      </w:pPr>
+      <w:hyperlink w:anchor="_Toc202900770" w:history="1">
+        <w:r>
+          <w:rPr>
+            <w:rStyle w:val="Hyperlink"/>
+            <w:noProof/>
+          </w:rPr>
+          <w:t>Results/Findings</w:t>
+        </w:r>
+        <w:r>
+          <w:rPr>
+            <w:noProof/>
+            <w:webHidden/>
+          </w:rPr>
+          <w:tab/>
+        </w:r>
+        <w:r>
+          <w:rPr>
+            <w:noProof/>
+            <w:webHidden/>
+          </w:rPr>
+          <w:fldChar w:fldCharType="begin"/>
+        </w:r>
+        <w:r>
+          <w:rPr>
+            <w:noProof/>
+            <w:webHidden/>
+          </w:rPr>
+          <w:instrText xml:space="preserve"> PAGEREF _Toc202900770 \h </w:instrText>
+        </w:r>
+        <w:r>
+          <w:rPr>
+            <w:noProof/>
+            <w:webHidden/>
+          </w:rPr>
+        </w:r>
+        <w:r>
+          <w:rPr>
+            <w:noProof/>
+            <w:webHidden/>
+          </w:rPr>
+          <w:fldChar w:fldCharType="separate"/>
+        </w:r>
+        <w:r>
+          <w:rPr>
+            <w:noProof/>
+            <w:webHidden/>
+          </w:rPr>
+          <w:t>26</w:t>
         </w:r>
         <w:r>
           <w:rPr>
@@ -1595,12 +1735,152 @@
           <w:lang w:eastAsia="en-GB"/>
         </w:rPr>
       </w:pPr>
-      <w:hyperlink w:anchor="_Toc202873467" w:history="1">
+      <w:hyperlink w:anchor="_Toc202900771" w:history="1">
         <w:r>
           <w:rPr>
             <w:rStyle w:val="Hyperlink"/>
             <w:noProof/>
           </w:rPr>
+          <w:t>Scraping Program &amp; Data Analysis</w:t>
+        </w:r>
+        <w:r>
+          <w:rPr>
+            <w:noProof/>
+            <w:webHidden/>
+          </w:rPr>
+          <w:tab/>
+        </w:r>
+        <w:r>
+          <w:rPr>
+            <w:noProof/>
+            <w:webHidden/>
+          </w:rPr>
+          <w:fldChar w:fldCharType="begin"/>
+        </w:r>
+        <w:r>
+          <w:rPr>
+            <w:noProof/>
+            <w:webHidden/>
+          </w:rPr>
+          <w:instrText xml:space="preserve"> PAGEREF _Toc202900771 \h </w:instrText>
+        </w:r>
+        <w:r>
+          <w:rPr>
+            <w:noProof/>
+            <w:webHidden/>
+          </w:rPr>
+        </w:r>
+        <w:r>
+          <w:rPr>
+            <w:noProof/>
+            <w:webHidden/>
+          </w:rPr>
+          <w:fldChar w:fldCharType="separate"/>
+        </w:r>
+        <w:r>
+          <w:rPr>
+            <w:noProof/>
+            <w:webHidden/>
+          </w:rPr>
+          <w:t>26</w:t>
+        </w:r>
+        <w:r>
+          <w:rPr>
+            <w:noProof/>
+            <w:webHidden/>
+          </w:rPr>
+          <w:fldChar w:fldCharType="end"/>
+        </w:r>
+      </w:hyperlink>
+    </w:p>
+    <w:p>
+      <w:pPr>
+        <w:pStyle w:val="TOC2"/>
+        <w:tabs>
+          <w:tab w:val="right" w:leader="dot" w:pos="9016"/>
+        </w:tabs>
+        <w:rPr>
+          <w:rFonts w:asciiTheme="minorHAnsi" w:eastAsiaTheme="minorEastAsia" w:hAnsiTheme="minorHAnsi"/>
+          <w:noProof/>
+          <w:lang w:eastAsia="en-GB"/>
+        </w:rPr>
+      </w:pPr>
+      <w:hyperlink w:anchor="_Toc202900772" w:history="1">
+        <w:r>
+          <w:rPr>
+            <w:rStyle w:val="Hyperlink"/>
+            <w:noProof/>
+          </w:rPr>
+          <w:t>MySQL Database</w:t>
+        </w:r>
+        <w:r>
+          <w:rPr>
+            <w:noProof/>
+            <w:webHidden/>
+          </w:rPr>
+          <w:tab/>
+        </w:r>
+        <w:r>
+          <w:rPr>
+            <w:noProof/>
+            <w:webHidden/>
+          </w:rPr>
+          <w:fldChar w:fldCharType="begin"/>
+        </w:r>
+        <w:r>
+          <w:rPr>
+            <w:noProof/>
+            <w:webHidden/>
+          </w:rPr>
+          <w:instrText xml:space="preserve"> PAGEREF _Toc202900772 \h </w:instrText>
+        </w:r>
+        <w:r>
+          <w:rPr>
+            <w:noProof/>
+            <w:webHidden/>
+          </w:rPr>
+        </w:r>
+        <w:r>
+          <w:rPr>
+            <w:noProof/>
+            <w:webHidden/>
+          </w:rPr>
+          <w:fldChar w:fldCharType="separate"/>
+        </w:r>
+        <w:r>
+          <w:rPr>
+            <w:noProof/>
+            <w:webHidden/>
+          </w:rPr>
+          <w:t>27</w:t>
+        </w:r>
+        <w:r>
+          <w:rPr>
+            <w:noProof/>
+            <w:webHidden/>
+          </w:rPr>
+          <w:fldChar w:fldCharType="end"/>
+        </w:r>
+      </w:hyperlink>
+    </w:p>
+    <w:p>
+      <w:pPr>
+        <w:pStyle w:val="TOC2"/>
+        <w:tabs>
+          <w:tab w:val="right" w:leader="dot" w:pos="9016"/>
+        </w:tabs>
+        <w:rPr>
+          <w:rFonts w:asciiTheme="minorHAnsi" w:eastAsiaTheme="minorEastAsia" w:hAnsiTheme="minorHAnsi"/>
+          <w:noProof/>
+          <w:lang w:eastAsia="en-GB"/>
+        </w:rPr>
+      </w:pPr>
+      <w:hyperlink w:anchor="_Toc202900773" w:history="1">
+        <w:r>
+          <w:rPr>
+            <w:rStyle w:val="Hyperlink"/>
+            <w:noProof/>
+          </w:rPr>
           <w:t>Website</w:t>
         </w:r>
         <w:r>
@@ -1622,7 +1902,7 @@
             <w:noProof/>
             <w:webHidden/>
           </w:rPr>
-          <w:instrText xml:space="preserve"> PAGEREF _Toc202873467 \h </w:instrText>
+          <w:instrText xml:space="preserve"> PAGEREF _Toc202900773 \h </w:instrText>
         </w:r>
         <w:r>
           <w:rPr>
@@ -1642,7 +1922,7 @@
             <w:noProof/>
             <w:webHidden/>
           </w:rPr>
-          <w:t>25</w:t>
+          <w:t>28</w:t>
         </w:r>
         <w:r>
           <w:rPr>
@@ -1665,13 +1945,13 @@
           <w:lang w:eastAsia="en-GB"/>
         </w:rPr>
       </w:pPr>
-      <w:hyperlink w:anchor="_Toc202873468" w:history="1">
+      <w:hyperlink w:anchor="_Toc202900774" w:history="1">
         <w:r>
           <w:rPr>
             <w:rStyle w:val="Hyperlink"/>
             <w:noProof/>
           </w:rPr>
-          <w:t>Results/Findings</w:t>
+          <w:t>Conclusion</w:t>
         </w:r>
         <w:r>
           <w:rPr>
@@ -1692,7 +1972,7 @@
             <w:noProof/>
             <w:webHidden/>
           </w:rPr>
-          <w:instrText xml:space="preserve"> PAGEREF _Toc202873468 \h </w:instrText>
+          <w:instrText xml:space="preserve"> PAGEREF _Toc202900774 \h </w:instrText>
         </w:r>
         <w:r>
           <w:rPr>
@@ -1712,217 +1992,7 @@
             <w:noProof/>
             <w:webHidden/>
           </w:rPr>
-          <w:t>26</w:t>
-        </w:r>
-        <w:r>
-          <w:rPr>
-            <w:noProof/>
-            <w:webHidden/>
-          </w:rPr>
-          <w:fldChar w:fldCharType="end"/>
-        </w:r>
-      </w:hyperlink>
-    </w:p>
-    <w:p>
-      <w:pPr>
-        <w:pStyle w:val="TOC2"/>
-        <w:tabs>
-          <w:tab w:val="right" w:leader="dot" w:pos="9016"/>
-        </w:tabs>
-        <w:rPr>
-          <w:rFonts w:asciiTheme="minorHAnsi" w:eastAsiaTheme="minorEastAsia" w:hAnsiTheme="minorHAnsi"/>
-          <w:noProof/>
-          <w:lang w:eastAsia="en-GB"/>
-        </w:rPr>
-      </w:pPr>
-      <w:hyperlink w:anchor="_Toc202873469" w:history="1">
-        <w:r>
-          <w:rPr>
-            <w:rStyle w:val="Hyperlink"/>
-            <w:noProof/>
-          </w:rPr>
-          <w:t>Scraping Program</w:t>
-        </w:r>
-        <w:r>
-          <w:rPr>
-            <w:noProof/>
-            <w:webHidden/>
-          </w:rPr>
-          <w:tab/>
-        </w:r>
-        <w:r>
-          <w:rPr>
-            <w:noProof/>
-            <w:webHidden/>
-          </w:rPr>
-          <w:fldChar w:fldCharType="begin"/>
-        </w:r>
-        <w:r>
-          <w:rPr>
-            <w:noProof/>
-            <w:webHidden/>
-          </w:rPr>
-          <w:instrText xml:space="preserve"> PAGEREF _Toc202873469 \h </w:instrText>
-        </w:r>
-        <w:r>
-          <w:rPr>
-            <w:noProof/>
-            <w:webHidden/>
-          </w:rPr>
-        </w:r>
-        <w:r>
-          <w:rPr>
-            <w:noProof/>
-            <w:webHidden/>
-          </w:rPr>
-          <w:fldChar w:fldCharType="separate"/>
-        </w:r>
-        <w:r>
-          <w:rPr>
-            <w:noProof/>
-            <w:webHidden/>
-          </w:rPr>
-          <w:t>26</w:t>
-        </w:r>
-        <w:r>
-          <w:rPr>
-            <w:noProof/>
-            <w:webHidden/>
-          </w:rPr>
-          <w:fldChar w:fldCharType="end"/>
-        </w:r>
-      </w:hyperlink>
-    </w:p>
-    <w:p>
-      <w:pPr>
-        <w:pStyle w:val="TOC2"/>
-        <w:tabs>
-          <w:tab w:val="right" w:leader="dot" w:pos="9016"/>
-        </w:tabs>
-        <w:rPr>
-          <w:rFonts w:asciiTheme="minorHAnsi" w:eastAsiaTheme="minorEastAsia" w:hAnsiTheme="minorHAnsi"/>
-          <w:noProof/>
-          <w:lang w:eastAsia="en-GB"/>
-        </w:rPr>
-      </w:pPr>
-      <w:hyperlink w:anchor="_Toc202873470" w:history="1">
-        <w:r>
-          <w:rPr>
-            <w:rStyle w:val="Hyperlink"/>
-            <w:noProof/>
-          </w:rPr>
-          <w:t>MySQL Database</w:t>
-        </w:r>
-        <w:r>
-          <w:rPr>
-            <w:noProof/>
-            <w:webHidden/>
-          </w:rPr>
-          <w:tab/>
-        </w:r>
-        <w:r>
-          <w:rPr>
-            <w:noProof/>
-            <w:webHidden/>
-          </w:rPr>
-          <w:fldChar w:fldCharType="begin"/>
-        </w:r>
-        <w:r>
-          <w:rPr>
-            <w:noProof/>
-            <w:webHidden/>
-          </w:rPr>
-          <w:instrText xml:space="preserve"> PAGEREF _Toc202873470 \h </w:instrText>
-        </w:r>
-        <w:r>
-          <w:rPr>
-            <w:noProof/>
-            <w:webHidden/>
-          </w:rPr>
-        </w:r>
-        <w:r>
-          <w:rPr>
-            <w:noProof/>
-            <w:webHidden/>
-          </w:rPr>
-          <w:fldChar w:fldCharType="separate"/>
-        </w:r>
-        <w:r>
-          <w:rPr>
-            <w:noProof/>
-            <w:webHidden/>
-          </w:rPr>
-          <w:t>27</w:t>
-        </w:r>
-        <w:r>
-          <w:rPr>
-            <w:noProof/>
-            <w:webHidden/>
-          </w:rPr>
-          <w:fldChar w:fldCharType="end"/>
-        </w:r>
-      </w:hyperlink>
-    </w:p>
-    <w:p>
-      <w:pPr>
-        <w:pStyle w:val="TOC2"/>
-        <w:tabs>
-          <w:tab w:val="right" w:leader="dot" w:pos="9016"/>
-        </w:tabs>
-        <w:rPr>
-          <w:rFonts w:asciiTheme="minorHAnsi" w:eastAsiaTheme="minorEastAsia" w:hAnsiTheme="minorHAnsi"/>
-          <w:noProof/>
-          <w:lang w:eastAsia="en-GB"/>
-        </w:rPr>
-      </w:pPr>
-      <w:hyperlink w:anchor="_Toc202873471" w:history="1">
-        <w:r>
-          <w:rPr>
-            <w:rStyle w:val="Hyperlink"/>
-            <w:noProof/>
-          </w:rPr>
-          <w:t>Website</w:t>
-        </w:r>
-        <w:r>
-          <w:rPr>
-            <w:noProof/>
-            <w:webHidden/>
-          </w:rPr>
-          <w:tab/>
-        </w:r>
-        <w:r>
-          <w:rPr>
-            <w:noProof/>
-            <w:webHidden/>
-          </w:rPr>
-          <w:fldChar w:fldCharType="begin"/>
-        </w:r>
-        <w:r>
-          <w:rPr>
-            <w:noProof/>
-            <w:webHidden/>
-          </w:rPr>
-          <w:instrText xml:space="preserve"> PAGEREF _Toc202873471 \h </w:instrText>
-        </w:r>
-        <w:r>
-          <w:rPr>
-            <w:noProof/>
-            <w:webHidden/>
-          </w:rPr>
-        </w:r>
-        <w:r>
-          <w:rPr>
-            <w:noProof/>
-            <w:webHidden/>
-          </w:rPr>
-          <w:fldChar w:fldCharType="separate"/>
-        </w:r>
-        <w:r>
-          <w:rPr>
-            <w:noProof/>
-            <w:webHidden/>
-          </w:rPr>
-          <w:t>28</w:t>
+          <w:t>29</w:t>
         </w:r>
         <w:r>
           <w:rPr>
@@ -1945,13 +2015,13 @@
           <w:lang w:eastAsia="en-GB"/>
         </w:rPr>
       </w:pPr>
-      <w:hyperlink w:anchor="_Toc202873472" w:history="1">
+      <w:hyperlink w:anchor="_Toc202900775" w:history="1">
         <w:r>
           <w:rPr>
             <w:rStyle w:val="Hyperlink"/>
             <w:noProof/>
           </w:rPr>
-          <w:t>Conclusion</w:t>
+          <w:t>References</w:t>
         </w:r>
         <w:r>
           <w:rPr>
@@ -1972,7 +2042,7 @@
             <w:noProof/>
             <w:webHidden/>
           </w:rPr>
-          <w:instrText xml:space="preserve"> PAGEREF _Toc202873472 \h </w:instrText>
+          <w:instrText xml:space="preserve"> PAGEREF _Toc202900775 \h </w:instrText>
         </w:r>
         <w:r>
           <w:rPr>
@@ -1992,7 +2062,7 @@
             <w:noProof/>
             <w:webHidden/>
           </w:rPr>
-          <w:t>29</w:t>
+          <w:t>30</w:t>
         </w:r>
         <w:r>
           <w:rPr>
@@ -2004,24 +2074,50 @@
       </w:hyperlink>
     </w:p>
     <w:p>
-      <w:pPr>
-        <w:pStyle w:val="TOC1"/>
+      <w:r>
+        <w:fldChar w:fldCharType="end"/>
+      </w:r>
+      <w:r>
+        <w:br w:type="page"/>
+      </w:r>
+    </w:p>
+    <w:p>
+      <w:pPr>
+        <w:pStyle w:val="Heading1"/>
+      </w:pPr>
+      <w:bookmarkStart w:id="0" w:name="_Toc202900748"/>
+      <w:r>
+        <w:lastRenderedPageBreak/>
+        <w:t>Figures</w:t>
+      </w:r>
+      <w:bookmarkEnd w:id="0"/>
+    </w:p>
+    <w:p>
+      <w:pPr>
+        <w:pStyle w:val="TableofFigures"/>
         <w:tabs>
           <w:tab w:val="right" w:leader="dot" w:pos="9016"/>
         </w:tabs>
         <w:rPr>
-          <w:rFonts w:asciiTheme="minorHAnsi" w:eastAsiaTheme="minorEastAsia" w:hAnsiTheme="minorHAnsi"/>
           <w:noProof/>
-          <w:lang w:eastAsia="en-GB"/>
         </w:rPr>
       </w:pPr>
-      <w:hyperlink w:anchor="_Toc202873473" w:history="1">
+      <w:r>
+        <w:fldChar w:fldCharType="begin"/>
+      </w:r>
+      <w:r>
+        <w:instrText xml:space="preserve"> TOC \h \z \c "Figure" </w:instrText>
+      </w:r>
+      <w:r>
+        <w:fldChar w:fldCharType="separate"/>
+      </w:r>
+      <w:hyperlink w:anchor="_Toc202900719" w:history="1">
         <w:r>
           <w:rPr>
             <w:rStyle w:val="Hyperlink"/>
             <w:noProof/>
           </w:rPr>
-          <w:t>References</w:t>
+          <w:t>Figure 1: Development Process</w:t>
         </w:r>
         <w:r>
           <w:rPr>
@@ -2042,7 +2138,7 @@
             <w:noProof/>
             <w:webHidden/>
           </w:rPr>
-          <w:instrText xml:space="preserve"> PAGEREF _Toc202873473 \h </w:instrText>
+          <w:instrText xml:space="preserve"> PAGEREF _Toc202900719 \h </w:instrText>
         </w:r>
         <w:r>
           <w:rPr>
@@ -2062,7 +2158,7 @@
             <w:noProof/>
             <w:webHidden/>
           </w:rPr>
-          <w:t>30</w:t>
+          <w:t>12</w:t>
         </w:r>
         <w:r>
           <w:rPr>
@@ -2074,7 +2170,421 @@
       </w:hyperlink>
     </w:p>
     <w:p>
-      <w:r>
+      <w:pPr>
+        <w:pStyle w:val="TableofFigures"/>
+        <w:tabs>
+          <w:tab w:val="right" w:leader="dot" w:pos="9016"/>
+        </w:tabs>
+        <w:rPr>
+          <w:noProof/>
+        </w:rPr>
+      </w:pPr>
+      <w:hyperlink w:anchor="_Toc202900720" w:history="1">
+        <w:r>
+          <w:rPr>
+            <w:rStyle w:val="Hyperlink"/>
+            <w:noProof/>
+          </w:rPr>
+          <w:t>Figure 2: Steam's All Products Page</w:t>
+        </w:r>
+        <w:r>
+          <w:rPr>
+            <w:noProof/>
+            <w:webHidden/>
+          </w:rPr>
+          <w:tab/>
+        </w:r>
+        <w:r>
+          <w:rPr>
+            <w:noProof/>
+            <w:webHidden/>
+          </w:rPr>
+          <w:fldChar w:fldCharType="begin"/>
+        </w:r>
+        <w:r>
+          <w:rPr>
+            <w:noProof/>
+            <w:webHidden/>
+          </w:rPr>
+          <w:instrText xml:space="preserve"> PAGEREF _Toc202900720 \h </w:instrText>
+        </w:r>
+        <w:r>
+          <w:rPr>
+            <w:noProof/>
+            <w:webHidden/>
+          </w:rPr>
+        </w:r>
+        <w:r>
+          <w:rPr>
+            <w:noProof/>
+            <w:webHidden/>
+          </w:rPr>
+          <w:fldChar w:fldCharType="separate"/>
+        </w:r>
+        <w:r>
+          <w:rPr>
+            <w:noProof/>
+            <w:webHidden/>
+          </w:rPr>
+          <w:t>13</w:t>
+        </w:r>
+        <w:r>
+          <w:rPr>
+            <w:noProof/>
+            <w:webHidden/>
+          </w:rPr>
+          <w:fldChar w:fldCharType="end"/>
+        </w:r>
+      </w:hyperlink>
+    </w:p>
+    <w:p>
+      <w:pPr>
+        <w:pStyle w:val="TableofFigures"/>
+        <w:tabs>
+          <w:tab w:val="right" w:leader="dot" w:pos="9016"/>
+        </w:tabs>
+        <w:rPr>
+          <w:noProof/>
+        </w:rPr>
+      </w:pPr>
+      <w:hyperlink w:anchor="_Toc202900721" w:history="1">
+        <w:r>
+          <w:rPr>
+            <w:rStyle w:val="Hyperlink"/>
+            <w:noProof/>
+          </w:rPr>
+          <w:t>Figure 3: Database Plan</w:t>
+        </w:r>
+        <w:r>
+          <w:rPr>
+            <w:noProof/>
+            <w:webHidden/>
+          </w:rPr>
+          <w:tab/>
+        </w:r>
+        <w:r>
+          <w:rPr>
+            <w:noProof/>
+            <w:webHidden/>
+          </w:rPr>
+          <w:fldChar w:fldCharType="begin"/>
+        </w:r>
+        <w:r>
+          <w:rPr>
+            <w:noProof/>
+            <w:webHidden/>
+          </w:rPr>
+          <w:instrText xml:space="preserve"> PAGEREF _Toc202900721 \h </w:instrText>
+        </w:r>
+        <w:r>
+          <w:rPr>
+            <w:noProof/>
+            <w:webHidden/>
+          </w:rPr>
+        </w:r>
+        <w:r>
+          <w:rPr>
+            <w:noProof/>
+            <w:webHidden/>
+          </w:rPr>
+          <w:fldChar w:fldCharType="separate"/>
+        </w:r>
+        <w:r>
+          <w:rPr>
+            <w:noProof/>
+            <w:webHidden/>
+          </w:rPr>
+          <w:t>18</w:t>
+        </w:r>
+        <w:r>
+          <w:rPr>
+            <w:noProof/>
+            <w:webHidden/>
+          </w:rPr>
+          <w:fldChar w:fldCharType="end"/>
+        </w:r>
+      </w:hyperlink>
+    </w:p>
+    <w:p>
+      <w:pPr>
+        <w:pStyle w:val="TableofFigures"/>
+        <w:tabs>
+          <w:tab w:val="right" w:leader="dot" w:pos="9016"/>
+        </w:tabs>
+        <w:rPr>
+          <w:noProof/>
+        </w:rPr>
+      </w:pPr>
+      <w:hyperlink w:anchor="_Toc202900722" w:history="1">
+        <w:r>
+          <w:rPr>
+            <w:rStyle w:val="Hyperlink"/>
+            <w:noProof/>
+          </w:rPr>
+          <w:t>Figure 4: Database Plan (Reduced)</w:t>
+        </w:r>
+        <w:r>
+          <w:rPr>
+            <w:noProof/>
+            <w:webHidden/>
+          </w:rPr>
+          <w:tab/>
+        </w:r>
+        <w:r>
+          <w:rPr>
+            <w:noProof/>
+            <w:webHidden/>
+          </w:rPr>
+          <w:fldChar w:fldCharType="begin"/>
+        </w:r>
+        <w:r>
+          <w:rPr>
+            <w:noProof/>
+            <w:webHidden/>
+          </w:rPr>
+          <w:instrText xml:space="preserve"> PAGEREF _Toc202900722 \h </w:instrText>
+        </w:r>
+        <w:r>
+          <w:rPr>
+            <w:noProof/>
+            <w:webHidden/>
+          </w:rPr>
+        </w:r>
+        <w:r>
+          <w:rPr>
+            <w:noProof/>
+            <w:webHidden/>
+          </w:rPr>
+          <w:fldChar w:fldCharType="separate"/>
+        </w:r>
+        <w:r>
+          <w:rPr>
+            <w:noProof/>
+            <w:webHidden/>
+          </w:rPr>
+          <w:t>19</w:t>
+        </w:r>
+        <w:r>
+          <w:rPr>
+            <w:noProof/>
+            <w:webHidden/>
+          </w:rPr>
+          <w:fldChar w:fldCharType="end"/>
+        </w:r>
+      </w:hyperlink>
+    </w:p>
+    <w:p>
+      <w:pPr>
+        <w:pStyle w:val="TableofFigures"/>
+        <w:tabs>
+          <w:tab w:val="right" w:leader="dot" w:pos="9016"/>
+        </w:tabs>
+        <w:rPr>
+          <w:noProof/>
+        </w:rPr>
+      </w:pPr>
+      <w:hyperlink w:anchor="_Toc202900723" w:history="1">
+        <w:r>
+          <w:rPr>
+            <w:rStyle w:val="Hyperlink"/>
+            <w:noProof/>
+          </w:rPr>
+          <w:t>Figure 5: Beautiful Soup Scraping Main</w:t>
+        </w:r>
+        <w:r>
+          <w:rPr>
+            <w:noProof/>
+            <w:webHidden/>
+          </w:rPr>
+          <w:tab/>
+        </w:r>
+        <w:r>
+          <w:rPr>
+            <w:noProof/>
+            <w:webHidden/>
+          </w:rPr>
+          <w:fldChar w:fldCharType="begin"/>
+        </w:r>
+        <w:r>
+          <w:rPr>
+            <w:noProof/>
+            <w:webHidden/>
+          </w:rPr>
+          <w:instrText xml:space="preserve"> PAGEREF _Toc202900723 \h </w:instrText>
+        </w:r>
+        <w:r>
+          <w:rPr>
+            <w:noProof/>
+            <w:webHidden/>
+          </w:rPr>
+        </w:r>
+        <w:r>
+          <w:rPr>
+            <w:noProof/>
+            <w:webHidden/>
+          </w:rPr>
+          <w:fldChar w:fldCharType="separate"/>
+        </w:r>
+        <w:r>
+          <w:rPr>
+            <w:noProof/>
+            <w:webHidden/>
+          </w:rPr>
+          <w:t>21</w:t>
+        </w:r>
+        <w:r>
+          <w:rPr>
+            <w:noProof/>
+            <w:webHidden/>
+          </w:rPr>
+          <w:fldChar w:fldCharType="end"/>
+        </w:r>
+      </w:hyperlink>
+    </w:p>
+    <w:p>
+      <w:pPr>
+        <w:pStyle w:val="TableofFigures"/>
+        <w:tabs>
+          <w:tab w:val="right" w:leader="dot" w:pos="9016"/>
+        </w:tabs>
+        <w:rPr>
+          <w:noProof/>
+        </w:rPr>
+      </w:pPr>
+      <w:hyperlink w:anchor="_Toc202900724" w:history="1">
+        <w:r>
+          <w:rPr>
+            <w:rStyle w:val="Hyperlink"/>
+            <w:noProof/>
+          </w:rPr>
+          <w:t>Figure 6: Beautiful Soup Scraping Per Page</w:t>
+        </w:r>
+        <w:r>
+          <w:rPr>
+            <w:noProof/>
+            <w:webHidden/>
+          </w:rPr>
+          <w:tab/>
+        </w:r>
+        <w:r>
+          <w:rPr>
+            <w:noProof/>
+            <w:webHidden/>
+          </w:rPr>
+          <w:fldChar w:fldCharType="begin"/>
+        </w:r>
+        <w:r>
+          <w:rPr>
+            <w:noProof/>
+            <w:webHidden/>
+          </w:rPr>
+          <w:instrText xml:space="preserve"> PAGEREF _Toc202900724 \h </w:instrText>
+        </w:r>
+        <w:r>
+          <w:rPr>
+            <w:noProof/>
+            <w:webHidden/>
+          </w:rPr>
+        </w:r>
+        <w:r>
+          <w:rPr>
+            <w:noProof/>
+            <w:webHidden/>
+          </w:rPr>
+          <w:fldChar w:fldCharType="separate"/>
+        </w:r>
+        <w:r>
+          <w:rPr>
+            <w:noProof/>
+            <w:webHidden/>
+          </w:rPr>
+          <w:t>21</w:t>
+        </w:r>
+        <w:r>
+          <w:rPr>
+            <w:noProof/>
+            <w:webHidden/>
+          </w:rPr>
+          <w:fldChar w:fldCharType="end"/>
+        </w:r>
+      </w:hyperlink>
+    </w:p>
+    <w:p>
+      <w:pPr>
+        <w:pStyle w:val="TableofFigures"/>
+        <w:tabs>
+          <w:tab w:val="right" w:leader="dot" w:pos="9016"/>
+        </w:tabs>
+        <w:rPr>
+          <w:noProof/>
+        </w:rPr>
+      </w:pPr>
+      <w:hyperlink w:anchor="_Toc202900725" w:history="1">
+        <w:r>
+          <w:rPr>
+            <w:rStyle w:val="Hyperlink"/>
+            <w:noProof/>
+          </w:rPr>
+          <w:t>Figure 7: Selenium Scraping Main</w:t>
+        </w:r>
+        <w:r>
+          <w:rPr>
+            <w:noProof/>
+            <w:webHidden/>
+          </w:rPr>
+          <w:tab/>
+        </w:r>
+        <w:r>
+          <w:rPr>
+            <w:noProof/>
+            <w:webHidden/>
+          </w:rPr>
+          <w:fldChar w:fldCharType="begin"/>
+        </w:r>
+        <w:r>
+          <w:rPr>
+            <w:noProof/>
+            <w:webHidden/>
+          </w:rPr>
+          <w:instrText xml:space="preserve"> PAGEREF _Toc202900725 \h </w:instrText>
+        </w:r>
+        <w:r>
+          <w:rPr>
+            <w:noProof/>
+            <w:webHidden/>
+          </w:rPr>
+        </w:r>
+        <w:r>
+          <w:rPr>
+            <w:noProof/>
+            <w:webHidden/>
+          </w:rPr>
+          <w:fldChar w:fldCharType="separate"/>
+        </w:r>
+        <w:r>
+          <w:rPr>
+            <w:noProof/>
+            <w:webHidden/>
+          </w:rPr>
+          <w:t>22</w:t>
+        </w:r>
+        <w:r>
+          <w:rPr>
+            <w:noProof/>
+            <w:webHidden/>
+          </w:rPr>
+          <w:fldChar w:fldCharType="end"/>
+        </w:r>
+      </w:hyperlink>
+    </w:p>
+    <w:p>
+      <w:r>
+        <w:rPr>
+          <w:b/>
+          <w:bCs/>
+          <w:noProof/>
+          <w:lang w:val="en-US"/>
+        </w:rPr>
         <w:fldChar w:fldCharType="end"/>
       </w:r>
       <w:r>
@@ -2082,33 +2592,15 @@
       </w:r>
     </w:p>
     <w:p>
-      <w:fldSimple w:instr=" TOC \h \z \c &quot;Figure&quot; ">
-        <w:r>
-          <w:rPr>
-            <w:b/>
-            <w:bCs/>
-            <w:noProof/>
-            <w:lang w:val="en-US"/>
-          </w:rPr>
-          <w:t>No table of figures entries found.</w:t>
-        </w:r>
-      </w:fldSimple>
-    </w:p>
-    <w:p>
-      <w:r>
-        <w:br w:type="page"/>
-      </w:r>
-    </w:p>
-    <w:p>
       <w:pPr>
         <w:pStyle w:val="Heading1"/>
       </w:pPr>
-      <w:bookmarkStart w:id="0" w:name="_Toc202873446"/>
+      <w:bookmarkStart w:id="1" w:name="_Toc202900749"/>
       <w:r>
         <w:lastRenderedPageBreak/>
         <w:t>Introduction</w:t>
       </w:r>
-      <w:bookmarkEnd w:id="0"/>
+      <w:bookmarkEnd w:id="1"/>
     </w:p>
     <w:p>
       <w:r>
@@ -2178,22 +2670,22 @@
       <w:pPr>
         <w:pStyle w:val="Heading1"/>
       </w:pPr>
-      <w:bookmarkStart w:id="1" w:name="_Toc202873447"/>
+      <w:bookmarkStart w:id="2" w:name="_Toc202900750"/>
       <w:r>
         <w:lastRenderedPageBreak/>
         <w:t>Literature Review</w:t>
       </w:r>
-      <w:bookmarkEnd w:id="1"/>
+      <w:bookmarkEnd w:id="2"/>
     </w:p>
     <w:p>
       <w:pPr>
         <w:pStyle w:val="Heading2"/>
       </w:pPr>
-      <w:bookmarkStart w:id="2" w:name="_Toc202873448"/>
+      <w:bookmarkStart w:id="3" w:name="_Toc202900751"/>
       <w:r>
         <w:t>Why a Tagging Website?</w:t>
       </w:r>
-      <w:bookmarkEnd w:id="2"/>
+      <w:bookmarkEnd w:id="3"/>
     </w:p>
     <w:p>
       <w:r>
@@ -2431,7 +2923,7 @@
       <w:pPr>
         <w:pStyle w:val="Heading2"/>
       </w:pPr>
-      <w:bookmarkStart w:id="3" w:name="_Toc202873449"/>
+      <w:bookmarkStart w:id="4" w:name="_Toc202900752"/>
       <w:r>
         <w:lastRenderedPageBreak/>
         <w:t>What is</w:t>
@@ -2442,7 +2934,7 @@
       <w:r>
         <w:t xml:space="preserve"> Why Use It?</w:t>
       </w:r>
-      <w:bookmarkEnd w:id="3"/>
+      <w:bookmarkEnd w:id="4"/>
     </w:p>
     <w:p>
       <w:r>
@@ -2548,22 +3040,22 @@
       <w:pPr>
         <w:pStyle w:val="Heading2"/>
       </w:pPr>
-      <w:bookmarkStart w:id="4" w:name="_Toc202873450"/>
+      <w:bookmarkStart w:id="5" w:name="_Toc202900753"/>
       <w:r>
         <w:lastRenderedPageBreak/>
         <w:t>Legal and Security Issues</w:t>
       </w:r>
-      <w:bookmarkEnd w:id="4"/>
+      <w:bookmarkEnd w:id="5"/>
     </w:p>
     <w:p>
       <w:pPr>
         <w:pStyle w:val="Heading3"/>
       </w:pPr>
-      <w:bookmarkStart w:id="5" w:name="_Toc202873451"/>
+      <w:bookmarkStart w:id="6" w:name="_Toc202900754"/>
       <w:r>
         <w:t>GDPR</w:t>
       </w:r>
-      <w:bookmarkEnd w:id="5"/>
+      <w:bookmarkEnd w:id="6"/>
     </w:p>
     <w:p>
       <w:r>
@@ -2798,7 +3290,39 @@
     </w:p>
     <w:p>
       <w:r>
-        <w:t>To implement this, we should inform users about their email’s usage, allow them to modify it at any time and allow them to delete their accounts whenever they request to.</w:t>
+        <w:t xml:space="preserve">To implement this, </w:t>
+      </w:r>
+      <w:r>
+        <w:t>users should be informed</w:t>
+      </w:r>
+      <w:r>
+        <w:t xml:space="preserve"> about their email’s usage, </w:t>
+      </w:r>
+      <w:r>
+        <w:t xml:space="preserve">they should also be able </w:t>
+      </w:r>
+      <w:r>
+        <w:t xml:space="preserve">to modify </w:t>
+      </w:r>
+      <w:r>
+        <w:t xml:space="preserve">their email </w:t>
+      </w:r>
+      <w:r>
+        <w:t xml:space="preserve">at any </w:t>
+      </w:r>
+      <w:proofErr w:type="gramStart"/>
+      <w:r>
+        <w:t>time</w:t>
+      </w:r>
+      <w:proofErr w:type="gramEnd"/>
+      <w:r>
+        <w:t xml:space="preserve"> and </w:t>
+      </w:r>
+      <w:r>
+        <w:t xml:space="preserve">they should be able </w:t>
+      </w:r>
+      <w:r>
+        <w:t>to delete their accounts whenever they request to.</w:t>
       </w:r>
       <w:r>
         <w:br w:type="page"/>
@@ -2808,12 +3332,12 @@
       <w:pPr>
         <w:pStyle w:val="Heading3"/>
       </w:pPr>
-      <w:bookmarkStart w:id="6" w:name="_Toc202873452"/>
+      <w:bookmarkStart w:id="7" w:name="_Toc202900755"/>
       <w:r>
         <w:lastRenderedPageBreak/>
         <w:t>Computer Misuse Act 1990</w:t>
       </w:r>
-      <w:bookmarkEnd w:id="6"/>
+      <w:bookmarkEnd w:id="7"/>
     </w:p>
     <w:p>
       <w:r>
@@ -2887,12 +3411,12 @@
       <w:pPr>
         <w:pStyle w:val="Heading3"/>
       </w:pPr>
-      <w:bookmarkStart w:id="7" w:name="_Toc202873453"/>
+      <w:bookmarkStart w:id="8" w:name="_Toc202900756"/>
       <w:r>
         <w:lastRenderedPageBreak/>
         <w:t>STRIDE</w:t>
       </w:r>
-      <w:bookmarkEnd w:id="7"/>
+      <w:bookmarkEnd w:id="8"/>
     </w:p>
     <w:p>
       <w:r>
@@ -3347,6 +3871,9 @@
     </w:tbl>
     <w:p>
       <w:r>
+        <w:t>(Conklin et al, n.d.)</w:t>
+      </w:r>
+      <w:r>
         <w:br w:type="page"/>
       </w:r>
     </w:p>
@@ -3358,7 +3885,7 @@
           <w:szCs w:val="20"/>
         </w:rPr>
       </w:pPr>
-      <w:bookmarkStart w:id="8" w:name="_Toc202873454"/>
+      <w:bookmarkStart w:id="9" w:name="_Toc202900757"/>
       <w:r>
         <w:lastRenderedPageBreak/>
         <w:t>Ad-Hoc</w:t>
@@ -3366,7 +3893,7 @@
       <w:r>
         <w:t xml:space="preserve"> Data Issue</w:t>
       </w:r>
-      <w:bookmarkEnd w:id="8"/>
+      <w:bookmarkEnd w:id="9"/>
     </w:p>
     <w:p>
       <w:r>
@@ -3584,18 +4111,21 @@
       </w:r>
     </w:p>
     <w:p>
-      <w:pPr>
-        <w:jc w:val="center"/>
-      </w:pPr>
-    </w:p>
-    <w:p>
-      <w:pPr>
-        <w:jc w:val="center"/>
-      </w:pPr>
-    </w:p>
-    <w:p>
-      <w:r>
-        <w:t>There is one part of these pages, however, that is not decided upon by the author. This is the video game tags which are described on the video game’s page as “Popular user-defined tags” (Steam, n.d.). This can be seen below:</w:t>
+      <w:r>
+        <w:lastRenderedPageBreak/>
+        <w:t>One part</w:t>
+      </w:r>
+      <w:r>
+        <w:t xml:space="preserve"> that is not decided upon by the autho</w:t>
+      </w:r>
+      <w:r>
+        <w:t>r</w:t>
+      </w:r>
+      <w:r>
+        <w:t xml:space="preserve"> </w:t>
+      </w:r>
+      <w:r>
+        <w:t>is the video game tags which are described on the video game’s page as “Popular user-defined tags” (Steam, n.d.). This can be seen below:</w:t>
       </w:r>
     </w:p>
     <w:p>
@@ -3660,7 +4190,10 @@
     </w:p>
     <w:p>
       <w:r>
-        <w:t xml:space="preserve">Because of this, while this information will still be collected, it would be best for there to be some sort of review process for these tags to make sure that they match the game they describe. </w:t>
+        <w:t xml:space="preserve">Because of this, </w:t>
+      </w:r>
+      <w:r>
+        <w:t>any data analysis performed with these tags should not be evidence for any conclusions and should instead be the foundation for further research. For the website, these user defined tags will be the basis for sorting video games.</w:t>
       </w:r>
     </w:p>
     <w:p>
@@ -3672,15 +4205,16 @@
       <w:pPr>
         <w:pStyle w:val="Heading1"/>
       </w:pPr>
-      <w:bookmarkStart w:id="9" w:name="_Toc202873455"/>
+      <w:bookmarkStart w:id="10" w:name="_Toc202900758"/>
       <w:r>
         <w:lastRenderedPageBreak/>
         <w:t>Methodology</w:t>
       </w:r>
-      <w:bookmarkEnd w:id="9"/>
-    </w:p>
-    <w:p>
-      <w:pPr>
+      <w:bookmarkEnd w:id="10"/>
+    </w:p>
+    <w:p>
+      <w:pPr>
+        <w:keepNext/>
         <w:jc w:val="center"/>
       </w:pPr>
       <w:r>
@@ -3740,6 +4274,28 @@
       </w:r>
     </w:p>
     <w:p>
+      <w:pPr>
+        <w:pStyle w:val="Caption"/>
+        <w:jc w:val="center"/>
+      </w:pPr>
+      <w:bookmarkStart w:id="11" w:name="_Toc202900719"/>
+      <w:r>
+        <w:t xml:space="preserve">Figure </w:t>
+      </w:r>
+      <w:fldSimple w:instr=" SEQ Figure \* ARABIC ">
+        <w:r>
+          <w:rPr>
+            <w:noProof/>
+          </w:rPr>
+          <w:t>1</w:t>
+        </w:r>
+      </w:fldSimple>
+      <w:r>
+        <w:t>: Development Process</w:t>
+      </w:r>
+      <w:bookmarkEnd w:id="11"/>
+    </w:p>
+    <w:p>
       <w:r>
         <w:t xml:space="preserve">Overall, the main goal of this project is to create a website that allows for users to search for video games </w:t>
       </w:r>
@@ -3773,7 +4329,13 @@
         </w:numPr>
       </w:pPr>
       <w:r>
-        <w:t>CSV: The data is then saved using the comma separated values format which will then be reviewed and normalised using Excel or Python.</w:t>
+        <w:t>CSV: The data is then saved using the comma separated values format which will then be normalised using Excel or Python</w:t>
+      </w:r>
+      <w:r>
+        <w:t xml:space="preserve"> and analysed for useful information (which will be presented in the results section of this report)</w:t>
+      </w:r>
+      <w:r>
+        <w:t>.</w:t>
       </w:r>
     </w:p>
     <w:p>
@@ -3802,7 +4364,10 @@
     </w:p>
     <w:p>
       <w:r>
-        <w:t>Once the website has been created, the final step will be to review the scraping program, the database and the website to see how well they meet the goals the project wishes to achieve and to determine what can be done to all parts to improve them for future use.</w:t>
+        <w:t>Once</w:t>
+      </w:r>
+      <w:r>
+        <w:t xml:space="preserve"> the website has been created, the final step will be to review the scraping program, the database and the website to see how well they meet the goals the project wishes to achieve and to determine what can be done to all parts to improve them for future use.</w:t>
       </w:r>
     </w:p>
     <w:p>
@@ -3814,34 +4379,37 @@
       <w:pPr>
         <w:pStyle w:val="Heading1"/>
       </w:pPr>
-      <w:bookmarkStart w:id="10" w:name="_Toc202873456"/>
+      <w:bookmarkStart w:id="12" w:name="_Toc202900759"/>
       <w:r>
         <w:lastRenderedPageBreak/>
         <w:t>Design/Plan</w:t>
       </w:r>
-      <w:bookmarkEnd w:id="10"/>
+      <w:bookmarkEnd w:id="12"/>
     </w:p>
     <w:p>
       <w:pPr>
         <w:pStyle w:val="Heading2"/>
       </w:pPr>
-      <w:bookmarkStart w:id="11" w:name="_Toc202873457"/>
+      <w:bookmarkStart w:id="13" w:name="_Toc202900760"/>
       <w:r>
         <w:t>Data Plan</w:t>
       </w:r>
-      <w:bookmarkEnd w:id="11"/>
+      <w:bookmarkEnd w:id="13"/>
     </w:p>
     <w:p>
       <w:pPr>
         <w:pStyle w:val="Heading3"/>
       </w:pPr>
-      <w:bookmarkStart w:id="12" w:name="_Toc202873458"/>
+      <w:bookmarkStart w:id="14" w:name="_Toc202900761"/>
       <w:r>
         <w:t>Target Website</w:t>
       </w:r>
-      <w:bookmarkEnd w:id="12"/>
-    </w:p>
-    <w:p>
+      <w:bookmarkEnd w:id="14"/>
+    </w:p>
+    <w:p>
+      <w:pPr>
+        <w:keepNext/>
+      </w:pPr>
       <w:r>
         <w:rPr>
           <w:noProof/>
@@ -3899,6 +4467,28 @@
       </w:r>
     </w:p>
     <w:p>
+      <w:pPr>
+        <w:pStyle w:val="Caption"/>
+        <w:jc w:val="center"/>
+      </w:pPr>
+      <w:bookmarkStart w:id="15" w:name="_Toc202900720"/>
+      <w:r>
+        <w:t xml:space="preserve">Figure </w:t>
+      </w:r>
+      <w:fldSimple w:instr=" SEQ Figure \* ARABIC ">
+        <w:r>
+          <w:rPr>
+            <w:noProof/>
+          </w:rPr>
+          <w:t>2</w:t>
+        </w:r>
+      </w:fldSimple>
+      <w:r>
+        <w:t>: Steam's All Products Page</w:t>
+      </w:r>
+      <w:bookmarkEnd w:id="15"/>
+    </w:p>
+    <w:p>
       <w:r>
         <w:t xml:space="preserve">For the scraping program to work, it needs a target. The target in this case is the previously mentioned online video game retailer, Steam. </w:t>
       </w:r>
@@ -3922,16 +4512,16 @@
       <w:pPr>
         <w:pStyle w:val="Heading3"/>
       </w:pPr>
-      <w:bookmarkStart w:id="13" w:name="_Toc202873459"/>
+      <w:bookmarkStart w:id="16" w:name="_Toc202900762"/>
       <w:r>
         <w:lastRenderedPageBreak/>
         <w:t>Scraping</w:t>
       </w:r>
-      <w:bookmarkEnd w:id="13"/>
-    </w:p>
-    <w:p>
-      <w:r>
-        <w:t>For the website to work, it needs a database full of information about various video games and that information needs to describe those video games in different ways to differentiate all of them. To get this data, as previously described, a scraping program will used that will be programmed in Python.</w:t>
+      <w:bookmarkEnd w:id="16"/>
+    </w:p>
+    <w:p>
+      <w:r>
+        <w:t>For the website to work, it needs a database full of information about various video games and that information needs to describe those video games in different ways to differentiate all of them. To get this data, a scraping program will used that will be programmed in Python.</w:t>
       </w:r>
     </w:p>
     <w:p>
@@ -4026,7 +4616,25 @@
     </w:p>
     <w:p>
       <w:r>
-        <w:t xml:space="preserve">The next part of this project is to learn how scraping works which will involve deciding which of these libraries (or others) should be used. </w:t>
+        <w:t>The next part of this project learn</w:t>
+      </w:r>
+      <w:r>
+        <w:t>ing</w:t>
+      </w:r>
+      <w:r>
+        <w:t xml:space="preserve"> how scraping works which will involve </w:t>
+      </w:r>
+      <w:r>
+        <w:t xml:space="preserve">learning these libraries and </w:t>
+      </w:r>
+      <w:r>
+        <w:t>deciding which of the</w:t>
+      </w:r>
+      <w:r>
+        <w:t>m (</w:t>
+      </w:r>
+      <w:r>
+        <w:t xml:space="preserve">or others) should be used. </w:t>
       </w:r>
     </w:p>
     <w:p>
@@ -4111,7 +4719,30 @@
         </w:numPr>
       </w:pPr>
       <w:r>
-        <w:t>The game’s title which can be found on the main page that shows all games and on the game’s page itself. This will be used on the website.</w:t>
+        <w:t xml:space="preserve">Title: </w:t>
+      </w:r>
+      <w:r>
+        <w:t xml:space="preserve">The </w:t>
+      </w:r>
+      <w:r>
+        <w:t xml:space="preserve">name of each video game. This is not essential to data </w:t>
+      </w:r>
+      <w:r>
+        <w:t>analysis but</w:t>
+      </w:r>
+      <w:r>
+        <w:t xml:space="preserve"> is necessary for when each video game is put on the website.</w:t>
+      </w:r>
+      <w:r>
+        <w:t xml:space="preserve"> The title can be found on both </w:t>
+      </w:r>
+      <w:proofErr w:type="gramStart"/>
+      <w:r>
+        <w:t>the all</w:t>
+      </w:r>
+      <w:proofErr w:type="gramEnd"/>
+      <w:r>
+        <w:t xml:space="preserve"> games page and on each game’s page as well.</w:t>
       </w:r>
     </w:p>
     <w:p>
@@ -4123,21 +4754,19 @@
         </w:numPr>
       </w:pPr>
       <w:r>
-        <w:t>The game’s description which can be found on the game’s page in both a short version at the top of the page and a longer version lower in the page. This is n</w:t>
-      </w:r>
-      <w:r>
-        <w:t>o</w:t>
-      </w:r>
-      <w:r>
-        <w:t xml:space="preserve">t inherently useful, but this will still be scraped nonetheless to be used </w:t>
-      </w:r>
-      <w:proofErr w:type="gramStart"/>
-      <w:r>
-        <w:t>in</w:t>
-      </w:r>
-      <w:proofErr w:type="gramEnd"/>
-      <w:r>
-        <w:t xml:space="preserve"> the website as the game’s description.</w:t>
+        <w:t xml:space="preserve">Description: </w:t>
+      </w:r>
+      <w:r>
+        <w:t>Each</w:t>
+      </w:r>
+      <w:r>
+        <w:t xml:space="preserve"> game’s description which can be found on the game’s page in both a short version at the top of the page and a longer version lower in the page. </w:t>
+      </w:r>
+      <w:r>
+        <w:t>Th</w:t>
+      </w:r>
+      <w:r>
+        <w:t>e description is not useful for data analysis and so only be used on the website to describe each game to the user.</w:t>
       </w:r>
     </w:p>
     <w:p>
@@ -4149,25 +4778,96 @@
         </w:numPr>
       </w:pPr>
       <w:r>
-        <w:t xml:space="preserve">The release date. </w:t>
-      </w:r>
-      <w:r>
-        <w:t>This is u</w:t>
-      </w:r>
-      <w:r>
-        <w:t xml:space="preserve">seful for data </w:t>
-      </w:r>
-      <w:r>
-        <w:t>analysis,</w:t>
-      </w:r>
-      <w:r>
-        <w:t xml:space="preserve"> and </w:t>
-      </w:r>
-      <w:r>
-        <w:t xml:space="preserve">this </w:t>
-      </w:r>
-      <w:r>
-        <w:t>will also be used on the website.</w:t>
+        <w:lastRenderedPageBreak/>
+        <w:t xml:space="preserve">Release date: The date when </w:t>
+      </w:r>
+      <w:r>
+        <w:t>each</w:t>
+      </w:r>
+      <w:r>
+        <w:t xml:space="preserve"> game was released. This is useful for data analysis as it allows for the sorting of data by date. This will also be used on the website for the user to see.</w:t>
+      </w:r>
+    </w:p>
+    <w:p>
+      <w:pPr>
+        <w:pStyle w:val="ListParagraph"/>
+        <w:keepNext/>
+        <w:jc w:val="center"/>
+      </w:pPr>
+      <w:r>
+        <w:rPr>
+          <w:noProof/>
+        </w:rPr>
+        <w:drawing>
+          <wp:inline distT="0" distB="0" distL="0" distR="0" wp14:anchorId="65A33697" wp14:editId="7791FFA9">
+            <wp:extent cx="3105150" cy="1095375"/>
+            <wp:effectExtent l="38100" t="38100" r="38100" b="47625"/>
+            <wp:docPr id="619320850" name="Picture 2"/>
+            <wp:cNvGraphicFramePr>
+              <a:graphicFrameLocks xmlns:a="http://schemas.openxmlformats.org/drawingml/2006/main" noChangeAspect="1"/>
+            </wp:cNvGraphicFramePr>
+            <a:graphic xmlns:a="http://schemas.openxmlformats.org/drawingml/2006/main">
+              <a:graphicData uri="http://schemas.openxmlformats.org/drawingml/2006/picture">
+                <pic:pic xmlns:pic="http://schemas.openxmlformats.org/drawingml/2006/picture">
+                  <pic:nvPicPr>
+                    <pic:cNvPr id="0" name="Picture 2"/>
+                    <pic:cNvPicPr>
+                      <a:picLocks noChangeAspect="1" noChangeArrowheads="1"/>
+                    </pic:cNvPicPr>
+                  </pic:nvPicPr>
+                  <pic:blipFill>
+                    <a:blip r:embed="rId12">
+                      <a:extLst>
+                        <a:ext uri="{28A0092B-C50C-407E-A947-70E740481C1C}">
+                          <a14:useLocalDpi xmlns:a14="http://schemas.microsoft.com/office/drawing/2010/main" val="0"/>
+                        </a:ext>
+                      </a:extLst>
+                    </a:blip>
+                    <a:srcRect/>
+                    <a:stretch>
+                      <a:fillRect/>
+                    </a:stretch>
+                  </pic:blipFill>
+                  <pic:spPr bwMode="auto">
+                    <a:xfrm>
+                      <a:off x="0" y="0"/>
+                      <a:ext cx="3105150" cy="1095375"/>
+                    </a:xfrm>
+                    <a:prstGeom prst="rect">
+                      <a:avLst/>
+                    </a:prstGeom>
+                    <a:noFill/>
+                    <a:ln w="38100">
+                      <a:solidFill>
+                        <a:schemeClr val="accent4"/>
+                      </a:solidFill>
+                    </a:ln>
+                  </pic:spPr>
+                </pic:pic>
+              </a:graphicData>
+            </a:graphic>
+          </wp:inline>
+        </w:drawing>
+      </w:r>
+    </w:p>
+    <w:p>
+      <w:pPr>
+        <w:pStyle w:val="Caption"/>
+        <w:jc w:val="center"/>
+      </w:pPr>
+      <w:r>
+        <w:t xml:space="preserve">Figure </w:t>
+      </w:r>
+      <w:fldSimple w:instr=" SEQ Figure \* ARABIC ">
+        <w:r>
+          <w:rPr>
+            <w:noProof/>
+          </w:rPr>
+          <w:t>3</w:t>
+        </w:r>
+      </w:fldSimple>
+      <w:r>
+        <w:t>: Steam Developers and Publishers</w:t>
       </w:r>
     </w:p>
     <w:p>
@@ -4179,11 +4879,30 @@
         </w:numPr>
       </w:pPr>
       <w:r>
-        <w:lastRenderedPageBreak/>
-        <w:t xml:space="preserve">The game’s developer(s). </w:t>
-      </w:r>
-      <w:r>
-        <w:t>This is useful for knowing which developer(s) made which games so they can be grouped together which will be useful with data analysis. This will be used on the website as well.</w:t>
+        <w:t>Developer(s)</w:t>
+      </w:r>
+      <w:r>
+        <w:t xml:space="preserve">. </w:t>
+      </w:r>
+      <w:r>
+        <w:t>The people or companies that produced each game</w:t>
+      </w:r>
+      <w:r>
+        <w:t>. Some games</w:t>
+      </w:r>
+      <w:r>
+        <w:t>, as shown above, have multiple developers</w:t>
+      </w:r>
+      <w:r>
+        <w:t xml:space="preserve"> separated by commas. Data analysis can be done on the developers to determine, for example, the developer with most expensive games. This will be included </w:t>
+      </w:r>
+      <w:proofErr w:type="gramStart"/>
+      <w:r>
+        <w:t>in</w:t>
+      </w:r>
+      <w:proofErr w:type="gramEnd"/>
+      <w:r>
+        <w:t xml:space="preserve"> the website.</w:t>
       </w:r>
     </w:p>
     <w:p>
@@ -4195,10 +4914,15 @@
         </w:numPr>
       </w:pPr>
       <w:r>
-        <w:t>The game’s publisher(s)</w:t>
-      </w:r>
-      <w:r>
-        <w:t>. This is useful in the same way as the developer(s): to help group games together which will be useful with data analysis. This will be used on the website along with the developer(s)</w:t>
+        <w:t xml:space="preserve">Publisher(s). The company or companies that help to publish each game. As with the developers, some games have multiple publishers. This will be used for data analysis for the same reason as the developers. This will be included </w:t>
+      </w:r>
+      <w:proofErr w:type="gramStart"/>
+      <w:r>
+        <w:t>in</w:t>
+      </w:r>
+      <w:proofErr w:type="gramEnd"/>
+      <w:r>
+        <w:t xml:space="preserve"> the website.</w:t>
       </w:r>
     </w:p>
     <w:p>
@@ -4210,7 +4934,21 @@
         </w:numPr>
       </w:pPr>
       <w:r>
-        <w:t xml:space="preserve">The user defined tags which were mentioned previously. This will mostly be useful </w:t>
+        <w:t xml:space="preserve">User defined tags. Mentioned previously, the </w:t>
+      </w:r>
+      <w:r>
+        <w:t xml:space="preserve">user </w:t>
+      </w:r>
+      <w:proofErr w:type="gramStart"/>
+      <w:r>
+        <w:t>describe</w:t>
+      </w:r>
+      <w:proofErr w:type="gramEnd"/>
+      <w:r>
+        <w:t xml:space="preserve"> the content of each video game.</w:t>
+      </w:r>
+      <w:r>
+        <w:t xml:space="preserve"> This will mostly be useful </w:t>
       </w:r>
       <w:proofErr w:type="gramStart"/>
       <w:r>
@@ -4230,17 +4968,95 @@
         </w:numPr>
       </w:pPr>
       <w:r>
-        <w:t xml:space="preserve">The game’s price. Very useful for data analysis when used in conjunction with the previous mentioned data, but this will </w:t>
-      </w:r>
+        <w:t>Price</w:t>
+      </w:r>
+      <w:r>
+        <w:t>. Very useful for data analysis when used in conjunction with the previous mentioned data</w:t>
+      </w:r>
+      <w:r>
+        <w:t>. This will be used on the website.</w:t>
+      </w:r>
+    </w:p>
+    <w:p>
+      <w:pPr>
+        <w:pStyle w:val="ListParagraph"/>
+        <w:keepNext/>
+        <w:jc w:val="center"/>
+      </w:pPr>
       <w:r>
         <w:rPr>
-          <w:i/>
-          <w:iCs/>
+          <w:noProof/>
         </w:rPr>
-        <w:t>not</w:t>
-      </w:r>
-      <w:r>
-        <w:t xml:space="preserve"> be used on the website.</w:t>
+        <w:drawing>
+          <wp:inline distT="0" distB="0" distL="0" distR="0" wp14:anchorId="447D13BF" wp14:editId="620CDDD9">
+            <wp:extent cx="5133975" cy="504825"/>
+            <wp:effectExtent l="38100" t="38100" r="47625" b="47625"/>
+            <wp:docPr id="1494213283" name="Picture 4"/>
+            <wp:cNvGraphicFramePr>
+              <a:graphicFrameLocks xmlns:a="http://schemas.openxmlformats.org/drawingml/2006/main" noChangeAspect="1"/>
+            </wp:cNvGraphicFramePr>
+            <a:graphic xmlns:a="http://schemas.openxmlformats.org/drawingml/2006/main">
+              <a:graphicData uri="http://schemas.openxmlformats.org/drawingml/2006/picture">
+                <pic:pic xmlns:pic="http://schemas.openxmlformats.org/drawingml/2006/picture">
+                  <pic:nvPicPr>
+                    <pic:cNvPr id="0" name="Picture 4"/>
+                    <pic:cNvPicPr>
+                      <a:picLocks noChangeAspect="1" noChangeArrowheads="1"/>
+                    </pic:cNvPicPr>
+                  </pic:nvPicPr>
+                  <pic:blipFill>
+                    <a:blip r:embed="rId13">
+                      <a:extLst>
+                        <a:ext uri="{28A0092B-C50C-407E-A947-70E740481C1C}">
+                          <a14:useLocalDpi xmlns:a14="http://schemas.microsoft.com/office/drawing/2010/main" val="0"/>
+                        </a:ext>
+                      </a:extLst>
+                    </a:blip>
+                    <a:srcRect/>
+                    <a:stretch>
+                      <a:fillRect/>
+                    </a:stretch>
+                  </pic:blipFill>
+                  <pic:spPr bwMode="auto">
+                    <a:xfrm>
+                      <a:off x="0" y="0"/>
+                      <a:ext cx="5133975" cy="504825"/>
+                    </a:xfrm>
+                    <a:prstGeom prst="rect">
+                      <a:avLst/>
+                    </a:prstGeom>
+                    <a:noFill/>
+                    <a:ln w="38100">
+                      <a:solidFill>
+                        <a:schemeClr val="accent4"/>
+                      </a:solidFill>
+                    </a:ln>
+                  </pic:spPr>
+                </pic:pic>
+              </a:graphicData>
+            </a:graphic>
+          </wp:inline>
+        </w:drawing>
+      </w:r>
+    </w:p>
+    <w:p>
+      <w:pPr>
+        <w:pStyle w:val="Caption"/>
+        <w:jc w:val="center"/>
+      </w:pPr>
+      <w:r>
+        <w:t xml:space="preserve">Figure </w:t>
+      </w:r>
+      <w:fldSimple w:instr=" SEQ Figure \* ARABIC ">
+        <w:r>
+          <w:rPr>
+            <w:noProof/>
+          </w:rPr>
+          <w:t>4</w:t>
+        </w:r>
+      </w:fldSimple>
+      <w:r>
+        <w:t>: HTML of Game Features</w:t>
       </w:r>
     </w:p>
     <w:p>
@@ -4252,15 +5068,16 @@
         </w:numPr>
       </w:pPr>
       <w:r>
-        <w:t>The game’s “features”. The section that contains these “features” does not have a heading or any text to title it, but the HTML calls it “</w:t>
-      </w:r>
-      <w:proofErr w:type="spellStart"/>
-      <w:r>
-        <w:t>game_area_features_list_ctn</w:t>
-      </w:r>
-      <w:proofErr w:type="spellEnd"/>
-      <w:r>
-        <w:t>”. This will be used in data analysis, but when used on the website, it will most likely be mixed with the user defined tags as they are both quite similar.</w:t>
+        <w:t>“Features”. The features seem to describe the</w:t>
+      </w:r>
+      <w:r>
+        <w:t xml:space="preserve"> gameplay features that make up a game such as the game being singleplayer or multiplayer, what the game can be played on, if the game has achievements or if there are any third part agreements that need to be made to play the game. This section does not have a header and so the name of this data is taken from the HTML where it is called “game_area_features_list_ctn”. This will be useful for data analysis just like user defined tags and will also be </w:t>
+      </w:r>
+      <w:r>
+        <w:t>on</w:t>
+      </w:r>
+      <w:r>
+        <w:t xml:space="preserve"> the website.</w:t>
       </w:r>
     </w:p>
     <w:p>
@@ -4272,18 +5089,13 @@
         </w:numPr>
       </w:pPr>
       <w:r>
+        <w:t xml:space="preserve">Languages. </w:t>
+      </w:r>
+      <w:r>
         <w:t xml:space="preserve">The game’s supported languages. This is laid out on each game’s page as a table which describes which parts of the game support which language (E.G: A game’s interface might support English, but it might not have English audio). </w:t>
       </w:r>
       <w:r>
-        <w:t xml:space="preserve">This will not be used in data </w:t>
-      </w:r>
-      <w:proofErr w:type="gramStart"/>
-      <w:r>
-        <w:t>analysis, but</w:t>
-      </w:r>
-      <w:proofErr w:type="gramEnd"/>
-      <w:r>
-        <w:t xml:space="preserve"> will be used on the website to show which game’s support which languages.</w:t>
+        <w:t>This will be used on the website to show supported languages and will be used in data analysis.</w:t>
       </w:r>
     </w:p>
     <w:p>
@@ -4295,6 +5107,9 @@
         </w:numPr>
       </w:pPr>
       <w:r>
+        <w:t xml:space="preserve">Genre. </w:t>
+      </w:r>
+      <w:r>
         <w:t xml:space="preserve">The game’s genres. This is very similar to user </w:t>
       </w:r>
       <w:proofErr w:type="gramStart"/>
@@ -4305,8 +5120,6 @@
       <w:r>
         <w:t xml:space="preserve"> is more general. This will be used in data analysis and on the website.</w:t>
       </w:r>
-    </w:p>
-    <w:p>
       <w:r>
         <w:br w:type="page"/>
       </w:r>
@@ -4315,12 +5128,12 @@
       <w:pPr>
         <w:pStyle w:val="Heading3"/>
       </w:pPr>
-      <w:bookmarkStart w:id="14" w:name="_Toc202873460"/>
+      <w:bookmarkStart w:id="17" w:name="_Toc202900763"/>
       <w:r>
         <w:lastRenderedPageBreak/>
         <w:t>Saving Format (.CSV)</w:t>
       </w:r>
-      <w:bookmarkEnd w:id="14"/>
+      <w:bookmarkEnd w:id="17"/>
     </w:p>
     <w:p>
       <w:r>
@@ -4358,12 +5171,12 @@
       <w:pPr>
         <w:pStyle w:val="Heading3"/>
       </w:pPr>
-      <w:bookmarkStart w:id="15" w:name="_Toc202873461"/>
+      <w:bookmarkStart w:id="18" w:name="_Toc202900764"/>
       <w:r>
         <w:lastRenderedPageBreak/>
         <w:t>Database (MySQL)</w:t>
       </w:r>
-      <w:bookmarkEnd w:id="15"/>
+      <w:bookmarkEnd w:id="18"/>
     </w:p>
     <w:p>
       <w:r>
@@ -4409,6 +5222,9 @@
       </w:r>
     </w:p>
     <w:p>
+      <w:pPr>
+        <w:keepNext/>
+      </w:pPr>
       <w:r>
         <w:rPr>
           <w:noProof/>
@@ -4432,7 +5248,7 @@
                     </pic:cNvPicPr>
                   </pic:nvPicPr>
                   <pic:blipFill>
-                    <a:blip r:embed="rId12" cstate="print">
+                    <a:blip r:embed="rId14" cstate="print">
                       <a:extLst>
                         <a:ext uri="{28A0092B-C50C-407E-A947-70E740481C1C}">
                           <a14:useLocalDpi xmlns:a14="http://schemas.microsoft.com/office/drawing/2010/main" val="0"/>
@@ -4467,6 +5283,28 @@
       </w:r>
     </w:p>
     <w:p>
+      <w:pPr>
+        <w:pStyle w:val="Caption"/>
+        <w:jc w:val="center"/>
+      </w:pPr>
+      <w:bookmarkStart w:id="19" w:name="_Toc202900721"/>
+      <w:r>
+        <w:t xml:space="preserve">Figure </w:t>
+      </w:r>
+      <w:fldSimple w:instr=" SEQ Figure \* ARABIC ">
+        <w:r>
+          <w:rPr>
+            <w:noProof/>
+          </w:rPr>
+          <w:t>5</w:t>
+        </w:r>
+      </w:fldSimple>
+      <w:r>
+        <w:t>: Database Plan</w:t>
+      </w:r>
+      <w:bookmarkEnd w:id="19"/>
+    </w:p>
+    <w:p>
       <w:r>
         <w:t xml:space="preserve">Above is a plan for the database. In it, the green boxes are regular tables that define different bits of data. The purple boxes, however, are link tables which describe how the data in two or more tables are linked. At the most basic level, the link tables hold the ids of the columns that are linked. For example, a user in the user table linked to their review in the review table will have a column in the </w:t>
       </w:r>
@@ -4490,6 +5328,9 @@
       </w:r>
     </w:p>
     <w:p>
+      <w:pPr>
+        <w:keepNext/>
+      </w:pPr>
       <w:r>
         <w:rPr>
           <w:noProof/>
@@ -4513,7 +5354,7 @@
                     </pic:cNvPicPr>
                   </pic:nvPicPr>
                   <pic:blipFill>
-                    <a:blip r:embed="rId13">
+                    <a:blip r:embed="rId15">
                       <a:extLst>
                         <a:ext uri="{28A0092B-C50C-407E-A947-70E740481C1C}">
                           <a14:useLocalDpi xmlns:a14="http://schemas.microsoft.com/office/drawing/2010/main" val="0"/>
@@ -4548,6 +5389,28 @@
       </w:r>
     </w:p>
     <w:p>
+      <w:pPr>
+        <w:pStyle w:val="Caption"/>
+        <w:jc w:val="center"/>
+      </w:pPr>
+      <w:bookmarkStart w:id="20" w:name="_Toc202900722"/>
+      <w:r>
+        <w:t xml:space="preserve">Figure </w:t>
+      </w:r>
+      <w:fldSimple w:instr=" SEQ Figure \* ARABIC ">
+        <w:r>
+          <w:rPr>
+            <w:noProof/>
+          </w:rPr>
+          <w:t>6</w:t>
+        </w:r>
+      </w:fldSimple>
+      <w:r>
+        <w:t>: Database Plan (Reduced)</w:t>
+      </w:r>
+      <w:bookmarkEnd w:id="20"/>
+    </w:p>
+    <w:p>
       <w:r>
         <w:t>Here is a clearer diagram that shows only the games, users tags and tag aliases tables.</w:t>
       </w:r>
@@ -4561,12 +5424,12 @@
       <w:pPr>
         <w:pStyle w:val="Heading1"/>
       </w:pPr>
-      <w:bookmarkStart w:id="16" w:name="_Toc202873462"/>
+      <w:bookmarkStart w:id="21" w:name="_Toc202900765"/>
       <w:r>
         <w:lastRenderedPageBreak/>
         <w:t>Scraping Practice</w:t>
       </w:r>
-      <w:bookmarkEnd w:id="16"/>
+      <w:bookmarkEnd w:id="21"/>
     </w:p>
     <w:p>
       <w:r>
@@ -4623,7 +5486,15 @@
       </w:r>
       <w:proofErr w:type="gramEnd"/>
       <w:r>
-        <w:t xml:space="preserve"> the links are looped through and both programs visit the pages they hold. Once on each page, three elements are found, with those being:</w:t>
+        <w:t xml:space="preserve"> the links are looped </w:t>
+      </w:r>
+      <w:proofErr w:type="gramStart"/>
+      <w:r>
+        <w:t>through</w:t>
+      </w:r>
+      <w:proofErr w:type="gramEnd"/>
+      <w:r>
+        <w:t xml:space="preserve"> and both programs visit the pages they hold. Once on each page, three elements are found, with those being:</w:t>
       </w:r>
     </w:p>
     <w:p>
@@ -4734,6 +5605,7 @@
     </w:p>
     <w:p>
       <w:pPr>
+        <w:keepNext/>
         <w:jc w:val="center"/>
       </w:pPr>
       <w:r>
@@ -4759,7 +5631,7 @@
                     </pic:cNvPicPr>
                   </pic:nvPicPr>
                   <pic:blipFill>
-                    <a:blip r:embed="rId14">
+                    <a:blip r:embed="rId16">
                       <a:extLst>
                         <a:ext uri="{28A0092B-C50C-407E-A947-70E740481C1C}">
                           <a14:useLocalDpi xmlns:a14="http://schemas.microsoft.com/office/drawing/2010/main" val="0"/>
@@ -4794,6 +5666,28 @@
       </w:r>
     </w:p>
     <w:p>
+      <w:pPr>
+        <w:pStyle w:val="Caption"/>
+        <w:jc w:val="center"/>
+      </w:pPr>
+      <w:bookmarkStart w:id="22" w:name="_Toc202900723"/>
+      <w:r>
+        <w:t xml:space="preserve">Figure </w:t>
+      </w:r>
+      <w:fldSimple w:instr=" SEQ Figure \* ARABIC ">
+        <w:r>
+          <w:rPr>
+            <w:noProof/>
+          </w:rPr>
+          <w:t>7</w:t>
+        </w:r>
+      </w:fldSimple>
+      <w:r>
+        <w:t>: Beautiful Soup Scraping Main</w:t>
+      </w:r>
+      <w:bookmarkEnd w:id="22"/>
+    </w:p>
+    <w:p>
       <w:r>
         <w:t xml:space="preserve">For the requests and beautiful soup program, </w:t>
       </w:r>
@@ -4823,6 +5717,7 @@
     </w:p>
     <w:p>
       <w:pPr>
+        <w:keepNext/>
         <w:jc w:val="center"/>
       </w:pPr>
       <w:r>
@@ -4830,7 +5725,7 @@
           <w:noProof/>
         </w:rPr>
         <w:drawing>
-          <wp:inline distT="0" distB="0" distL="0" distR="0" wp14:anchorId="40ABE2E5" wp14:editId="7B02BFCC">
+          <wp:inline distT="0" distB="0" distL="0" distR="0" wp14:anchorId="40ABE2E5" wp14:editId="205F2EE3">
             <wp:extent cx="4162425" cy="1246650"/>
             <wp:effectExtent l="38100" t="38100" r="28575" b="29845"/>
             <wp:docPr id="1701288164" name="Picture 2" descr="A computer screen with text on it&#10;&#10;AI-generated content may be incorrect."/>
@@ -4847,7 +5742,7 @@
                     </pic:cNvPicPr>
                   </pic:nvPicPr>
                   <pic:blipFill>
-                    <a:blip r:embed="rId15" cstate="print">
+                    <a:blip r:embed="rId17" cstate="print">
                       <a:extLst>
                         <a:ext uri="{28A0092B-C50C-407E-A947-70E740481C1C}">
                           <a14:useLocalDpi xmlns:a14="http://schemas.microsoft.com/office/drawing/2010/main" val="0"/>
@@ -4882,6 +5777,28 @@
       </w:r>
     </w:p>
     <w:p>
+      <w:pPr>
+        <w:pStyle w:val="Caption"/>
+        <w:jc w:val="center"/>
+      </w:pPr>
+      <w:bookmarkStart w:id="23" w:name="_Toc202900724"/>
+      <w:r>
+        <w:t xml:space="preserve">Figure </w:t>
+      </w:r>
+      <w:fldSimple w:instr=" SEQ Figure \* ARABIC ">
+        <w:r>
+          <w:rPr>
+            <w:noProof/>
+          </w:rPr>
+          <w:t>8</w:t>
+        </w:r>
+      </w:fldSimple>
+      <w:r>
+        <w:t>: Beautiful Soup Scraping Per Page</w:t>
+      </w:r>
+      <w:bookmarkEnd w:id="23"/>
+    </w:p>
+    <w:p>
       <w:r>
         <w:t xml:space="preserve">However, from experimentation, Beautiful Soup does not allow for further searches on elements returned from a search. This </w:t>
       </w:r>
@@ -4906,6 +5823,7 @@
     </w:p>
     <w:p>
       <w:pPr>
+        <w:keepNext/>
         <w:jc w:val="center"/>
       </w:pPr>
       <w:r>
@@ -4931,7 +5849,7 @@
                     </pic:cNvPicPr>
                   </pic:nvPicPr>
                   <pic:blipFill>
-                    <a:blip r:embed="rId16">
+                    <a:blip r:embed="rId18">
                       <a:extLst>
                         <a:ext uri="{28A0092B-C50C-407E-A947-70E740481C1C}">
                           <a14:useLocalDpi xmlns:a14="http://schemas.microsoft.com/office/drawing/2010/main" val="0"/>
@@ -4966,6 +5884,28 @@
       </w:r>
     </w:p>
     <w:p>
+      <w:pPr>
+        <w:pStyle w:val="Caption"/>
+        <w:jc w:val="center"/>
+      </w:pPr>
+      <w:bookmarkStart w:id="24" w:name="_Toc202900725"/>
+      <w:r>
+        <w:t xml:space="preserve">Figure </w:t>
+      </w:r>
+      <w:fldSimple w:instr=" SEQ Figure \* ARABIC ">
+        <w:r>
+          <w:rPr>
+            <w:noProof/>
+          </w:rPr>
+          <w:t>9</w:t>
+        </w:r>
+      </w:fldSimple>
+      <w:r>
+        <w:t>: Selenium Scraping Main</w:t>
+      </w:r>
+      <w:bookmarkEnd w:id="24"/>
+    </w:p>
+    <w:p>
       <w:r>
         <w:t xml:space="preserve">For the selenium program (using the Firefox web browser), the code is quite </w:t>
       </w:r>
@@ -5028,25 +5968,22 @@
       <w:pPr>
         <w:pStyle w:val="Heading1"/>
       </w:pPr>
-      <w:bookmarkStart w:id="17" w:name="_Toc202873463"/>
+      <w:bookmarkStart w:id="25" w:name="_Toc202900766"/>
       <w:r>
         <w:lastRenderedPageBreak/>
         <w:t>Development</w:t>
       </w:r>
-      <w:r>
-        <w:t xml:space="preserve"> &amp; Data Analysis</w:t>
-      </w:r>
-      <w:bookmarkEnd w:id="17"/>
+      <w:bookmarkEnd w:id="25"/>
     </w:p>
     <w:p>
       <w:pPr>
         <w:pStyle w:val="Heading2"/>
       </w:pPr>
-      <w:bookmarkStart w:id="18" w:name="_Toc202873464"/>
+      <w:bookmarkStart w:id="26" w:name="_Toc202900767"/>
       <w:r>
         <w:t>Scraping Program</w:t>
       </w:r>
-      <w:bookmarkEnd w:id="18"/>
+      <w:bookmarkEnd w:id="26"/>
     </w:p>
     <w:p/>
     <w:p>
@@ -5058,28 +5995,12 @@
       <w:pPr>
         <w:pStyle w:val="Heading2"/>
       </w:pPr>
-      <w:bookmarkStart w:id="19" w:name="_Toc202873465"/>
-      <w:r>
-        <w:lastRenderedPageBreak/>
-        <w:t>Data Analysis</w:t>
-      </w:r>
-      <w:bookmarkEnd w:id="19"/>
-    </w:p>
-    <w:p>
-      <w:r>
-        <w:br w:type="page"/>
-      </w:r>
-    </w:p>
-    <w:p>
-      <w:pPr>
-        <w:pStyle w:val="Heading2"/>
-      </w:pPr>
-      <w:bookmarkStart w:id="20" w:name="_Toc202873466"/>
+      <w:bookmarkStart w:id="27" w:name="_Toc202900768"/>
       <w:r>
         <w:lastRenderedPageBreak/>
         <w:t>MySQL Database</w:t>
       </w:r>
-      <w:bookmarkEnd w:id="20"/>
+      <w:bookmarkEnd w:id="27"/>
     </w:p>
     <w:p/>
     <w:p>
@@ -5091,12 +6012,12 @@
       <w:pPr>
         <w:pStyle w:val="Heading2"/>
       </w:pPr>
-      <w:bookmarkStart w:id="21" w:name="_Toc202873467"/>
+      <w:bookmarkStart w:id="28" w:name="_Toc202900769"/>
       <w:r>
         <w:lastRenderedPageBreak/>
         <w:t>Website</w:t>
       </w:r>
-      <w:bookmarkEnd w:id="21"/>
+      <w:bookmarkEnd w:id="28"/>
     </w:p>
     <w:p/>
     <w:p>
@@ -5108,22 +6029,25 @@
       <w:pPr>
         <w:pStyle w:val="Heading1"/>
       </w:pPr>
-      <w:bookmarkStart w:id="22" w:name="_Toc202873468"/>
+      <w:bookmarkStart w:id="29" w:name="_Toc202900770"/>
       <w:r>
         <w:lastRenderedPageBreak/>
         <w:t>Results/Findings</w:t>
       </w:r>
-      <w:bookmarkEnd w:id="22"/>
+      <w:bookmarkEnd w:id="29"/>
     </w:p>
     <w:p>
       <w:pPr>
         <w:pStyle w:val="Heading2"/>
       </w:pPr>
-      <w:bookmarkStart w:id="23" w:name="_Toc202873469"/>
+      <w:bookmarkStart w:id="30" w:name="_Toc202900771"/>
       <w:r>
         <w:t>Scraping Program</w:t>
       </w:r>
-      <w:bookmarkEnd w:id="23"/>
+      <w:r>
+        <w:t xml:space="preserve"> &amp; Data Analysis</w:t>
+      </w:r>
+      <w:bookmarkEnd w:id="30"/>
     </w:p>
     <w:p/>
     <w:p>
@@ -5135,12 +6059,12 @@
       <w:pPr>
         <w:pStyle w:val="Heading2"/>
       </w:pPr>
-      <w:bookmarkStart w:id="24" w:name="_Toc202873470"/>
+      <w:bookmarkStart w:id="31" w:name="_Toc202900772"/>
       <w:r>
         <w:lastRenderedPageBreak/>
         <w:t>MySQL Database</w:t>
       </w:r>
-      <w:bookmarkEnd w:id="24"/>
+      <w:bookmarkEnd w:id="31"/>
     </w:p>
     <w:p/>
     <w:p>
@@ -5152,12 +6076,12 @@
       <w:pPr>
         <w:pStyle w:val="Heading2"/>
       </w:pPr>
-      <w:bookmarkStart w:id="25" w:name="_Toc202873471"/>
+      <w:bookmarkStart w:id="32" w:name="_Toc202900773"/>
       <w:r>
         <w:lastRenderedPageBreak/>
         <w:t>Website</w:t>
       </w:r>
-      <w:bookmarkEnd w:id="25"/>
+      <w:bookmarkEnd w:id="32"/>
     </w:p>
     <w:p/>
     <w:p>
@@ -5169,12 +6093,12 @@
       <w:pPr>
         <w:pStyle w:val="Heading1"/>
       </w:pPr>
-      <w:bookmarkStart w:id="26" w:name="_Toc202873472"/>
+      <w:bookmarkStart w:id="33" w:name="_Toc202900774"/>
       <w:r>
         <w:lastRenderedPageBreak/>
         <w:t>Conclusion</w:t>
       </w:r>
-      <w:bookmarkEnd w:id="26"/>
+      <w:bookmarkEnd w:id="33"/>
     </w:p>
     <w:p/>
     <w:p>
@@ -5186,12 +6110,12 @@
       <w:pPr>
         <w:pStyle w:val="Heading1"/>
       </w:pPr>
-      <w:bookmarkStart w:id="27" w:name="_Toc202873473"/>
+      <w:bookmarkStart w:id="34" w:name="_Toc202900775"/>
       <w:r>
         <w:lastRenderedPageBreak/>
         <w:t>References</w:t>
       </w:r>
-      <w:bookmarkEnd w:id="27"/>
+      <w:bookmarkEnd w:id="34"/>
     </w:p>
     <w:p>
       <w:pPr>
@@ -5210,7 +6134,7 @@
       <w:r>
         <w:t xml:space="preserve">. Beautiful Soup. </w:t>
       </w:r>
-      <w:hyperlink r:id="rId17" w:history="1">
+      <w:hyperlink r:id="rId19" w:history="1">
         <w:r>
           <w:rPr>
             <w:rStyle w:val="Hyperlink"/>
@@ -5247,7 +6171,7 @@
       <w:r>
         <w:t xml:space="preserve"> AJNR, 34(6), 1111–1112. </w:t>
       </w:r>
-      <w:hyperlink r:id="rId18" w:history="1">
+      <w:hyperlink r:id="rId20" w:history="1">
         <w:r>
           <w:rPr>
             <w:rStyle w:val="Hyperlink"/>
@@ -5297,7 +6221,7 @@
       <w:r>
         <w:t xml:space="preserve">. OWASP. </w:t>
       </w:r>
-      <w:hyperlink r:id="rId19" w:history="1">
+      <w:hyperlink r:id="rId21" w:history="1">
         <w:r>
           <w:rPr>
             <w:rStyle w:val="Hyperlink"/>
@@ -5329,7 +6253,7 @@
       <w:r>
         <w:t xml:space="preserve">). Computer Misuse Act. The Code for Crown Prosecutors. </w:t>
       </w:r>
-      <w:hyperlink r:id="rId20" w:history="1">
+      <w:hyperlink r:id="rId22" w:history="1">
         <w:r>
           <w:rPr>
             <w:rStyle w:val="Hyperlink"/>
@@ -5361,7 +6285,7 @@
       <w:r>
         <w:t xml:space="preserve">, b). Fraud Act 2006. The Code for Crown Prosecutors. </w:t>
       </w:r>
-      <w:hyperlink r:id="rId21" w:history="1">
+      <w:hyperlink r:id="rId23" w:history="1">
         <w:r>
           <w:rPr>
             <w:rStyle w:val="Hyperlink"/>
@@ -5384,7 +6308,7 @@
       <w:r>
         <w:t xml:space="preserve">GDPR. (n.d.). What is GDPR, the EU’s new data protection law? GDPR. </w:t>
       </w:r>
-      <w:hyperlink r:id="rId22" w:history="1">
+      <w:hyperlink r:id="rId24" w:history="1">
         <w:r>
           <w:rPr>
             <w:rStyle w:val="Hyperlink"/>
@@ -5407,7 +6331,7 @@
       <w:r>
         <w:t xml:space="preserve">Creativyst Software. (n.d.). How To: The Comma Separated Value (CSV) File Format. Creativyst Software. </w:t>
       </w:r>
-      <w:hyperlink r:id="rId23" w:history="1">
+      <w:hyperlink r:id="rId25" w:history="1">
         <w:r>
           <w:rPr>
             <w:rStyle w:val="Hyperlink"/>
@@ -5430,7 +6354,7 @@
       <w:r>
         <w:t xml:space="preserve">GeeksForGeeks. (2025). Python Web Scraping Tutorial. GeeksForGeeks. </w:t>
       </w:r>
-      <w:hyperlink r:id="rId24" w:history="1">
+      <w:hyperlink r:id="rId26" w:history="1">
         <w:r>
           <w:rPr>
             <w:rStyle w:val="Hyperlink"/>
@@ -5453,7 +6377,7 @@
       <w:r>
         <w:t xml:space="preserve">Iwanna, B., Rizvi, S., Ahmed, S., Dengel, A., &amp; Uchida, S. Judging a Book By its Cover. Cornell University. </w:t>
       </w:r>
-      <w:hyperlink r:id="rId25" w:history="1">
+      <w:hyperlink r:id="rId27" w:history="1">
         <w:r>
           <w:rPr>
             <w:rStyle w:val="Hyperlink"/>
@@ -5482,7 +6406,7 @@
       <w:r>
         <w:t xml:space="preserve">). A descriptive study of assumptions in STRIDE security threat modelling. Software and Systems Modelling, 21(6), 2311-2328. </w:t>
       </w:r>
-      <w:hyperlink r:id="rId26" w:history="1">
+      <w:hyperlink r:id="rId28" w:history="1">
         <w:r>
           <w:rPr>
             <w:rStyle w:val="Hyperlink"/>
@@ -5505,7 +6429,7 @@
       <w:r>
         <w:t xml:space="preserve">Microsoft Learn. (2009). The STRIDE Threat Model. Microsoft Learn. </w:t>
       </w:r>
-      <w:hyperlink r:id="rId27" w:history="1">
+      <w:hyperlink r:id="rId29" w:history="1">
         <w:r>
           <w:rPr>
             <w:rStyle w:val="Hyperlink"/>
@@ -5528,7 +6452,7 @@
       <w:r>
         <w:t xml:space="preserve">Microsoft Support. (n.d.). Create or edit .csv files to import into Outlook. Microsoft Support. </w:t>
       </w:r>
-      <w:hyperlink r:id="rId28" w:history="1">
+      <w:hyperlink r:id="rId30" w:history="1">
         <w:r>
           <w:rPr>
             <w:rStyle w:val="Hyperlink"/>
@@ -5551,7 +6475,7 @@
       <w:r>
         <w:t xml:space="preserve">MySQL. (n.d.). 1.2.1 What is MySQL? MySQL Documentation. </w:t>
       </w:r>
-      <w:hyperlink r:id="rId29" w:history="1">
+      <w:hyperlink r:id="rId31" w:history="1">
         <w:r>
           <w:rPr>
             <w:rStyle w:val="Hyperlink"/>
@@ -5574,7 +6498,7 @@
       <w:r>
         <w:t xml:space="preserve">Pypi. (n.d. -a). requests 2.32.3. Pypi. </w:t>
       </w:r>
-      <w:hyperlink r:id="rId30" w:history="1">
+      <w:hyperlink r:id="rId32" w:history="1">
         <w:r>
           <w:rPr>
             <w:rStyle w:val="Hyperlink"/>
@@ -5600,7 +6524,7 @@
       <w:r>
         <w:t xml:space="preserve">soup4 4.13.4. Pypi. </w:t>
       </w:r>
-      <w:hyperlink r:id="rId31" w:history="1">
+      <w:hyperlink r:id="rId33" w:history="1">
         <w:r>
           <w:rPr>
             <w:rStyle w:val="Hyperlink"/>
@@ -5623,7 +6547,7 @@
       <w:r>
         <w:t xml:space="preserve">Pypi. (n.d. -c). selenium 4.33.0. Pypi. </w:t>
       </w:r>
-      <w:hyperlink r:id="rId32" w:history="1">
+      <w:hyperlink r:id="rId34" w:history="1">
         <w:r>
           <w:rPr>
             <w:rStyle w:val="Hyperlink"/>
@@ -5646,7 +6570,7 @@
       <w:r>
         <w:t xml:space="preserve">Pypi. (n.d. -d). schedule 1.2.2. Pypi. </w:t>
       </w:r>
-      <w:hyperlink r:id="rId33" w:history="1">
+      <w:hyperlink r:id="rId35" w:history="1">
         <w:r>
           <w:rPr>
             <w:rStyle w:val="Hyperlink"/>
@@ -5669,7 +6593,7 @@
       <w:r>
         <w:t xml:space="preserve">Python Documentation. (n.d.). csv – CSV File Reading and Writing. Python. </w:t>
       </w:r>
-      <w:hyperlink r:id="rId34" w:history="1">
+      <w:hyperlink r:id="rId36" w:history="1">
         <w:r>
           <w:rPr>
             <w:rStyle w:val="Hyperlink"/>
@@ -5700,7 +6624,7 @@
       <w:r>
         <w:t xml:space="preserve">-connector-python 9.3.0. Pypi. </w:t>
       </w:r>
-      <w:hyperlink r:id="rId35" w:history="1">
+      <w:hyperlink r:id="rId37" w:history="1">
         <w:r>
           <w:rPr>
             <w:rStyle w:val="Hyperlink"/>
@@ -5732,7 +6656,7 @@
       <w:r>
         <w:t xml:space="preserve"> Reports. 15, 100415. </w:t>
       </w:r>
-      <w:hyperlink r:id="rId36" w:history="1">
+      <w:hyperlink r:id="rId38" w:history="1">
         <w:r>
           <w:rPr>
             <w:rStyle w:val="Hyperlink"/>
@@ -5755,7 +6679,7 @@
       <w:r>
         <w:t xml:space="preserve">Samuli, K. (2022, January 19th). Pricing economics of video games: a panel data study on the effects of versioning on revenue. University of Oulu Repository. </w:t>
       </w:r>
-      <w:hyperlink r:id="rId37" w:history="1">
+      <w:hyperlink r:id="rId39" w:history="1">
         <w:r>
           <w:rPr>
             <w:rStyle w:val="Hyperlink"/>
@@ -5778,7 +6702,7 @@
       <w:r>
         <w:t xml:space="preserve">Selenium. (n.d.). Locating Elements. Selenium. </w:t>
       </w:r>
-      <w:hyperlink r:id="rId38" w:history="1">
+      <w:hyperlink r:id="rId40" w:history="1">
         <w:r>
           <w:rPr>
             <w:rStyle w:val="Hyperlink"/>
@@ -5830,7 +6754,7 @@
       <w:r>
         <w:t xml:space="preserve">Steam. (n.d.). Portal 2. Steam. </w:t>
       </w:r>
-      <w:hyperlink r:id="rId39" w:history="1">
+      <w:hyperlink r:id="rId41" w:history="1">
         <w:r>
           <w:rPr>
             <w:rStyle w:val="Hyperlink"/>
@@ -5861,7 +6785,7 @@
       <w:r>
         <w:t xml:space="preserve"> Steamworks Distribution Program). Steam. </w:t>
       </w:r>
-      <w:hyperlink r:id="rId40" w:history="1">
+      <w:hyperlink r:id="rId42" w:history="1">
         <w:r>
           <w:rPr>
             <w:rStyle w:val="Hyperlink"/>
@@ -5884,7 +6808,7 @@
       <w:r>
         <w:t xml:space="preserve">United Kingdom. (n.d.). Data protection (The UK’s data protection legislation). United Kingdom. </w:t>
       </w:r>
-      <w:hyperlink r:id="rId41" w:history="1">
+      <w:hyperlink r:id="rId43" w:history="1">
         <w:r>
           <w:rPr>
             <w:rStyle w:val="Hyperlink"/>
@@ -5913,7 +6837,7 @@
       <w:r>
         <w:t xml:space="preserve">). The UK Copyright Service. </w:t>
       </w:r>
-      <w:hyperlink r:id="rId42" w:history="1">
+      <w:hyperlink r:id="rId44" w:history="1">
         <w:r>
           <w:rPr>
             <w:rStyle w:val="Hyperlink"/>
@@ -5959,7 +6883,7 @@
       <w:r>
         <w:t xml:space="preserve">of Big Data. </w:t>
       </w:r>
-      <w:hyperlink r:id="rId43" w:history="1">
+      <w:hyperlink r:id="rId45" w:history="1">
         <w:r>
           <w:rPr>
             <w:rStyle w:val="Hyperlink"/>
@@ -5978,7 +6902,7 @@
       <w:r>
         <w:t xml:space="preserve">ALT: </w:t>
       </w:r>
-      <w:hyperlink r:id="rId44" w:history="1">
+      <w:hyperlink r:id="rId46" w:history="1">
         <w:r>
           <w:rPr>
             <w:rStyle w:val="Hyperlink"/>
@@ -8917,6 +9841,17 @@
       <w:szCs w:val="18"/>
     </w:rPr>
   </w:style>
+  <w:style w:type="paragraph" w:styleId="TableofFigures">
+    <w:name w:val="table of figures"/>
+    <w:basedOn w:val="Normal"/>
+    <w:next w:val="Normal"/>
+    <w:uiPriority w:val="99"/>
+    <w:unhideWhenUsed/>
+    <w:rsid w:val="00881C1D"/>
+    <w:pPr>
+      <w:spacing w:after="0"/>
+    </w:pPr>
+  </w:style>
 </w:styles>
 </file>
 

</xml_diff>